<commit_message>
Defence brief: verified answers to an external review
Adds the put hedge's Greeks (delta -0.17, why it is tail insurance sized
on notional, not a delta hedge), the momentum quintile spread (IS +5.4 pp,
OOS +2.0 pp, t 1.9), the un-annualised quarterly Sharpe (2.3) and
volatility drag, ACMESOLAR's low correlation, ERC vs 1/N, why stops are
not tightened before results, and what 'pre-registered' covers.

Co-Authored-By: Claude Opus 5.5 <noreply@anthropic.com>
Claude-Session: https://claude.ai/code/session_018SrKZ3YP1T4SHJR1stpujJ
</commit_message>
<xml_diff>
--- a/docs/Defence_Brief_Capex_Portfolio.docx
+++ b/docs/Defence_Brief_Capex_Portfolio.docx
@@ -3920,6 +3920,21 @@
     </w:p>
     <w:p>
       <w:pPr>
+        <w:spacing w:after="120" w:line="276"/>
+      </w:pPr>
+      <w:r>
+        <w:rPr>
+          <w:b/>
+          <w:bCs/>
+        </w:rPr>
+        <w:t xml:space="preserve">Quintile check (same panel, eligible stocks sorted into fifths each month by rs_126_skip21).</w:t>
+      </w:r>
+      <w:r>
+        <w:t xml:space="preserve"> Mean forward 3-month RS, bottom to top fifth: 2021-23 +6.1, +7.0, +10.3, +9.5, +11.5 pp (top minus bottom +5.4 pp, positive on 66% of dates); 2024-26 +0.8, +0.6, +1.3, −0.2, +2.8 pp (top minus bottom +2.0 pp, positive on 60%). Full sample +3.8 pp, t = 1.9 on 22 non-overlapping quarters. So the top fifth beats the bottom fifth in both periods, but the middle is not monotonic out of sample: the signal separates winners from losers at the extremes more than it ranks the middle.</w:t>
+      </w:r>
+    </w:p>
+    <w:p>
+      <w:pPr>
         <w:pStyle w:val="Heading2"/>
       </w:pPr>
       <w:r>
@@ -4004,7 +4019,7 @@
         <w:spacing w:after="120" w:line="276"/>
       </w:pPr>
       <w:r>
-        <w:t xml:space="preserve">All studies use the same design, fixed before results were seen: our universe, NSE prices adjusted for splits and bonuses, monthly rebalancing from 2021, the outcome = each stock's return minus the Nifty 500's over the next 63 sessions (3 months), and two periods (2021-23 in-sample, 2024-26 out-of-sample). A rule is adopted only if it beats the baseline in BOTH periods with a t-statistic of at least 2 on non-overlapping quarters.</w:t>
+        <w:t xml:space="preserve">All four studies use the same design, written into each script's docstring before its results were seen (this is what 'pre-registered' means here; the weekend rule changes in 4.3 were NOT backtested and are defended by their stated reasons instead): our universe, NSE prices adjusted for splits and bonuses, monthly rebalancing from 2021, the outcome = each stock's return minus the Nifty 500's over the next 63 sessions (3 months), and two periods (2021-23 in-sample, 2024-26 out-of-sample). A rule is adopted only if it beats the baseline in BOTH periods with a t-statistic of at least 2 on non-overlapping quarters.</w:t>
       </w:r>
     </w:p>
     <w:p>
@@ -21025,11 +21040,136 @@
           </w:p>
         </w:tc>
       </w:tr>
+      <w:tr>
+        <w:tc>
+          <w:tcPr>
+            <w:tcW w:type="dxa" w:w="2891"/>
+            <w:tcMar>
+              <w:top w:type="dxa" w:w="60"/>
+              <w:left w:type="dxa" w:w="90"/>
+              <w:bottom w:type="dxa" w:w="60"/>
+              <w:right w:type="dxa" w:w="90"/>
+            </w:tcMar>
+          </w:tcPr>
+          <w:p>
+            <w:pPr>
+              <w:spacing w:after="0"/>
+              <w:jc w:val="left"/>
+            </w:pPr>
+            <w:r>
+              <w:rPr>
+                <w:b w:val="false"/>
+                <w:bCs w:val="false"/>
+                <w:sz w:val="18"/>
+                <w:szCs w:val="18"/>
+              </w:rPr>
+              <w:t xml:space="preserve">Greeks today (Black-Scholes, implied vol 13.6%, 95 days, r 5.5%)</w:t>
+            </w:r>
+          </w:p>
+        </w:tc>
+        <w:tc>
+          <w:tcPr>
+            <w:tcW w:type="dxa" w:w="6747"/>
+            <w:tcMar>
+              <w:top w:type="dxa" w:w="60"/>
+              <w:left w:type="dxa" w:w="90"/>
+              <w:bottom w:type="dxa" w:w="60"/>
+              <w:right w:type="dxa" w:w="90"/>
+            </w:tcMar>
+          </w:tcPr>
+          <w:p>
+            <w:pPr>
+              <w:spacing w:after="0"/>
+              <w:jc w:val="left"/>
+            </w:pPr>
+            <w:r>
+              <w:rPr>
+                <w:b w:val="false"/>
+                <w:bCs w:val="false"/>
+                <w:sz w:val="18"/>
+                <w:szCs w:val="18"/>
+              </w:rPr>
+              <w:t xml:space="preserve">Delta −0.17 per put; position delta ≈ −₹20 L of Nifty against ~₹108 L of Nifty-equivalent stock exposure (₹97 L × h* 1.12), i.e. ~18% hedged for a small move. Theta ≈ −₹780 a day; vega ≈ ₹15,000 per volatility point.</w:t>
+            </w:r>
+          </w:p>
+        </w:tc>
+      </w:tr>
+      <w:tr>
+        <w:tc>
+          <w:tcPr>
+            <w:tcW w:type="dxa" w:w="2891"/>
+            <w:shd w:fill="F2F2F2" w:color="auto" w:val="clear"/>
+            <w:tcMar>
+              <w:top w:type="dxa" w:w="60"/>
+              <w:left w:type="dxa" w:w="90"/>
+              <w:bottom w:type="dxa" w:w="60"/>
+              <w:right w:type="dxa" w:w="90"/>
+            </w:tcMar>
+          </w:tcPr>
+          <w:p>
+            <w:pPr>
+              <w:spacing w:after="0"/>
+              <w:jc w:val="left"/>
+            </w:pPr>
+            <w:r>
+              <w:rPr>
+                <w:b w:val="false"/>
+                <w:bCs w:val="false"/>
+                <w:sz w:val="18"/>
+                <w:szCs w:val="18"/>
+              </w:rPr>
+              <w:t xml:space="preserve">Delta as the market falls</w:t>
+            </w:r>
+          </w:p>
+        </w:tc>
+        <w:tc>
+          <w:tcPr>
+            <w:tcW w:type="dxa" w:w="6747"/>
+            <w:shd w:fill="F2F2F2" w:color="auto" w:val="clear"/>
+            <w:tcMar>
+              <w:top w:type="dxa" w:w="60"/>
+              <w:left w:type="dxa" w:w="90"/>
+              <w:bottom w:type="dxa" w:w="60"/>
+              <w:right w:type="dxa" w:w="90"/>
+            </w:tcMar>
+          </w:tcPr>
+          <w:p>
+            <w:pPr>
+              <w:spacing w:after="0"/>
+              <w:jc w:val="left"/>
+            </w:pPr>
+            <w:r>
+              <w:rPr>
+                <w:b w:val="false"/>
+                <w:bCs w:val="false"/>
+                <w:sz w:val="18"/>
+                <w:szCs w:val="18"/>
+              </w:rPr>
+              <w:t xml:space="preserve">Nifty −5%: delta −0.41; −10%: −0.71; −15%: −0.92. The hedge thickens exactly when it is needed (long gamma).</w:t>
+            </w:r>
+          </w:p>
+        </w:tc>
+      </w:tr>
     </w:tbl>
     <w:p>
       <w:pPr>
         <w:spacing w:after="120"/>
       </w:pPr>
+    </w:p>
+    <w:p>
+      <w:pPr>
+        <w:spacing w:after="120" w:line="276"/>
+      </w:pPr>
+      <w:r>
+        <w:rPr>
+          <w:b/>
+          <w:bCs/>
+        </w:rPr>
+        <w:t xml:space="preserve">What the hedge is and is not.</w:t>
+      </w:r>
+      <w:r>
+        <w:t xml:space="preserve"> The lots are sized on NOTIONAL × downside beta, so that at expiry a crash is covered one-for-one below the strike (output/hedge_scenarios.csv: Nifty −25% → portfolio ≈ −6% hedged vs −29% unhedged). It is deliberately NOT a delta hedge: a delta-neutral hedge would need ~43 lots today, cost ~₹4.1 L (over 5x the premium) and give away the upside we are paid to earn. For small dips (Nifty −2 to −5%) we are mostly unhedged by design; the first ~5% is our deductible.</w:t>
+      </w:r>
     </w:p>
     <w:p>
       <w:pPr>
@@ -21353,7 +21493,7 @@
                 <w:sz w:val="18"/>
                 <w:szCs w:val="18"/>
               </w:rPr>
-              <w:t xml:space="preserve">Survivorship bias in backtests</w:t>
+              <w:t xml:space="preserve">The put hedge is small for small moves (delta −0.17)</w:t>
             </w:r>
           </w:p>
         </w:tc>
@@ -21380,7 +21520,7 @@
                 <w:sz w:val="18"/>
                 <w:szCs w:val="18"/>
               </w:rPr>
-              <w:t xml:space="preserve">Acknowledged; it inflates absolute returns but affects the comparison between rules much less.</w:t>
+              <w:t xml:space="preserve">By design: it is tail insurance sized on notional, not a delta hedge. It covers a crash below 22,000 one-for-one at expiry and its delta rises to −0.7 after a 10% fall. A delta-neutral hedge would need ~43 lots (~₹4.1 L), more than the whole hedge budget.</w:t>
             </w:r>
           </w:p>
         </w:tc>
@@ -21408,7 +21548,7 @@
                 <w:sz w:val="18"/>
                 <w:szCs w:val="18"/>
               </w:rPr>
-              <w:t xml:space="preserve">Concentrated in Capital Goods; no cement</w:t>
+              <w:t xml:space="preserve">Survivorship bias in backtests</w:t>
             </w:r>
           </w:p>
         </w:tc>
@@ -21434,7 +21574,7 @@
                 <w:sz w:val="18"/>
                 <w:szCs w:val="18"/>
               </w:rPr>
-              <w:t xml:space="preserve">The rule is sector-neutral; forcing balance means buying weaker stocks. Cement leg available if required (NUVOCO).</w:t>
+              <w:t xml:space="preserve">Acknowledged; it inflates absolute returns but affects the comparison between rules much less.</w:t>
             </w:r>
           </w:p>
         </w:tc>
@@ -21463,7 +21603,7 @@
                 <w:sz w:val="18"/>
                 <w:szCs w:val="18"/>
               </w:rPr>
-              <w:t xml:space="preserve">High valuations (RPEL 124, AEROFLEX 104, TDPOWERSYS 86)</w:t>
+              <w:t xml:space="preserve">Concentrated in Capital Goods; no cement</w:t>
             </w:r>
           </w:p>
         </w:tc>
@@ -21490,7 +21630,7 @@
                 <w:sz w:val="18"/>
                 <w:szCs w:val="18"/>
               </w:rPr>
-              <w:t xml:space="preserve">Momentum stocks are rarely cheap; the risk is results-day gaps, handled by stops, equal-risk sizing and the reserve.</w:t>
+              <w:t xml:space="preserve">The rule is sector-neutral; forcing balance means buying weaker stocks. Cement leg available if required (NUVOCO).</w:t>
             </w:r>
           </w:p>
         </w:tc>
@@ -21518,7 +21658,7 @@
                 <w:sz w:val="18"/>
                 <w:szCs w:val="18"/>
               </w:rPr>
-              <w:t xml:space="preserve">Four invested stocks are 'Low conviction' on the RRG</w:t>
+              <w:t xml:space="preserve">High valuations (RPEL 124, AEROFLEX 104, TDPOWERSYS 86)</w:t>
             </w:r>
           </w:p>
         </w:tc>
@@ -21544,7 +21684,7 @@
                 <w:sz w:val="18"/>
                 <w:szCs w:val="18"/>
               </w:rPr>
-              <w:t xml:space="preserve">Our backtest showed excluding such names lowered returns; the RRG is context, not a rule.</w:t>
+              <w:t xml:space="preserve">Momentum stocks are rarely cheap; the risk is results-day gaps, handled by stops, equal-risk sizing and the reserve.</w:t>
             </w:r>
           </w:p>
         </w:tc>
@@ -21573,7 +21713,7 @@
                 <w:sz w:val="18"/>
                 <w:szCs w:val="18"/>
               </w:rPr>
-              <w:t xml:space="preserve">Portfolio beta 1.27: it will fall more than the market</w:t>
+              <w:t xml:space="preserve">Four invested stocks are 'Low conviction' on the RRG</w:t>
             </w:r>
           </w:p>
         </w:tc>
@@ -21600,7 +21740,7 @@
                 <w:sz w:val="18"/>
                 <w:szCs w:val="18"/>
               </w:rPr>
-              <w:t xml:space="preserve">Yes; that is why the Nifty puts are sized by downside beta (1.21), not 1.</w:t>
+              <w:t xml:space="preserve">Our backtest showed excluding such names lowered returns; the RRG is context, not a rule.</w:t>
             </w:r>
           </w:p>
         </w:tc>
@@ -21628,7 +21768,7 @@
                 <w:sz w:val="18"/>
                 <w:szCs w:val="18"/>
               </w:rPr>
-              <w:t xml:space="preserve">Hedge effectiveness only 31%</w:t>
+              <w:t xml:space="preserve">Portfolio beta 1.27: it will fall more than the market</w:t>
             </w:r>
           </w:p>
         </w:tc>
@@ -21654,7 +21794,7 @@
                 <w:sz w:val="18"/>
                 <w:szCs w:val="18"/>
               </w:rPr>
-              <w:t xml:space="preserve">Index puts hedge market risk; stock-specific risk is diversified and stop-lossed.</w:t>
+              <w:t xml:space="preserve">Yes; that is why the Nifty puts are sized by downside beta (1.21), not 1.</w:t>
             </w:r>
           </w:p>
         </w:tc>
@@ -21683,6 +21823,61 @@
                 <w:sz w:val="18"/>
                 <w:szCs w:val="18"/>
               </w:rPr>
+              <w:t xml:space="preserve">Hedge effectiveness only 31%</w:t>
+            </w:r>
+          </w:p>
+        </w:tc>
+        <w:tc>
+          <w:tcPr>
+            <w:tcW w:type="dxa" w:w="5783"/>
+            <w:shd w:fill="F2F2F2" w:color="auto" w:val="clear"/>
+            <w:tcMar>
+              <w:top w:type="dxa" w:w="60"/>
+              <w:left w:type="dxa" w:w="90"/>
+              <w:bottom w:type="dxa" w:w="60"/>
+              <w:right w:type="dxa" w:w="90"/>
+            </w:tcMar>
+          </w:tcPr>
+          <w:p>
+            <w:pPr>
+              <w:spacing w:after="0"/>
+              <w:jc w:val="left"/>
+            </w:pPr>
+            <w:r>
+              <w:rPr>
+                <w:b w:val="false"/>
+                <w:bCs w:val="false"/>
+                <w:sz w:val="18"/>
+                <w:szCs w:val="18"/>
+              </w:rPr>
+              <w:t xml:space="preserve">Index puts hedge market risk; stock-specific risk is diversified and stop-lossed.</w:t>
+            </w:r>
+          </w:p>
+        </w:tc>
+      </w:tr>
+      <w:tr>
+        <w:tc>
+          <w:tcPr>
+            <w:tcW w:type="dxa" w:w="3855"/>
+            <w:tcMar>
+              <w:top w:type="dxa" w:w="60"/>
+              <w:left w:type="dxa" w:w="90"/>
+              <w:bottom w:type="dxa" w:w="60"/>
+              <w:right w:type="dxa" w:w="90"/>
+            </w:tcMar>
+          </w:tcPr>
+          <w:p>
+            <w:pPr>
+              <w:spacing w:after="0"/>
+              <w:jc w:val="left"/>
+            </w:pPr>
+            <w:r>
+              <w:rPr>
+                <w:b w:val="false"/>
+                <w:bCs w:val="false"/>
+                <w:sz w:val="18"/>
+                <w:szCs w:val="18"/>
+              </w:rPr>
               <w:t xml:space="preserve">Borderline theme fits (RPEL invested; GOODLUCK in reserve)</w:t>
             </w:r>
           </w:p>
@@ -21690,7 +21885,6 @@
         <w:tc>
           <w:tcPr>
             <w:tcW w:type="dxa" w:w="5783"/>
-            <w:shd w:fill="F2F2F2" w:color="auto" w:val="clear"/>
             <w:tcMar>
               <w:top w:type="dxa" w:w="60"/>
               <w:left w:type="dxa" w:w="90"/>
@@ -22511,7 +22705,7 @@
         <w:t xml:space="preserve">A. </w:t>
       </w:r>
       <w:r>
-        <w:t xml:space="preserve">It is the least volatile (beta 0.40), so equal-risk weighting wants to give it more than 15%; the cap binds. It is our diversifier.</w:t>
+        <w:t xml:space="preserve">It is the least volatile (beta 0.40) and the least correlated with the rest (average correlation 0.11 with the other seven vs 0.25 among them), so equal-risk weighting wants to give it more than 15%; the cap binds. It is our diversifier. Its low CAPM figure (7.8%) is a low REQUIRED return for low market risk, not a low forecast.</w:t>
       </w:r>
     </w:p>
     <w:p>
@@ -22532,7 +22726,7 @@
           <w:b/>
           <w:bCs/>
         </w:rPr>
-        <w:t xml:space="preserve">Why no Tata Power / L&amp;T?</w:t>
+        <w:t xml:space="preserve">How different is ERC from 1/N here?</w:t>
       </w:r>
     </w:p>
     <w:p>
@@ -22549,15 +22743,7 @@
         <w:t xml:space="preserve">A. </w:t>
       </w:r>
       <w:r>
-        <w:t xml:space="preserve">Tata Power: 6-month RS −20%, last of 32. L&amp;T: not in the capital goods universe (Construction), and its trend is bearish anyway.</w:t>
-      </w:r>
-    </w:p>
-    <w:p>
-      <w:pPr>
-        <w:pStyle w:val="Heading2"/>
-      </w:pPr>
-      <w:r>
-        <w:t xml:space="preserve">Weights and construction</w:t>
+        <w:t xml:space="preserve">Weights differ from 12.5% by at most 3.3 pp, and ERC's volatility is 27.0% vs 28.0% for equal weight: a modest, free gain, because the eight stocks' volatilities are similar. The method matters more when a stock is much riskier than the rest.</w:t>
       </w:r>
     </w:p>
     <w:p>
@@ -22578,7 +22764,7 @@
           <w:b/>
           <w:bCs/>
         </w:rPr>
-        <w:t xml:space="preserve">Why equal risk contribution and not equal weight or Markowitz?</w:t>
+        <w:t xml:space="preserve">Why no Tata Power / L&amp;T?</w:t>
       </w:r>
     </w:p>
     <w:p>
@@ -22595,7 +22781,15 @@
         <w:t xml:space="preserve">A. </w:t>
       </w:r>
       <w:r>
-        <w:t xml:space="preserve">Equal weight gives volatile stocks more risk; Markowitz needs return forecasts, which are unreliable (and put 37% in one stock here). ERC needs only the covariance and keeps every stock's risk share equal.</w:t>
+        <w:t xml:space="preserve">Tata Power: 6-month RS −20%, last of 32. L&amp;T: not in the capital goods universe (Construction), and its trend is bearish anyway.</w:t>
+      </w:r>
+    </w:p>
+    <w:p>
+      <w:pPr>
+        <w:pStyle w:val="Heading2"/>
+      </w:pPr>
+      <w:r>
+        <w:t xml:space="preserve">Weights and construction</w:t>
       </w:r>
     </w:p>
     <w:p>
@@ -22616,7 +22810,7 @@
           <w:b/>
           <w:bCs/>
         </w:rPr>
-        <w:t xml:space="preserve">Is 5% minimum met?</w:t>
+        <w:t xml:space="preserve">Why equal risk contribution and not equal weight or Markowitz?</w:t>
       </w:r>
     </w:p>
     <w:p>
@@ -22633,7 +22827,7 @@
         <w:t xml:space="preserve">A. </w:t>
       </w:r>
       <w:r>
-        <w:t xml:space="preserve">Yes: the smallest weight is AEROFLEX at 9.2%; the largest is ACMESOLAR at the 15% cap.</w:t>
+        <w:t xml:space="preserve">Equal weight gives volatile stocks more risk; Markowitz needs return forecasts, which are unreliable (and put 37% in one stock here). ERC needs only the covariance and keeps every stock's risk share equal.</w:t>
       </w:r>
     </w:p>
     <w:p>
@@ -22654,7 +22848,7 @@
           <w:b/>
           <w:bCs/>
         </w:rPr>
-        <w:t xml:space="preserve">What is the 'weighted variance' the brief mentions?</w:t>
+        <w:t xml:space="preserve">Is 5% minimum met?</w:t>
       </w:r>
     </w:p>
     <w:p>
@@ -22671,7 +22865,7 @@
         <w:t xml:space="preserve">A. </w:t>
       </w:r>
       <w:r>
-        <w:t xml:space="preserve">Portfolio variance w'Σw; each stock's contribution is w_i(Σw)_i. ERC sets these contributions equal.</w:t>
+        <w:t xml:space="preserve">Yes: the smallest weight is AEROFLEX at 9.2%; the largest is ACMESOLAR at the 15% cap.</w:t>
       </w:r>
     </w:p>
     <w:p>
@@ -22692,7 +22886,7 @@
           <w:b/>
           <w:bCs/>
         </w:rPr>
-        <w:t xml:space="preserve">Where is the global minimum variance portfolio?</w:t>
+        <w:t xml:space="preserve">What is the 'weighted variance' the brief mentions?</w:t>
       </w:r>
     </w:p>
     <w:p>
@@ -22709,7 +22903,7 @@
         <w:t xml:space="preserve">A. </w:t>
       </w:r>
       <w:r>
-        <w:t xml:space="preserve">Computed from the same 8 stocks: long-only it is 24.7% volatility with 35% in one stock; within 5-15% it is almost identical to ours (26.6% vs 27.0%, Sharpe 3.43 vs 3.44).</w:t>
+        <w:t xml:space="preserve">Portfolio variance w'Σw; each stock's contribution is w_i(Σw)_i. ERC sets these contributions equal.</w:t>
       </w:r>
     </w:p>
     <w:p>
@@ -22730,7 +22924,7 @@
           <w:b/>
           <w:bCs/>
         </w:rPr>
-        <w:t xml:space="preserve">Why not invest in all 15?</w:t>
+        <w:t xml:space="preserve">Where is the global minimum variance portfolio?</w:t>
       </w:r>
     </w:p>
     <w:p>
@@ -22747,15 +22941,7 @@
         <w:t xml:space="preserve">A. </w:t>
       </w:r>
       <w:r>
-        <w:t xml:space="preserve">The brief asks for 7-10 invested. Spreading over 15 barely lowered volatility (23.6% → 22.3%) and halved the weight of the strongest names.</w:t>
-      </w:r>
-    </w:p>
-    <w:p>
-      <w:pPr>
-        <w:pStyle w:val="Heading2"/>
-      </w:pPr>
-      <w:r>
-        <w:t xml:space="preserve">Risk and hedging</w:t>
+        <w:t xml:space="preserve">Computed from the same 8 stocks: long-only it is 24.7% volatility with 35% in one stock; within 5-15% it is almost identical to ours (26.6% vs 27.0%, Sharpe 3.43 vs 3.44).</w:t>
       </w:r>
     </w:p>
     <w:p>
@@ -22776,7 +22962,7 @@
           <w:b/>
           <w:bCs/>
         </w:rPr>
-        <w:t xml:space="preserve">How did you set the stop-losses?</w:t>
+        <w:t xml:space="preserve">Why not invest in all 15?</w:t>
       </w:r>
     </w:p>
     <w:p>
@@ -22793,7 +22979,15 @@
         <w:t xml:space="preserve">A. </w:t>
       </w:r>
       <w:r>
-        <w:t xml:space="preserve">3 × ATR(14) below the price, moved just under a nearby support; trailed upward only. Currently 13.4-17.2% below price.</w:t>
+        <w:t xml:space="preserve">The brief asks for 7-10 invested. Spreading over 15 barely lowered volatility (23.6% → 22.3%) and halved the weight of the strongest names.</w:t>
+      </w:r>
+    </w:p>
+    <w:p>
+      <w:pPr>
+        <w:pStyle w:val="Heading2"/>
+      </w:pPr>
+      <w:r>
+        <w:t xml:space="preserve">Risk and hedging</w:t>
       </w:r>
     </w:p>
     <w:p>
@@ -22814,7 +23008,7 @@
           <w:b/>
           <w:bCs/>
         </w:rPr>
-        <w:t xml:space="preserve">What happens when a stop is hit?</w:t>
+        <w:t xml:space="preserve">How did you set the stop-losses?</w:t>
       </w:r>
     </w:p>
     <w:p>
@@ -22831,7 +23025,7 @@
         <w:t xml:space="preserve">A. </w:t>
       </w:r>
       <w:r>
-        <w:t xml:space="preserve">Sell; the proceeds buy the next reserve stock that still passes every rule that day; if none does, they top up the other holdings. Cash never sits idle.</w:t>
+        <w:t xml:space="preserve">3 × ATR(14) below the price, moved just under a nearby support; trailed upward only. Currently 13.4-17.2% below price.</w:t>
       </w:r>
     </w:p>
     <w:p>
@@ -22852,7 +23046,7 @@
           <w:b/>
           <w:bCs/>
         </w:rPr>
-        <w:t xml:space="preserve">What is your portfolio beta and what does it mean?</w:t>
+        <w:t xml:space="preserve">What happens when a stop is hit?</w:t>
       </w:r>
     </w:p>
     <w:p>
@@ -22869,7 +23063,7 @@
         <w:t xml:space="preserve">A. </w:t>
       </w:r>
       <w:r>
-        <w:t xml:space="preserve">1.27 against the Nifty 500: a 1% market move tends to move us ~1.27%. 44.5% of our variance is market risk, 55.5% stock-specific.</w:t>
+        <w:t xml:space="preserve">Sell; the proceeds buy the next reserve stock that still passes every rule that day; if none does, they top up the other holdings. Cash never sits idle.</w:t>
       </w:r>
     </w:p>
     <w:p>
@@ -22890,7 +23084,7 @@
           <w:b/>
           <w:bCs/>
         </w:rPr>
-        <w:t xml:space="preserve">How much of the risk does the hedge remove?</w:t>
+        <w:t xml:space="preserve">What is your portfolio beta and what does it mean?</w:t>
       </w:r>
     </w:p>
     <w:p>
@@ -22907,7 +23101,7 @@
         <w:t xml:space="preserve">A. </w:t>
       </w:r>
       <w:r>
-        <w:t xml:space="preserve">The index hedge addresses market risk only (hedge effectiveness R² ≈ 0.31 vs Nifty 50); stock-specific risk is diversified across 8 names and capped by stops.</w:t>
+        <w:t xml:space="preserve">1.27 against the Nifty 500: a 1% market move tends to move us ~1.27%. 44.5% of our variance is market risk, 55.5% stock-specific.</w:t>
       </w:r>
     </w:p>
     <w:p>
@@ -22928,7 +23122,7 @@
           <w:b/>
           <w:bCs/>
         </w:rPr>
-        <w:t xml:space="preserve">Why puts and not futures?</w:t>
+        <w:t xml:space="preserve">How much of the risk does the hedge remove?</w:t>
       </w:r>
     </w:p>
     <w:p>
@@ -22945,7 +23139,7 @@
         <w:t xml:space="preserve">A. </w:t>
       </w:r>
       <w:r>
-        <w:t xml:space="preserve">Futures would cancel our upside and need ~₹12.8 L margin. Puts ~5% out of the money insure a crash for ~0.8% of the portfolio and keep the upside.</w:t>
+        <w:t xml:space="preserve">The index hedge addresses market risk only (hedge effectiveness R² ≈ 0.31 vs Nifty 50); stock-specific risk is diversified across 8 names and capped by stops.</w:t>
       </w:r>
     </w:p>
     <w:p>
@@ -22966,7 +23160,7 @@
           <w:b/>
           <w:bCs/>
         </w:rPr>
-        <w:t xml:space="preserve">How many lots and why?</w:t>
+        <w:t xml:space="preserve">Why puts and not futures?</w:t>
       </w:r>
     </w:p>
     <w:p>
@@ -22983,7 +23177,7 @@
         <w:t xml:space="preserve">A. </w:t>
       </w:r>
       <w:r>
-        <w:t xml:space="preserve">8 lots of the 22,000 Dec put: ₹97 L of stocks × downside beta 1.21 ÷ (spot × lot size 65), rounded.</w:t>
+        <w:t xml:space="preserve">Futures would cancel our upside and need ~₹12.8 L margin. Puts ~5% out of the money insure a crash for ~0.8% of the portfolio and keep the upside.</w:t>
       </w:r>
     </w:p>
     <w:p>
@@ -23004,7 +23198,7 @@
           <w:b/>
           <w:bCs/>
         </w:rPr>
-        <w:t xml:space="preserve">When do you change the hedge?</w:t>
+        <w:t xml:space="preserve">How many lots and why?</w:t>
       </w:r>
     </w:p>
     <w:p>
@@ -23021,7 +23215,7 @@
         <w:t xml:space="preserve">A. </w:t>
       </w:r>
       <w:r>
-        <w:t xml:space="preserve">Once, at +10% P&amp;L: roll the puts up to ~5% below the then-current Nifty so a crash cannot take the gain back.</w:t>
+        <w:t xml:space="preserve">8 lots of the 22,000 Dec put: ₹97 L of stocks × downside beta 1.21 ÷ (spot × lot size 65), rounded.</w:t>
       </w:r>
     </w:p>
     <w:p>
@@ -23042,7 +23236,7 @@
           <w:b/>
           <w:bCs/>
         </w:rPr>
-        <w:t xml:space="preserve">Did you test for autocorrelation / predictability?</w:t>
+        <w:t xml:space="preserve">When do you change the hedge?</w:t>
       </w:r>
     </w:p>
     <w:p>
@@ -23059,15 +23253,7 @@
         <w:t xml:space="preserve">A. </w:t>
       </w:r>
       <w:r>
-        <w:t xml:space="preserve">Yes: AR(1) and Ljung-Box on each stock's daily returns; no stock is predictable at 5%, consistent with a random walk day to day, which is why we do not trade daily.</w:t>
-      </w:r>
-    </w:p>
-    <w:p>
-      <w:pPr>
-        <w:pStyle w:val="Heading2"/>
-      </w:pPr>
-      <w:r>
-        <w:t xml:space="preserve">Performance and theory</w:t>
+        <w:t xml:space="preserve">Once, at +10% P&amp;L: roll the puts up to ~5% below the then-current Nifty so a crash cannot take the gain back.</w:t>
       </w:r>
     </w:p>
     <w:p>
@@ -23088,7 +23274,7 @@
           <w:b/>
           <w:bCs/>
         </w:rPr>
-        <w:t xml:space="preserve">What are your Sharpe and Treynor?</w:t>
+        <w:t xml:space="preserve">Did you test for autocorrelation / predictability?</w:t>
       </w:r>
     </w:p>
     <w:p>
@@ -23105,7 +23291,15 @@
         <w:t xml:space="preserve">A. </w:t>
       </w:r>
       <w:r>
-        <w:t xml:space="preserve">Past year (ex-post, hindsight): Sharpe 5.6, Treynor 119%. Last quarter: Sharpe 9.6. We report them as the brief asks but stress they measure how the stocks were picked, not what to expect. The live measures start from the 28-Sep snapshot.</w:t>
+        <w:t xml:space="preserve">Yes: AR(1) and Ljung-Box on each stock's daily returns; no stock is predictable at 5%, consistent with a random walk day to day, which is why we do not trade daily.</w:t>
+      </w:r>
+    </w:p>
+    <w:p>
+      <w:pPr>
+        <w:pStyle w:val="Heading2"/>
+      </w:pPr>
+      <w:r>
+        <w:t xml:space="preserve">Performance and theory</w:t>
       </w:r>
     </w:p>
     <w:p>
@@ -23126,7 +23320,7 @@
           <w:b/>
           <w:bCs/>
         </w:rPr>
-        <w:t xml:space="preserve">What is the compounding effect?</w:t>
+        <w:t xml:space="preserve">What are your Sharpe and Treynor?</w:t>
       </w:r>
     </w:p>
     <w:p>
@@ -23143,7 +23337,121 @@
         <w:t xml:space="preserve">A. </w:t>
       </w:r>
       <w:r>
-        <w:t xml:space="preserve">Annualised compound return minus annualised simple return: large over a strong quarter (≈119 pp) and small over a year (≈2 pp).</w:t>
+        <w:t xml:space="preserve">Past year (ex-post, hindsight): Sharpe 5.6, Treynor 119%. Last quarter annualised: Sharpe 9.6, but that is inflated by annualising a 39% quarter; un-annualised (quarter excess return ÷ quarter volatility) it is 2.3. We report them as the brief asks but stress they measure how the stocks were picked, not what to expect. The live measures start from the 28-Sep snapshot.</w:t>
+      </w:r>
+    </w:p>
+    <w:p>
+      <w:pPr>
+        <w:keepNext/>
+        <w:spacing w:after="60" w:before="120"/>
+      </w:pPr>
+      <w:r>
+        <w:rPr>
+          <w:b/>
+          <w:bCs/>
+          <w:color w:val="1F3864"/>
+        </w:rPr>
+        <w:t xml:space="preserve">Q. </w:t>
+      </w:r>
+      <w:r>
+        <w:rPr>
+          <w:b/>
+          <w:bCs/>
+        </w:rPr>
+        <w:t xml:space="preserve">What is the compounding effect?</w:t>
+      </w:r>
+    </w:p>
+    <w:p>
+      <w:pPr>
+        <w:spacing w:after="60" w:line="264"/>
+        <w:ind w:left="360"/>
+      </w:pPr>
+      <w:r>
+        <w:rPr>
+          <w:b/>
+          <w:bCs/>
+          <w:color w:val="2E7D32"/>
+        </w:rPr>
+        <w:t xml:space="preserve">A. </w:t>
+      </w:r>
+      <w:r>
+        <w:t xml:space="preserve">As the dashboard defines it, annualised compound return minus annualised simple return: ≈2 pp over the year; the ≈119 pp over the last quarter is an artefact of annualising a 39% quarter, so we do not lean on it. The related 'volatility drag' (arithmetic minus geometric mean ≈ σ²/2) is ≈3.7 pp a year at our 27% volatility.</w:t>
+      </w:r>
+    </w:p>
+    <w:p>
+      <w:pPr>
+        <w:keepNext/>
+        <w:spacing w:after="60" w:before="120"/>
+      </w:pPr>
+      <w:r>
+        <w:rPr>
+          <w:b/>
+          <w:bCs/>
+          <w:color w:val="1F3864"/>
+        </w:rPr>
+        <w:t xml:space="preserve">Q. </w:t>
+      </w:r>
+      <w:r>
+        <w:rPr>
+          <w:b/>
+          <w:bCs/>
+        </w:rPr>
+        <w:t xml:space="preserve">Why not tighten stops to 2 ATR before results?</w:t>
+      </w:r>
+    </w:p>
+    <w:p>
+      <w:pPr>
+        <w:spacing w:after="60" w:line="264"/>
+        <w:ind w:left="360"/>
+      </w:pPr>
+      <w:r>
+        <w:rPr>
+          <w:b/>
+          <w:bCs/>
+          <w:color w:val="2E7D32"/>
+        </w:rPr>
+        <w:t xml:space="preserve">A. </w:t>
+      </w:r>
+      <w:r>
+        <w:t xml:space="preserve">A stop is triggered on a close, so a results gap goes straight through a 2 ATR stop just as through a 3 ATR one; tightening only adds whipsaw exits in the days before results (and our momentum names run hot into results). Gap damage is capped by sizing instead: a 20% gap on the largest (15%) position costs 3% of the portfolio.</w:t>
+      </w:r>
+    </w:p>
+    <w:p>
+      <w:pPr>
+        <w:keepNext/>
+        <w:spacing w:after="60" w:before="120"/>
+      </w:pPr>
+      <w:r>
+        <w:rPr>
+          <w:b/>
+          <w:bCs/>
+          <w:color w:val="1F3864"/>
+        </w:rPr>
+        <w:t xml:space="preserve">Q. </w:t>
+      </w:r>
+      <w:r>
+        <w:rPr>
+          <w:b/>
+          <w:bCs/>
+        </w:rPr>
+        <w:t xml:space="preserve">Should replacements need RSI 40-65?</w:t>
+      </w:r>
+    </w:p>
+    <w:p>
+      <w:pPr>
+        <w:spacing w:after="60" w:line="264"/>
+        <w:ind w:left="360"/>
+      </w:pPr>
+      <w:r>
+        <w:rPr>
+          <w:b/>
+          <w:bCs/>
+          <w:color w:val="2E7D32"/>
+        </w:rPr>
+        <w:t xml:space="preserve">A. </w:t>
+      </w:r>
+      <w:r>
+        <w:t xml:space="preserve">No: the replacement must already pass every selection rule that day, including a bullish trend (+DI above −DI by 2). An RSI ceiling of 65 would shut out exactly the strong-momentum names the rule is built to buy.</w:t>
       </w:r>
     </w:p>
     <w:p>

</xml_diff>

<commit_message>
Defence brief: second review round
Clarifies that the t >= 2 bar applies to challengers of the baseline,
documents that the profit-lock roll never rebuys the same strike on
stock-specific gains, separates daily random-walk tests from multi-month
momentum, and answers the basis-risk question with our own numbers.

Co-Authored-By: Claude Opus 5.5 <noreply@anthropic.com>
Claude-Session: https://claude.ai/code/session_018SrKZ3YP1T4SHJR1stpujJ
</commit_message>
<xml_diff>
--- a/docs/Defence_Brief_Capex_Portfolio.docx
+++ b/docs/Defence_Brief_Capex_Portfolio.docx
@@ -4019,7 +4019,7 @@
         <w:spacing w:after="120" w:line="276"/>
       </w:pPr>
       <w:r>
-        <w:t xml:space="preserve">All four studies use the same design, written into each script's docstring before its results were seen (this is what 'pre-registered' means here; the weekend rule changes in 4.3 were NOT backtested and are defended by their stated reasons instead): our universe, NSE prices adjusted for splits and bonuses, monthly rebalancing from 2021, the outcome = each stock's return minus the Nifty 500's over the next 63 sessions (3 months), and two periods (2021-23 in-sample, 2024-26 out-of-sample). A rule is adopted only if it beats the baseline in BOTH periods with a t-statistic of at least 2 on non-overlapping quarters.</w:t>
+        <w:t xml:space="preserve">All four studies use the same design, written into each script's docstring before its results were seen (this is what 'pre-registered' means here; the weekend rule changes in 4.3 were NOT backtested and are defended by their stated reasons instead): our universe, NSE prices adjusted for splits and bonuses, monthly rebalancing from 2021, the outcome = each stock's return minus the Nifty 500's over the next 63 sessions (3 months), and two periods (2021-23 in-sample, 2024-26 out-of-sample). A rule is adopted only if it beats the baseline in BOTH periods with a t-statistic of at least 2 on non-overlapping quarters. This bar is for CHALLENGERS: a filter or signal must clear it to replace or modify the baseline. The baseline itself (6-month RS skipping a month) is the literature's standard (Jegadeesh &amp; Titman 1993), not something we had to discover; its own statistics here (t ≈ 1.9-2.0) are modest, and we say so. Nothing we tested beat it in both periods, so the simplest rule stays.</w:t>
       </w:r>
     </w:p>
     <w:p>
@@ -21035,7 +21035,7 @@
                 <w:sz w:val="18"/>
                 <w:szCs w:val="18"/>
               </w:rPr>
-              <w:t xml:space="preserve">At +10% P&amp;L, roll the puts up to ~5% below the then-current Nifty (once)</w:t>
+              <w:t xml:space="preserve">At +10% P&amp;L, roll the puts up to ~5% below the then-current Nifty (once). If the gain is stock-specific and the Nifty has not risen enough to lift the strike, the puts are NOT sold and rebought at the same strike: only lots are added if the larger portfolio needs them, and the roll stays available for later (tracker.plan_put_roll).</w:t>
             </w:r>
           </w:p>
         </w:tc>
@@ -23160,7 +23160,7 @@
           <w:b/>
           <w:bCs/>
         </w:rPr>
-        <w:t xml:space="preserve">Why puts and not futures?</w:t>
+        <w:t xml:space="preserve">Nifty 50 explains only 31% of your variance. Why not a midcap index?</w:t>
       </w:r>
     </w:p>
     <w:p>
@@ -23177,7 +23177,7 @@
         <w:t xml:space="preserve">A. </w:t>
       </w:r>
       <w:r>
-        <w:t xml:space="preserve">Futures would cancel our upside and need ~₹12.8 L margin. Puts ~5% out of the money insure a crash for ~0.8% of the portfolio and keep the upside.</w:t>
+        <w:t xml:space="preserve">No index can hedge the other ~55-70%: even the Nifty 500, which contains every one of our stocks, explains only 44.5% of our variance; the rest is stock-specific and is handled by 8-way diversification, the 15% cap and stops. For the market part we chose the contract that is deepest and runs past 28-Dec: our 22,000 Dec put alone has open interest of ~3.1 million units. We did not backtest a midcap-index hedge.</w:t>
       </w:r>
     </w:p>
     <w:p>
@@ -23198,7 +23198,7 @@
           <w:b/>
           <w:bCs/>
         </w:rPr>
-        <w:t xml:space="preserve">How many lots and why?</w:t>
+        <w:t xml:space="preserve">Why puts and not futures?</w:t>
       </w:r>
     </w:p>
     <w:p>
@@ -23215,7 +23215,7 @@
         <w:t xml:space="preserve">A. </w:t>
       </w:r>
       <w:r>
-        <w:t xml:space="preserve">8 lots of the 22,000 Dec put: ₹97 L of stocks × downside beta 1.21 ÷ (spot × lot size 65), rounded.</w:t>
+        <w:t xml:space="preserve">Futures would cancel our upside and need ~₹12.8 L margin. Puts ~5% out of the money insure a crash for ~0.8% of the portfolio and keep the upside.</w:t>
       </w:r>
     </w:p>
     <w:p>
@@ -23236,7 +23236,7 @@
           <w:b/>
           <w:bCs/>
         </w:rPr>
-        <w:t xml:space="preserve">When do you change the hedge?</w:t>
+        <w:t xml:space="preserve">How many lots and why?</w:t>
       </w:r>
     </w:p>
     <w:p>
@@ -23253,7 +23253,7 @@
         <w:t xml:space="preserve">A. </w:t>
       </w:r>
       <w:r>
-        <w:t xml:space="preserve">Once, at +10% P&amp;L: roll the puts up to ~5% below the then-current Nifty so a crash cannot take the gain back.</w:t>
+        <w:t xml:space="preserve">8 lots of the 22,000 Dec put: ₹97 L of stocks × downside beta 1.21 ÷ (spot × lot size 65), rounded.</w:t>
       </w:r>
     </w:p>
     <w:p>
@@ -23274,7 +23274,7 @@
           <w:b/>
           <w:bCs/>
         </w:rPr>
-        <w:t xml:space="preserve">Did you test for autocorrelation / predictability?</w:t>
+        <w:t xml:space="preserve">When do you change the hedge?</w:t>
       </w:r>
     </w:p>
     <w:p>
@@ -23291,7 +23291,45 @@
         <w:t xml:space="preserve">A. </w:t>
       </w:r>
       <w:r>
-        <w:t xml:space="preserve">Yes: AR(1) and Ljung-Box on each stock's daily returns; no stock is predictable at 5%, consistent with a random walk day to day, which is why we do not trade daily.</w:t>
+        <w:t xml:space="preserve">Once, at +10% P&amp;L: roll the puts up to ~5% below the then-current Nifty so a crash cannot take the gain back.</w:t>
+      </w:r>
+    </w:p>
+    <w:p>
+      <w:pPr>
+        <w:keepNext/>
+        <w:spacing w:after="60" w:before="120"/>
+      </w:pPr>
+      <w:r>
+        <w:rPr>
+          <w:b/>
+          <w:bCs/>
+          <w:color w:val="1F3864"/>
+        </w:rPr>
+        <w:t xml:space="preserve">Q. </w:t>
+      </w:r>
+      <w:r>
+        <w:rPr>
+          <w:b/>
+          <w:bCs/>
+        </w:rPr>
+        <w:t xml:space="preserve">Did you test for autocorrelation / predictability?</w:t>
+      </w:r>
+    </w:p>
+    <w:p>
+      <w:pPr>
+        <w:spacing w:after="60" w:line="264"/>
+        <w:ind w:left="360"/>
+      </w:pPr>
+      <w:r>
+        <w:rPr>
+          <w:b/>
+          <w:bCs/>
+          <w:color w:val="2E7D32"/>
+        </w:rPr>
+        <w:t xml:space="preserve">A. </w:t>
+      </w:r>
+      <w:r>
+        <w:t xml:space="preserve">Yes: AR(1) and Ljung-Box on each stock's DAILY returns; no stock is predictable at 5%, so there is nothing to exploit day to day, which is why we do not trade daily. That does not contradict momentum: momentum is persistence over 3-12 MONTHS (slow reaction to news and earnings), which a 1-day autocorrelation test cannot see and does not reject.</w:t>
       </w:r>
     </w:p>
     <w:p>

</xml_diff>

<commit_message>
Replacement rule: never add stop-loss money to falling stocks
When no reserve stock qualifies, the proceeds now top up only the holdings
still in an uptrend (DI gap >= 2). If none is, they wait in the liquid ETF
and are redeployed by the same steps on the first day a stock qualifies
(tracker.parked_proceeds). Dashboard alert, record form, WhatsApp alerts,
README, config notes and the defence brief follow the new rule.

Co-Authored-By: Claude Opus 5.5 <noreply@anthropic.com>
Claude-Session: https://claude.ai/code/session_018SrKZ3YP1T4SHJR1stpujJ
</commit_message>
<xml_diff>
--- a/docs/Defence_Brief_Capex_Portfolio.docx
+++ b/docs/Defence_Brief_Capex_Portfolio.docx
@@ -1703,7 +1703,7 @@
                 <w:sz w:val="18"/>
                 <w:szCs w:val="18"/>
               </w:rPr>
-              <w:t xml:space="preserve">Stop-out proceeds buy the next reserve stock; if none qualifies, they top up the holdings. Hedge budget in a liquid ETF.</w:t>
+              <w:t xml:space="preserve">Stop-out proceeds buy the next reserve stock; if none qualifies, they top up the holdings still in an uptrend, else wait in the liquid ETF until one qualifies. Hedge budget in a liquid ETF.</w:t>
             </w:r>
           </w:p>
         </w:tc>
@@ -20499,7 +20499,20 @@
         <w:spacing w:after="60" w:line="264"/>
       </w:pPr>
       <w:r>
-        <w:t xml:space="preserve">If none qualifies, the proceeds top up the remaining holdings in proportion to their weights (the brief: 'cash cannot sit idle').</w:t>
+        <w:t xml:space="preserve">If none qualifies, the proceeds top up the remaining holdings that are STILL IN AN UPTREND (DI gap ≥ 2), in proportion to their weights (the brief: 'cash cannot sit idle'). Holdings that are themselves falling get nothing.</w:t>
+      </w:r>
+    </w:p>
+    <w:p>
+      <w:pPr>
+        <w:pStyle w:val="ListParagraph"/>
+        <w:numPr>
+          <w:ilvl w:val="0"/>
+          <w:numId w:val="2"/>
+        </w:numPr>
+        <w:spacing w:after="60" w:line="264"/>
+      </w:pPr>
+      <w:r>
+        <w:t xml:space="preserve">If no holding is in an uptrend either (a theme-wide sell-off), the proceeds wait in the liquid ETF at the overnight rate and are redeployed by the same two steps on the first day a stock qualifies. This way stop-loss money is never averaged into falling stocks, and in normal markets it is never idle.</w:t>
       </w:r>
     </w:p>
     <w:p>
@@ -23063,7 +23076,7 @@
         <w:t xml:space="preserve">A. </w:t>
       </w:r>
       <w:r>
-        <w:t xml:space="preserve">Sell; the proceeds buy the next reserve stock that still passes every rule that day; if none does, they top up the other holdings. Cash never sits idle.</w:t>
+        <w:t xml:space="preserve">Sell; the proceeds buy the next reserve stock that still passes every rule that day; if none does, they top up the other holdings that are still in an uptrend; if none is, they wait in the liquid ETF until a stock qualifies. We never add stop-loss money to falling stocks.</w:t>
       </w:r>
     </w:p>
     <w:p>

</xml_diff>

<commit_message>
Top-ups never take a holding above the 15% cap
Stop-loss top-ups are water-filled: pro rata to the weights, no holding
above WEIGHT_MAX_PCT of the stocks' value, surplus to the other rising
holdings, and what none can take waits in the liquid ETF. The brief gains
answers on ATR vs fixed stops, ACMESOLAR's unbounded ERC weight (19.7%)
and metal-price pass-through.

Co-Authored-By: Claude Opus 5.5 <noreply@anthropic.com>
Claude-Session: https://claude.ai/code/session_018SrKZ3YP1T4SHJR1stpujJ
</commit_message>
<xml_diff>
--- a/docs/Defence_Brief_Capex_Portfolio.docx
+++ b/docs/Defence_Brief_Capex_Portfolio.docx
@@ -20499,7 +20499,7 @@
         <w:spacing w:after="60" w:line="264"/>
       </w:pPr>
       <w:r>
-        <w:t xml:space="preserve">If none qualifies, the proceeds top up the remaining holdings that are STILL IN AN UPTREND (DI gap ≥ 2), in proportion to their weights (the brief: 'cash cannot sit idle'). Holdings that are themselves falling get nothing.</w:t>
+        <w:t xml:space="preserve">If none qualifies, the proceeds top up the remaining holdings that are STILL IN AN UPTREND (DI gap ≥ 2), in proportion to their weights (the brief: 'cash cannot sit idle'). Holdings that are themselves falling get nothing, and no holding is taken above the 15% cap: its surplus goes to the other rising holdings, and whatever none can take waits in the liquid ETF.</w:t>
       </w:r>
     </w:p>
     <w:p>
@@ -22739,7 +22739,7 @@
           <w:b/>
           <w:bCs/>
         </w:rPr>
-        <w:t xml:space="preserve">How different is ERC from 1/N here?</w:t>
+        <w:t xml:space="preserve">If ACMESOLAR diversifies so well, why not 25-30% in it?</w:t>
       </w:r>
     </w:p>
     <w:p>
@@ -22756,7 +22756,7 @@
         <w:t xml:space="preserve">A. </w:t>
       </w:r>
       <w:r>
-        <w:t xml:space="preserve">Weights differ from 12.5% by at most 3.3 pp, and ERC's volatility is 27.0% vs 28.0% for equal weight: a modest, free gain, because the eight stocks' volatilities are similar. The method matters more when a stock is much riskier than the rest.</w:t>
+        <w:t xml:space="preserve">Without bounds, ERC would give it 19.7% (our run on the same covariance matrix), not 25-30%. We cap every stock at 15% so no single name, least of all a 0.40-beta power producer, dominates a momentum portfolio; the cap costs little because ERC and the bounded minimum-variance portfolio are almost identical (Sharpe 3.44 vs 3.43).</w:t>
       </w:r>
     </w:p>
     <w:p>
@@ -22777,7 +22777,7 @@
           <w:b/>
           <w:bCs/>
         </w:rPr>
-        <w:t xml:space="preserve">Why no Tata Power / L&amp;T?</w:t>
+        <w:t xml:space="preserve">How different is ERC from 1/N here?</w:t>
       </w:r>
     </w:p>
     <w:p>
@@ -22794,15 +22794,7 @@
         <w:t xml:space="preserve">A. </w:t>
       </w:r>
       <w:r>
-        <w:t xml:space="preserve">Tata Power: 6-month RS −20%, last of 32. L&amp;T: not in the capital goods universe (Construction), and its trend is bearish anyway.</w:t>
-      </w:r>
-    </w:p>
-    <w:p>
-      <w:pPr>
-        <w:pStyle w:val="Heading2"/>
-      </w:pPr>
-      <w:r>
-        <w:t xml:space="preserve">Weights and construction</w:t>
+        <w:t xml:space="preserve">Weights differ from 12.5% by at most 3.3 pp, and ERC's volatility is 27.0% vs 28.0% for equal weight: a modest, free gain, because the eight stocks' volatilities are similar. The method matters more when a stock is much riskier than the rest.</w:t>
       </w:r>
     </w:p>
     <w:p>
@@ -22823,7 +22815,7 @@
           <w:b/>
           <w:bCs/>
         </w:rPr>
-        <w:t xml:space="preserve">Why equal risk contribution and not equal weight or Markowitz?</w:t>
+        <w:t xml:space="preserve">Why no Tata Power / L&amp;T?</w:t>
       </w:r>
     </w:p>
     <w:p>
@@ -22840,7 +22832,15 @@
         <w:t xml:space="preserve">A. </w:t>
       </w:r>
       <w:r>
-        <w:t xml:space="preserve">Equal weight gives volatile stocks more risk; Markowitz needs return forecasts, which are unreliable (and put 37% in one stock here). ERC needs only the covariance and keeps every stock's risk share equal.</w:t>
+        <w:t xml:space="preserve">Tata Power: 6-month RS −20%, last of 32. L&amp;T: not in the capital goods universe (Construction), and its trend is bearish anyway.</w:t>
+      </w:r>
+    </w:p>
+    <w:p>
+      <w:pPr>
+        <w:pStyle w:val="Heading2"/>
+      </w:pPr>
+      <w:r>
+        <w:t xml:space="preserve">Weights and construction</w:t>
       </w:r>
     </w:p>
     <w:p>
@@ -22861,7 +22861,7 @@
           <w:b/>
           <w:bCs/>
         </w:rPr>
-        <w:t xml:space="preserve">Is 5% minimum met?</w:t>
+        <w:t xml:space="preserve">Why equal risk contribution and not equal weight or Markowitz?</w:t>
       </w:r>
     </w:p>
     <w:p>
@@ -22878,7 +22878,7 @@
         <w:t xml:space="preserve">A. </w:t>
       </w:r>
       <w:r>
-        <w:t xml:space="preserve">Yes: the smallest weight is AEROFLEX at 9.2%; the largest is ACMESOLAR at the 15% cap.</w:t>
+        <w:t xml:space="preserve">Equal weight gives volatile stocks more risk; Markowitz needs return forecasts, which are unreliable (and put 37% in one stock here). ERC needs only the covariance and keeps every stock's risk share equal.</w:t>
       </w:r>
     </w:p>
     <w:p>
@@ -22899,7 +22899,7 @@
           <w:b/>
           <w:bCs/>
         </w:rPr>
-        <w:t xml:space="preserve">What is the 'weighted variance' the brief mentions?</w:t>
+        <w:t xml:space="preserve">Is 5% minimum met?</w:t>
       </w:r>
     </w:p>
     <w:p>
@@ -22916,7 +22916,7 @@
         <w:t xml:space="preserve">A. </w:t>
       </w:r>
       <w:r>
-        <w:t xml:space="preserve">Portfolio variance w'Σw; each stock's contribution is w_i(Σw)_i. ERC sets these contributions equal.</w:t>
+        <w:t xml:space="preserve">Yes: the smallest weight is AEROFLEX at 9.2%; the largest is ACMESOLAR at the 15% cap.</w:t>
       </w:r>
     </w:p>
     <w:p>
@@ -22937,7 +22937,7 @@
           <w:b/>
           <w:bCs/>
         </w:rPr>
-        <w:t xml:space="preserve">Where is the global minimum variance portfolio?</w:t>
+        <w:t xml:space="preserve">What is the 'weighted variance' the brief mentions?</w:t>
       </w:r>
     </w:p>
     <w:p>
@@ -22954,7 +22954,7 @@
         <w:t xml:space="preserve">A. </w:t>
       </w:r>
       <w:r>
-        <w:t xml:space="preserve">Computed from the same 8 stocks: long-only it is 24.7% volatility with 35% in one stock; within 5-15% it is almost identical to ours (26.6% vs 27.0%, Sharpe 3.43 vs 3.44).</w:t>
+        <w:t xml:space="preserve">Portfolio variance w'Σw; each stock's contribution is w_i(Σw)_i. ERC sets these contributions equal.</w:t>
       </w:r>
     </w:p>
     <w:p>
@@ -22975,7 +22975,7 @@
           <w:b/>
           <w:bCs/>
         </w:rPr>
-        <w:t xml:space="preserve">Why not invest in all 15?</w:t>
+        <w:t xml:space="preserve">Where is the global minimum variance portfolio?</w:t>
       </w:r>
     </w:p>
     <w:p>
@@ -22992,15 +22992,7 @@
         <w:t xml:space="preserve">A. </w:t>
       </w:r>
       <w:r>
-        <w:t xml:space="preserve">The brief asks for 7-10 invested. Spreading over 15 barely lowered volatility (23.6% → 22.3%) and halved the weight of the strongest names.</w:t>
-      </w:r>
-    </w:p>
-    <w:p>
-      <w:pPr>
-        <w:pStyle w:val="Heading2"/>
-      </w:pPr>
-      <w:r>
-        <w:t xml:space="preserve">Risk and hedging</w:t>
+        <w:t xml:space="preserve">Computed from the same 8 stocks: long-only it is 24.7% volatility with 35% in one stock; within 5-15% it is almost identical to ours (26.6% vs 27.0%, Sharpe 3.43 vs 3.44).</w:t>
       </w:r>
     </w:p>
     <w:p>
@@ -23021,7 +23013,7 @@
           <w:b/>
           <w:bCs/>
         </w:rPr>
-        <w:t xml:space="preserve">How did you set the stop-losses?</w:t>
+        <w:t xml:space="preserve">Why not invest in all 15?</w:t>
       </w:r>
     </w:p>
     <w:p>
@@ -23038,7 +23030,15 @@
         <w:t xml:space="preserve">A. </w:t>
       </w:r>
       <w:r>
-        <w:t xml:space="preserve">3 × ATR(14) below the price, moved just under a nearby support; trailed upward only. Currently 13.4-17.2% below price.</w:t>
+        <w:t xml:space="preserve">The brief asks for 7-10 invested. Spreading over 15 barely lowered volatility (23.6% → 22.3%) and halved the weight of the strongest names.</w:t>
+      </w:r>
+    </w:p>
+    <w:p>
+      <w:pPr>
+        <w:pStyle w:val="Heading2"/>
+      </w:pPr>
+      <w:r>
+        <w:t xml:space="preserve">Risk and hedging</w:t>
       </w:r>
     </w:p>
     <w:p>
@@ -23059,7 +23059,7 @@
           <w:b/>
           <w:bCs/>
         </w:rPr>
-        <w:t xml:space="preserve">What happens when a stop is hit?</w:t>
+        <w:t xml:space="preserve">Why 3 × ATR and not a fixed 10% stop?</w:t>
       </w:r>
     </w:p>
     <w:p>
@@ -23076,7 +23076,7 @@
         <w:t xml:space="preserve">A. </w:t>
       </w:r>
       <w:r>
-        <w:t xml:space="preserve">Sell; the proceeds buy the next reserve stock that still passes every rule that day; if none does, they top up the other holdings that are still in an uptrend; if none is, they wait in the liquid ETF until a stock qualifies. We never add stop-loss money to falling stocks.</w:t>
+        <w:t xml:space="preserve">A fixed percentage ignores volatility: our holdings range from 38% (ACMESOLAR) to 60% (AEROFLEX) annualised, so 10% would be loose for one and inside normal noise for the other. ATR scales each stop to the stock's own daily range; 3 ATR puts today's stops 13-17% below price. The multiple is a judgement (wide enough to survive ordinary weeks, tight enough to cap a loss at roughly a month of volatility), not an optimised number; we did not backtest alternatives.</w:t>
       </w:r>
     </w:p>
     <w:p>
@@ -23097,7 +23097,7 @@
           <w:b/>
           <w:bCs/>
         </w:rPr>
-        <w:t xml:space="preserve">What is your portfolio beta and what does it mean?</w:t>
+        <w:t xml:space="preserve">How did you set the stop-losses?</w:t>
       </w:r>
     </w:p>
     <w:p>
@@ -23114,7 +23114,7 @@
         <w:t xml:space="preserve">A. </w:t>
       </w:r>
       <w:r>
-        <w:t xml:space="preserve">1.27 against the Nifty 500: a 1% market move tends to move us ~1.27%. 44.5% of our variance is market risk, 55.5% stock-specific.</w:t>
+        <w:t xml:space="preserve">3 × ATR(14) below the price, moved just under a nearby support; trailed upward only. Currently 13.4-17.2% below price.</w:t>
       </w:r>
     </w:p>
     <w:p>
@@ -23135,7 +23135,7 @@
           <w:b/>
           <w:bCs/>
         </w:rPr>
-        <w:t xml:space="preserve">How much of the risk does the hedge remove?</w:t>
+        <w:t xml:space="preserve">What happens when a stop is hit?</w:t>
       </w:r>
     </w:p>
     <w:p>
@@ -23152,7 +23152,7 @@
         <w:t xml:space="preserve">A. </w:t>
       </w:r>
       <w:r>
-        <w:t xml:space="preserve">The index hedge addresses market risk only (hedge effectiveness R² ≈ 0.31 vs Nifty 50); stock-specific risk is diversified across 8 names and capped by stops.</w:t>
+        <w:t xml:space="preserve">Sell; the proceeds buy the next reserve stock that still passes every rule that day; if none does, they top up the other holdings that are still in an uptrend, none above the 15% cap; if none can take it, they wait in the liquid ETF until a stock qualifies. We never add stop-loss money to falling stocks.</w:t>
       </w:r>
     </w:p>
     <w:p>
@@ -23173,7 +23173,7 @@
           <w:b/>
           <w:bCs/>
         </w:rPr>
-        <w:t xml:space="preserve">Nifty 50 explains only 31% of your variance. Why not a midcap index?</w:t>
+        <w:t xml:space="preserve">What is your portfolio beta and what does it mean?</w:t>
       </w:r>
     </w:p>
     <w:p>
@@ -23190,7 +23190,121 @@
         <w:t xml:space="preserve">A. </w:t>
       </w:r>
       <w:r>
+        <w:t xml:space="preserve">1.27 against the Nifty 500: a 1% market move tends to move us ~1.27%. 44.5% of our variance is market risk, 55.5% stock-specific.</w:t>
+      </w:r>
+    </w:p>
+    <w:p>
+      <w:pPr>
+        <w:keepNext/>
+        <w:spacing w:after="60" w:before="120"/>
+      </w:pPr>
+      <w:r>
+        <w:rPr>
+          <w:b/>
+          <w:bCs/>
+          <w:color w:val="1F3864"/>
+        </w:rPr>
+        <w:t xml:space="preserve">Q. </w:t>
+      </w:r>
+      <w:r>
+        <w:rPr>
+          <w:b/>
+          <w:bCs/>
+        </w:rPr>
+        <w:t xml:space="preserve">How much of the risk does the hedge remove?</w:t>
+      </w:r>
+    </w:p>
+    <w:p>
+      <w:pPr>
+        <w:spacing w:after="60" w:line="264"/>
+        <w:ind w:left="360"/>
+      </w:pPr>
+      <w:r>
+        <w:rPr>
+          <w:b/>
+          <w:bCs/>
+          <w:color w:val="2E7D32"/>
+        </w:rPr>
+        <w:t xml:space="preserve">A. </w:t>
+      </w:r>
+      <w:r>
+        <w:t xml:space="preserve">The index hedge addresses market risk only (hedge effectiveness R² ≈ 0.31 vs Nifty 50); stock-specific risk is diversified across 8 names and capped by stops.</w:t>
+      </w:r>
+    </w:p>
+    <w:p>
+      <w:pPr>
+        <w:keepNext/>
+        <w:spacing w:after="60" w:before="120"/>
+      </w:pPr>
+      <w:r>
+        <w:rPr>
+          <w:b/>
+          <w:bCs/>
+          <w:color w:val="1F3864"/>
+        </w:rPr>
+        <w:t xml:space="preserve">Q. </w:t>
+      </w:r>
+      <w:r>
+        <w:rPr>
+          <w:b/>
+          <w:bCs/>
+        </w:rPr>
+        <w:t xml:space="preserve">Nifty 50 explains only 31% of your variance. Why not a midcap index?</w:t>
+      </w:r>
+    </w:p>
+    <w:p>
+      <w:pPr>
+        <w:spacing w:after="60" w:line="264"/>
+        <w:ind w:left="360"/>
+      </w:pPr>
+      <w:r>
+        <w:rPr>
+          <w:b/>
+          <w:bCs/>
+          <w:color w:val="2E7D32"/>
+        </w:rPr>
+        <w:t xml:space="preserve">A. </w:t>
+      </w:r>
+      <w:r>
         <w:t xml:space="preserve">No index can hedge the other ~55-70%: even the Nifty 500, which contains every one of our stocks, explains only 44.5% of our variance; the rest is stock-specific and is handled by 8-way diversification, the 15% cap and stops. For the market part we chose the contract that is deepest and runs past 28-Dec: our 22,000 Dec put alone has open interest of ~3.1 million units. We did not backtest a midcap-index hedge.</w:t>
+      </w:r>
+    </w:p>
+    <w:p>
+      <w:pPr>
+        <w:keepNext/>
+        <w:spacing w:after="60" w:before="120"/>
+      </w:pPr>
+      <w:r>
+        <w:rPr>
+          <w:b/>
+          <w:bCs/>
+          <w:color w:val="1F3864"/>
+        </w:rPr>
+        <w:t xml:space="preserve">Q. </w:t>
+      </w:r>
+      <w:r>
+        <w:rPr>
+          <w:b/>
+          <w:bCs/>
+        </w:rPr>
+        <w:t xml:space="preserve">What if metal prices swing?</w:t>
+      </w:r>
+    </w:p>
+    <w:p>
+      <w:pPr>
+        <w:spacing w:after="60" w:line="264"/>
+        <w:ind w:left="360"/>
+      </w:pPr>
+      <w:r>
+        <w:rPr>
+          <w:b/>
+          <w:bCs/>
+          <w:color w:val="2E7D32"/>
+        </w:rPr>
+        <w:t xml:space="preserve">A. </w:t>
+      </w:r>
+      <w:r>
+        <w:t xml:space="preserve">RAMRAT and APARINDS pass copper and aluminium costs through to customers, so metal prices move their revenue more than their margin (part of RAMRAT's revenue jump is exactly that). WELCORP's pipe orders are priced per project. Measured at portfolio level, adding Brent crude and the 10-year G-sec to the market regression raises R² by only ~0.5 pp; stock-specific shocks are capped by diversification, the 15% limit and stops.</w:t>
       </w:r>
     </w:p>
     <w:p>

</xml_diff>

<commit_message>
Add EPC contractors to the universe (professor's theme: Capital Goods & EPC)
Screener's Construction export (all Civil Construction) is screened with
Capital Goods (config.SCREENER_EXTRA_FILES): 20 EPC stocks above the floor
after two InvITs and CMPDI (mining services, new theme group 6). Universe
137 -> 157. On the frozen 25-Sep prices the invested 8 are unchanged;
ENGINERSIN (#15) replaces VOLTAMP (#16) in the reserve. Other EPC leaders
fail a rule: CEMPRO (DI gap 0.6), HCC and KPIL (pledge), WELENT (profit
-27%), L&T, KEC, RVNL (no uptrend). Frozen ranking, README, SOURCE.md,
tests and the defence brief updated.

Co-Authored-By: Claude Opus 5.5 <noreply@anthropic.com>
Claude-Session: https://claude.ai/code/session_018SrKZ3YP1T4SHJR1stpujJ
</commit_message>
<xml_diff>
--- a/docs/Defence_Brief_Capex_Portfolio.docx
+++ b/docs/Defence_Brief_Capex_Portfolio.docx
@@ -250,7 +250,7 @@
         <w:t xml:space="preserve">Method in one sentence.</w:t>
       </w:r>
       <w:r>
-        <w:t xml:space="preserve"> From 137 in-theme NSE stocks, keep only those that are safe (no heavy pledging or debt), tradable (₹5 cr+ a day), growing profits into results season and in a confirmed uptrend with a year of history; rank them by 6-month relative strength against the Nifty 500 skipping the latest month; invest in the top 8 and hold the next 7 as a reserve that replaces any stock that hits its stop-loss.</w:t>
+        <w:t xml:space="preserve"> From 157 in-theme NSE stocks, keep only those that are safe (no heavy pledging or debt), tradable (₹5 cr+ a day), growing profits into results season and in a confirmed uptrend with a year of history; rank them by 6-month relative strength against the Nifty 500 skipping the latest month; invest in the top 8 and hold the next 7 as a reserve that replaces any stock that hits its stop-loss.</w:t>
       </w:r>
     </w:p>
     <w:tbl>
@@ -425,7 +425,7 @@
                 <w:sz w:val="18"/>
                 <w:szCs w:val="18"/>
               </w:rPr>
-              <w:t xml:space="preserve">QPOWER, FINCABLES, GRINDWELL, ACE, CARBORUNIV, GOODLUCK, VOLTAMP</w:t>
+              <w:t xml:space="preserve">QPOWER, FINCABLES, GRINDWELL, ACE, CARBORUNIV, GOODLUCK, ENGINERSIN</w:t>
             </w:r>
           </w:p>
         </w:tc>
@@ -725,7 +725,7 @@
                 <w:sz w:val="18"/>
                 <w:szCs w:val="18"/>
               </w:rPr>
-              <w:t xml:space="preserve">Capex &amp; infrastructure: capital goods, power, cement. Every stock's revenue mix checked (business-focus audit).</w:t>
+              <w:t xml:space="preserve">Capex &amp; infrastructure: capital goods &amp; EPC, power, cement. Every stock's revenue mix checked (business-focus audit).</w:t>
             </w:r>
           </w:p>
         </w:tc>
@@ -2039,7 +2039,7 @@
         <w:spacing w:after="120" w:line="276"/>
       </w:pPr>
       <w:r>
-        <w:t xml:space="preserve">The universe is three Screener.in sector exports downloaded on 26-Sep-2026 (Cement, Capital Goods, Power; data/screener/), filtered by stated rules. We moved from the Nifty sector indices to these exports because the indices are narrow (91 stocks) and missed genuine theme stocks; the exports list every company, and our rules decide.</w:t>
+        <w:t xml:space="preserve">The universe is four Screener.in sector exports downloaded on 26/27-Sep-2026 (Cement, Capital Goods, Construction, Power; data/screener/), filtered by stated rules. Construction is Screener's home for EPC contractors (all 181 rows are 'Civil Construction'): the professor's sheet names our theme 'Cement, Capital Goods &amp; EPC, Power', so EPC is screened with Capital Goods. We moved from the Nifty sector indices to these exports because the indices are narrow (91 stocks) and missed genuine theme stocks; the exports list every company, and our rules decide.</w:t>
       </w:r>
     </w:p>
     <w:tbl>
@@ -2171,7 +2171,7 @@
                 <w:sz w:val="18"/>
                 <w:szCs w:val="18"/>
               </w:rPr>
-              <w:t xml:space="preserve">All rows in the three exports</w:t>
+              <w:t xml:space="preserve">All rows in the four exports</w:t>
             </w:r>
           </w:p>
         </w:tc>
@@ -2214,7 +2214,7 @@
                 <w:sz w:val="18"/>
                 <w:szCs w:val="18"/>
               </w:rPr>
-              <w:t xml:space="preserve">978</w:t>
+              <w:t xml:space="preserve">1,159</w:t>
             </w:r>
           </w:p>
         </w:tc>
@@ -2243,7 +2243,7 @@
                 <w:sz w:val="18"/>
                 <w:szCs w:val="18"/>
               </w:rPr>
-              <w:t xml:space="preserve">No NSE listing (BSE-only; largest ~₹3,250 cr)</w:t>
+              <w:t xml:space="preserve">No NSE listing (BSE-only)</w:t>
             </w:r>
           </w:p>
         </w:tc>
@@ -2270,7 +2270,7 @@
                 <w:sz w:val="18"/>
                 <w:szCs w:val="18"/>
               </w:rPr>
-              <w:t xml:space="preserve">358</w:t>
+              <w:t xml:space="preserve">408</w:t>
             </w:r>
           </w:p>
         </w:tc>
@@ -2297,7 +2297,7 @@
                 <w:sz w:val="18"/>
                 <w:szCs w:val="18"/>
               </w:rPr>
-              <w:t xml:space="preserve">620</w:t>
+              <w:t xml:space="preserve">751</w:t>
             </w:r>
           </w:p>
         </w:tc>
@@ -2351,7 +2351,7 @@
                 <w:sz w:val="18"/>
                 <w:szCs w:val="18"/>
               </w:rPr>
-              <w:t xml:space="preserve">434</w:t>
+              <w:t xml:space="preserve">542</w:t>
             </w:r>
           </w:p>
         </w:tc>
@@ -2377,7 +2377,7 @@
                 <w:sz w:val="18"/>
                 <w:szCs w:val="18"/>
               </w:rPr>
-              <w:t xml:space="preserve">186</w:t>
+              <w:t xml:space="preserve">209</w:t>
             </w:r>
           </w:p>
         </w:tc>
@@ -2460,7 +2460,7 @@
                 <w:sz w:val="18"/>
                 <w:szCs w:val="18"/>
               </w:rPr>
-              <w:t xml:space="preserve">169</w:t>
+              <w:t xml:space="preserve">192</w:t>
             </w:r>
           </w:p>
         </w:tc>
@@ -2540,7 +2540,7 @@
                 <w:sz w:val="18"/>
                 <w:szCs w:val="18"/>
               </w:rPr>
-              <w:t xml:space="preserve">161</w:t>
+              <w:t xml:space="preserve">184</w:t>
             </w:r>
           </w:p>
         </w:tc>
@@ -2569,7 +2569,7 @@
                 <w:sz w:val="18"/>
                 <w:szCs w:val="18"/>
               </w:rPr>
-              <w:t xml:space="preserve">InvITs (IndiGrid, PowerGrid InvIT: units, not company shares)</w:t>
+              <w:t xml:space="preserve">InvITs (IndiGrid, PowerGrid InvIT, Nxt-Infra, Shrem: units, not company shares)</w:t>
             </w:r>
           </w:p>
         </w:tc>
@@ -2596,7 +2596,7 @@
                 <w:sz w:val="18"/>
                 <w:szCs w:val="18"/>
               </w:rPr>
-              <w:t xml:space="preserve">2</w:t>
+              <w:t xml:space="preserve">4</w:t>
             </w:r>
           </w:p>
         </w:tc>
@@ -2623,7 +2623,7 @@
                 <w:sz w:val="18"/>
                 <w:szCs w:val="18"/>
               </w:rPr>
-              <w:t xml:space="preserve">159</w:t>
+              <w:t xml:space="preserve">180</w:t>
             </w:r>
           </w:p>
         </w:tc>
@@ -2651,7 +2651,7 @@
                 <w:sz w:val="18"/>
                 <w:szCs w:val="18"/>
               </w:rPr>
-              <w:t xml:space="preserve">Named theme exclusions (22): EMS/electronics, auto &amp; consumer components, defence/aerospace/shipbuilding, primary steel, packaging &amp; films</w:t>
+              <w:t xml:space="preserve">Named theme exclusions (23): EMS/electronics, auto &amp; consumer components, defence/aerospace/shipbuilding, primary steel, packaging &amp; films, mining services (CMPDI)</w:t>
             </w:r>
           </w:p>
         </w:tc>
@@ -2677,7 +2677,7 @@
                 <w:sz w:val="18"/>
                 <w:szCs w:val="18"/>
               </w:rPr>
-              <w:t xml:space="preserve">22</w:t>
+              <w:t xml:space="preserve">23</w:t>
             </w:r>
           </w:p>
         </w:tc>
@@ -2703,7 +2703,7 @@
                 <w:sz w:val="18"/>
                 <w:szCs w:val="18"/>
               </w:rPr>
-              <w:t xml:space="preserve">137</w:t>
+              <w:t xml:space="preserve">157</w:t>
             </w:r>
           </w:p>
         </w:tc>
@@ -2732,7 +2732,7 @@
                 <w:sz w:val="18"/>
                 <w:szCs w:val="18"/>
               </w:rPr>
-              <w:t xml:space="preserve">Universe: Cement 15, Capital Goods 100, Power 22</w:t>
+              <w:t xml:space="preserve">Universe: Cement 15, Capital Goods &amp; EPC 120 (100 + 20 EPC), Power 22</w:t>
             </w:r>
           </w:p>
         </w:tc>
@@ -2777,7 +2777,7 @@
                 <w:sz w:val="18"/>
                 <w:szCs w:val="18"/>
               </w:rPr>
-              <w:t xml:space="preserve">137</w:t>
+              <w:t xml:space="preserve">157</w:t>
             </w:r>
           </w:p>
         </w:tc>
@@ -3092,7 +3092,7 @@
                 <w:sz w:val="18"/>
                 <w:szCs w:val="18"/>
               </w:rPr>
-              <w:t xml:space="preserve">137</w:t>
+              <w:t xml:space="preserve">157</w:t>
             </w:r>
           </w:p>
         </w:tc>
@@ -3175,7 +3175,7 @@
                 <w:sz w:val="18"/>
                 <w:szCs w:val="18"/>
               </w:rPr>
-              <w:t xml:space="preserve">These can turn one bad quarter into a crash; never waived. 9 fail on pledge, 7 on interest cover, 2 on debt.</w:t>
+              <w:t xml:space="preserve">These can turn one bad quarter into a crash; never waived. 12 fail on pledge, 7 on interest cover, 2 on debt.</w:t>
             </w:r>
           </w:p>
         </w:tc>
@@ -3202,7 +3202,7 @@
                 <w:sz w:val="18"/>
                 <w:szCs w:val="18"/>
               </w:rPr>
-              <w:t xml:space="preserve">121</w:t>
+              <w:t xml:space="preserve">138</w:t>
             </w:r>
           </w:p>
         </w:tc>
@@ -3308,7 +3308,7 @@
                 <w:sz w:val="18"/>
                 <w:szCs w:val="18"/>
               </w:rPr>
-              <w:t xml:space="preserve">111</w:t>
+              <w:t xml:space="preserve">128</w:t>
             </w:r>
           </w:p>
         </w:tc>
@@ -3418,7 +3418,7 @@
                 <w:sz w:val="18"/>
                 <w:szCs w:val="18"/>
               </w:rPr>
-              <w:t xml:space="preserve">46</w:t>
+              <w:t xml:space="preserve">52</w:t>
             </w:r>
           </w:p>
         </w:tc>
@@ -3524,7 +3524,7 @@
                 <w:sz w:val="18"/>
                 <w:szCs w:val="18"/>
               </w:rPr>
-              <w:t xml:space="preserve">41</w:t>
+              <w:t xml:space="preserve">45</w:t>
             </w:r>
           </w:p>
         </w:tc>
@@ -3634,7 +3634,7 @@
                 <w:sz w:val="18"/>
                 <w:szCs w:val="18"/>
               </w:rPr>
-              <w:t xml:space="preserve">32</w:t>
+              <w:t xml:space="preserve">34</w:t>
             </w:r>
           </w:p>
         </w:tc>
@@ -3740,7 +3740,7 @@
                 <w:sz w:val="18"/>
                 <w:szCs w:val="18"/>
               </w:rPr>
-              <w:t xml:space="preserve">ranked 1-32</w:t>
+              <w:t xml:space="preserve">ranked 1-34</w:t>
             </w:r>
           </w:p>
         </w:tc>
@@ -11242,7 +11242,7 @@
                 <w:sz w:val="18"/>
                 <w:szCs w:val="18"/>
               </w:rPr>
-              <w:t xml:space="preserve">Moderate</w:t>
+              <w:t xml:space="preserve">High</w:t>
             </w:r>
           </w:p>
         </w:tc>
@@ -11270,7 +11270,7 @@
                 <w:sz w:val="18"/>
                 <w:szCs w:val="18"/>
               </w:rPr>
-              <w:t xml:space="preserve">VOLTAMP</w:t>
+              <w:t xml:space="preserve">ENGINERSIN</w:t>
             </w:r>
           </w:p>
         </w:tc>
@@ -11322,7 +11322,7 @@
                 <w:sz w:val="18"/>
                 <w:szCs w:val="18"/>
               </w:rPr>
-              <w:t xml:space="preserve">+18%</w:t>
+              <w:t xml:space="preserve">+24%</w:t>
             </w:r>
           </w:p>
         </w:tc>
@@ -11348,7 +11348,7 @@
                 <w:sz w:val="18"/>
                 <w:szCs w:val="18"/>
               </w:rPr>
-              <w:t xml:space="preserve">+8%</w:t>
+              <w:t xml:space="preserve">+31%</w:t>
             </w:r>
           </w:p>
         </w:tc>
@@ -11374,7 +11374,7 @@
                 <w:sz w:val="18"/>
                 <w:szCs w:val="18"/>
               </w:rPr>
-              <w:t xml:space="preserve">+15%</w:t>
+              <w:t xml:space="preserve">+142%</w:t>
             </w:r>
           </w:p>
         </w:tc>
@@ -11400,7 +11400,7 @@
                 <w:sz w:val="18"/>
                 <w:szCs w:val="18"/>
               </w:rPr>
-              <w:t xml:space="preserve">25</w:t>
+              <w:t xml:space="preserve">49</w:t>
             </w:r>
           </w:p>
         </w:tc>
@@ -11426,7 +11426,7 @@
                 <w:sz w:val="18"/>
                 <w:szCs w:val="18"/>
               </w:rPr>
-              <w:t xml:space="preserve">34</w:t>
+              <w:t xml:space="preserve">23</w:t>
             </w:r>
           </w:p>
         </w:tc>
@@ -11452,7 +11452,7 @@
                 <w:sz w:val="18"/>
                 <w:szCs w:val="18"/>
               </w:rPr>
-              <w:t xml:space="preserve">Low</w:t>
+              <w:t xml:space="preserve">High</w:t>
             </w:r>
           </w:p>
         </w:tc>
@@ -17808,7 +17808,7 @@
         <w:pStyle w:val="Heading3"/>
       </w:pPr>
       <w:r>
-        <w:t xml:space="preserve">VOLTAMP: Voltamp Transformers (rank 15)</w:t>
+        <w:t xml:space="preserve">ENGINERSIN: Engineers India (rank 15)</w:t>
       </w:r>
     </w:p>
     <w:p>
@@ -17823,7 +17823,7 @@
         <w:t xml:space="preserve">Business.</w:t>
       </w:r>
       <w:r>
-        <w:t xml:space="preserve"> Oil-filled power and distribution transformers (~96% products); power T&amp;D equipment.</w:t>
+        <w:t xml:space="preserve"> Engineering consultancy and turnkey (LSTK) EPC for refineries, petrochemicals, fertilisers and infrastructure; Screener: Construction &gt; Civil Construction (EPC).</w:t>
       </w:r>
     </w:p>
     <w:p>
@@ -17838,7 +17838,7 @@
         <w:t xml:space="preserve">Case.</w:t>
       </w:r>
       <w:r>
-        <w:t xml:space="preserve"> Oil-filled power and distribution transformers (~96% products): core T&amp;D equipment. 6-month RS +18%, profit +15%.  </w:t>
+        <w:t xml:space="preserve"> Engineers India: engineering consultancy and turnkey (LSTK) EPC for refineries, petrochemicals, fertilisers and infrastructure; the only EPC stock that passes every rule. 6-month RS +24%, profit +142%, debt-free.  </w:t>
       </w:r>
       <w:r>
         <w:rPr>
@@ -17848,7 +17848,7 @@
         <w:t xml:space="preserve">Risk.</w:t>
       </w:r>
       <w:r>
-        <w:t xml:space="preserve"> Momentum faded in both RRG views (Low conviction); it was excluded while the conviction filter existed.  </w:t>
+        <w:t xml:space="preserve"> Profit jumped while sales fell 6% (other income and margin mix, not volume); a sharp late run-up (57% of its 3-month outperformance in the last 10 sessions), RSI 73.  </w:t>
       </w:r>
       <w:r>
         <w:rPr>
@@ -17858,7 +17858,7 @@
         <w:t xml:space="preserve">Answer.</w:t>
       </w:r>
       <w:r>
-        <w:t xml:space="preserve"> Reserve #7. Its return after the filter was dropped is a direct consequence of the backtest, not a judgement call.</w:t>
+        <w:t xml:space="preserve"> Reserve #7. It entered when EPC contractors joined the universe (the professor's theme includes EPC); it replaced VOLTAMP, which now ranks #16.</w:t>
       </w:r>
     </w:p>
     <w:p>
@@ -18543,7 +18543,7 @@
                 <w:sz w:val="18"/>
                 <w:szCs w:val="18"/>
               </w:rPr>
-              <w:t xml:space="preserve">6-month RS −19.9%, rank 32 of 32 eligible. Earlier it sold off on strong Q1 results: the good news was in the price.</w:t>
+              <w:t xml:space="preserve">6-month RS −19.9%, rank 34 of 34 eligible. Earlier it sold off on strong Q1 results: the good news was in the price.</w:t>
             </w:r>
           </w:p>
         </w:tc>
@@ -18599,7 +18599,7 @@
                 <w:sz w:val="18"/>
                 <w:szCs w:val="18"/>
               </w:rPr>
-              <w:t xml:space="preserve">Screener classifies it as Construction, outside our three exports. Tested separately: bearish trend (DI gap −3.8), lagging the Nifty 500, 6-month RS +6.8%.</w:t>
+              <w:t xml:space="preserve">In the universe (EPC, via Screener's Construction export) but not in an uptrend: DI gap −3.8, 6-month RS +6.8%.</w:t>
             </w:r>
           </w:p>
         </w:tc>
@@ -18653,7 +18653,7 @@
                 <w:sz w:val="18"/>
                 <w:szCs w:val="18"/>
               </w:rPr>
-              <w:t xml:space="preserve">Now IN the list (reserve #7). It was excluded only while the conviction filter existed.</w:t>
+              <w:t xml:space="preserve">Passes every rule; rank 16 (6-month RS +18%). It was reserve #7 until EPC joined the universe and ENGINERSIN (+24%) ranked above it.</w:t>
             </w:r>
           </w:p>
         </w:tc>
@@ -18682,7 +18682,7 @@
                 <w:sz w:val="18"/>
                 <w:szCs w:val="18"/>
               </w:rPr>
-              <w:t xml:space="preserve">APLAPOLLO</w:t>
+              <w:t xml:space="preserve">CEMPRO (Cemindia, ex-ITD Cementation)</w:t>
             </w:r>
           </w:p>
         </w:tc>
@@ -18709,7 +18709,7 @@
                 <w:sz w:val="18"/>
                 <w:szCs w:val="18"/>
               </w:rPr>
-              <w:t xml:space="preserve">Passes every rule but 6-month RS ~0%: rank 23, below the 15.</w:t>
+              <w:t xml:space="preserve">The strongest EPC stock (6-month RS +139%) but no real trend now: DI gap 0.6 &lt; 2.</w:t>
             </w:r>
           </w:p>
         </w:tc>
@@ -18737,7 +18737,7 @@
                 <w:sz w:val="18"/>
                 <w:szCs w:val="18"/>
               </w:rPr>
-              <w:t xml:space="preserve">JKCEMENT</w:t>
+              <w:t xml:space="preserve">HCC, KPIL (Kalpataru)</w:t>
             </w:r>
           </w:p>
         </w:tc>
@@ -18763,7 +18763,7 @@
                 <w:sz w:val="18"/>
                 <w:szCs w:val="18"/>
               </w:rPr>
-              <w:t xml:space="preserve">Trend too weak (DI gap 0.5 &lt; 2) and latest-quarter profit −14%.</w:t>
+              <w:t xml:space="preserve">Fail the HARD pledge rule: 82% and 25% of promoter shares pledged (limit 15%).</w:t>
             </w:r>
           </w:p>
         </w:tc>
@@ -18792,6 +18792,226 @@
                 <w:sz w:val="18"/>
                 <w:szCs w:val="18"/>
               </w:rPr>
+              <w:t xml:space="preserve">WELENT (Welspun Enterprises)</w:t>
+            </w:r>
+          </w:p>
+        </w:tc>
+        <w:tc>
+          <w:tcPr>
+            <w:tcW w:type="dxa" w:w="7559"/>
+            <w:shd w:fill="F2F2F2" w:color="auto" w:val="clear"/>
+            <w:tcMar>
+              <w:top w:type="dxa" w:w="60"/>
+              <w:left w:type="dxa" w:w="90"/>
+              <w:bottom w:type="dxa" w:w="60"/>
+              <w:right w:type="dxa" w:w="90"/>
+            </w:tcMar>
+          </w:tcPr>
+          <w:p>
+            <w:pPr>
+              <w:spacing w:after="0"/>
+              <w:jc w:val="left"/>
+            </w:pPr>
+            <w:r>
+              <w:rPr>
+                <w:b w:val="false"/>
+                <w:bCs w:val="false"/>
+                <w:sz w:val="18"/>
+                <w:szCs w:val="18"/>
+              </w:rPr>
+              <w:t xml:space="preserve">Latest-quarter profit −27% year on year: fails the profit rule going into results.</w:t>
+            </w:r>
+          </w:p>
+        </w:tc>
+      </w:tr>
+      <w:tr>
+        <w:tc>
+          <w:tcPr>
+            <w:tcW w:type="dxa" w:w="2079"/>
+            <w:tcMar>
+              <w:top w:type="dxa" w:w="60"/>
+              <w:left w:type="dxa" w:w="90"/>
+              <w:bottom w:type="dxa" w:w="60"/>
+              <w:right w:type="dxa" w:w="90"/>
+            </w:tcMar>
+          </w:tcPr>
+          <w:p>
+            <w:pPr>
+              <w:spacing w:after="0"/>
+              <w:jc w:val="left"/>
+            </w:pPr>
+            <w:r>
+              <w:rPr>
+                <w:b w:val="false"/>
+                <w:bCs w:val="false"/>
+                <w:sz w:val="18"/>
+                <w:szCs w:val="18"/>
+              </w:rPr>
+              <w:t xml:space="preserve">KEC, RVNL, NCC, IRCON</w:t>
+            </w:r>
+          </w:p>
+        </w:tc>
+        <w:tc>
+          <w:tcPr>
+            <w:tcW w:type="dxa" w:w="7559"/>
+            <w:tcMar>
+              <w:top w:type="dxa" w:w="60"/>
+              <w:left w:type="dxa" w:w="90"/>
+              <w:bottom w:type="dxa" w:w="60"/>
+              <w:right w:type="dxa" w:w="90"/>
+            </w:tcMar>
+          </w:tcPr>
+          <w:p>
+            <w:pPr>
+              <w:spacing w:after="0"/>
+              <w:jc w:val="left"/>
+            </w:pPr>
+            <w:r>
+              <w:rPr>
+                <w:b w:val="false"/>
+                <w:bCs w:val="false"/>
+                <w:sz w:val="18"/>
+                <w:szCs w:val="18"/>
+              </w:rPr>
+              <w:t xml:space="preserve">Not in an uptrend (negative DI gap) and lagging the Nifty 500 over 6 months.</w:t>
+            </w:r>
+          </w:p>
+        </w:tc>
+      </w:tr>
+      <w:tr>
+        <w:tc>
+          <w:tcPr>
+            <w:tcW w:type="dxa" w:w="2079"/>
+            <w:shd w:fill="F2F2F2" w:color="auto" w:val="clear"/>
+            <w:tcMar>
+              <w:top w:type="dxa" w:w="60"/>
+              <w:left w:type="dxa" w:w="90"/>
+              <w:bottom w:type="dxa" w:w="60"/>
+              <w:right w:type="dxa" w:w="90"/>
+            </w:tcMar>
+          </w:tcPr>
+          <w:p>
+            <w:pPr>
+              <w:spacing w:after="0"/>
+              <w:jc w:val="left"/>
+            </w:pPr>
+            <w:r>
+              <w:rPr>
+                <w:b w:val="false"/>
+                <w:bCs w:val="false"/>
+                <w:sz w:val="18"/>
+                <w:szCs w:val="18"/>
+              </w:rPr>
+              <w:t xml:space="preserve">APLAPOLLO</w:t>
+            </w:r>
+          </w:p>
+        </w:tc>
+        <w:tc>
+          <w:tcPr>
+            <w:tcW w:type="dxa" w:w="7559"/>
+            <w:shd w:fill="F2F2F2" w:color="auto" w:val="clear"/>
+            <w:tcMar>
+              <w:top w:type="dxa" w:w="60"/>
+              <w:left w:type="dxa" w:w="90"/>
+              <w:bottom w:type="dxa" w:w="60"/>
+              <w:right w:type="dxa" w:w="90"/>
+            </w:tcMar>
+          </w:tcPr>
+          <w:p>
+            <w:pPr>
+              <w:spacing w:after="0"/>
+              <w:jc w:val="left"/>
+            </w:pPr>
+            <w:r>
+              <w:rPr>
+                <w:b w:val="false"/>
+                <w:bCs w:val="false"/>
+                <w:sz w:val="18"/>
+                <w:szCs w:val="18"/>
+              </w:rPr>
+              <w:t xml:space="preserve">Passes every rule but 6-month RS ~0%: rank 25, below the 15.</w:t>
+            </w:r>
+          </w:p>
+        </w:tc>
+      </w:tr>
+      <w:tr>
+        <w:tc>
+          <w:tcPr>
+            <w:tcW w:type="dxa" w:w="2079"/>
+            <w:tcMar>
+              <w:top w:type="dxa" w:w="60"/>
+              <w:left w:type="dxa" w:w="90"/>
+              <w:bottom w:type="dxa" w:w="60"/>
+              <w:right w:type="dxa" w:w="90"/>
+            </w:tcMar>
+          </w:tcPr>
+          <w:p>
+            <w:pPr>
+              <w:spacing w:after="0"/>
+              <w:jc w:val="left"/>
+            </w:pPr>
+            <w:r>
+              <w:rPr>
+                <w:b w:val="false"/>
+                <w:bCs w:val="false"/>
+                <w:sz w:val="18"/>
+                <w:szCs w:val="18"/>
+              </w:rPr>
+              <w:t xml:space="preserve">JKCEMENT</w:t>
+            </w:r>
+          </w:p>
+        </w:tc>
+        <w:tc>
+          <w:tcPr>
+            <w:tcW w:type="dxa" w:w="7559"/>
+            <w:tcMar>
+              <w:top w:type="dxa" w:w="60"/>
+              <w:left w:type="dxa" w:w="90"/>
+              <w:bottom w:type="dxa" w:w="60"/>
+              <w:right w:type="dxa" w:w="90"/>
+            </w:tcMar>
+          </w:tcPr>
+          <w:p>
+            <w:pPr>
+              <w:spacing w:after="0"/>
+              <w:jc w:val="left"/>
+            </w:pPr>
+            <w:r>
+              <w:rPr>
+                <w:b w:val="false"/>
+                <w:bCs w:val="false"/>
+                <w:sz w:val="18"/>
+                <w:szCs w:val="18"/>
+              </w:rPr>
+              <w:t xml:space="preserve">Trend too weak (DI gap 0.5 &lt; 2) and latest-quarter profit −14%.</w:t>
+            </w:r>
+          </w:p>
+        </w:tc>
+      </w:tr>
+      <w:tr>
+        <w:tc>
+          <w:tcPr>
+            <w:tcW w:type="dxa" w:w="2079"/>
+            <w:shd w:fill="F2F2F2" w:color="auto" w:val="clear"/>
+            <w:tcMar>
+              <w:top w:type="dxa" w:w="60"/>
+              <w:left w:type="dxa" w:w="90"/>
+              <w:bottom w:type="dxa" w:w="60"/>
+              <w:right w:type="dxa" w:w="90"/>
+            </w:tcMar>
+          </w:tcPr>
+          <w:p>
+            <w:pPr>
+              <w:spacing w:after="0"/>
+              <w:jc w:val="left"/>
+            </w:pPr>
+            <w:r>
+              <w:rPr>
+                <w:b w:val="false"/>
+                <w:bCs w:val="false"/>
+                <w:sz w:val="18"/>
+                <w:szCs w:val="18"/>
+              </w:rPr>
               <w:t xml:space="preserve">NUVOCO (Cement)</w:t>
             </w:r>
           </w:p>
@@ -18819,7 +19039,7 @@
                 <w:sz w:val="18"/>
                 <w:szCs w:val="18"/>
               </w:rPr>
-              <w:t xml:space="preserve">Passes every rule but 6-month RS ~+1%: rank 22, below the 15.</w:t>
+              <w:t xml:space="preserve">Passes every rule but 6-month RS ~+1%: rank 24, below the 15.</w:t>
             </w:r>
           </w:p>
         </w:tc>
@@ -22815,7 +23035,7 @@
           <w:b/>
           <w:bCs/>
         </w:rPr>
-        <w:t xml:space="preserve">Why no Tata Power / L&amp;T?</w:t>
+        <w:t xml:space="preserve">Your sheet says 'Capital Goods &amp; EPC'. Where is EPC?</w:t>
       </w:r>
     </w:p>
     <w:p>
@@ -22832,7 +23052,45 @@
         <w:t xml:space="preserve">A. </w:t>
       </w:r>
       <w:r>
-        <w:t xml:space="preserve">Tata Power: 6-month RS −20%, last of 32. L&amp;T: not in the capital goods universe (Construction), and its trend is bearish anyway.</w:t>
+        <w:t xml:space="preserve">EPC contractors are in the universe (Screener's Construction export, 20 above ₹5,000 cr). The same rules apply: ENGINERSIN passes and is reserve #7; the rest fail on trend (L&amp;T, KEC, RVNL, CEMPRO), pledge (HCC, KPIL) or falling profit (WELENT). Most EPC stocks are not in an uptrend right now, and the rule has no sector quotas, so it does not force them in.</w:t>
+      </w:r>
+    </w:p>
+    <w:p>
+      <w:pPr>
+        <w:keepNext/>
+        <w:spacing w:after="60" w:before="120"/>
+      </w:pPr>
+      <w:r>
+        <w:rPr>
+          <w:b/>
+          <w:bCs/>
+          <w:color w:val="1F3864"/>
+        </w:rPr>
+        <w:t xml:space="preserve">Q. </w:t>
+      </w:r>
+      <w:r>
+        <w:rPr>
+          <w:b/>
+          <w:bCs/>
+        </w:rPr>
+        <w:t xml:space="preserve">Why no Tata Power / L&amp;T?</w:t>
+      </w:r>
+    </w:p>
+    <w:p>
+      <w:pPr>
+        <w:spacing w:after="60" w:line="264"/>
+        <w:ind w:left="360"/>
+      </w:pPr>
+      <w:r>
+        <w:rPr>
+          <w:b/>
+          <w:bCs/>
+          <w:color w:val="2E7D32"/>
+        </w:rPr>
+        <w:t xml:space="preserve">A. </w:t>
+      </w:r>
+      <w:r>
+        <w:t xml:space="preserve">Tata Power: 6-month RS −20%, last of 34. L&amp;T: in the universe as EPC, but its trend is bearish (DI gap −3.8) and 6-month RS only +6.8%.</w:t>
       </w:r>
     </w:p>
     <w:p>
@@ -24841,7 +25099,7 @@
         <w:spacing w:after="120" w:line="276"/>
       </w:pPr>
       <w:r>
-        <w:t xml:space="preserve">All 32 stocks that passed every rule, ranked by 6-month RS skipping the latest month. The top 15 are the list; the top 8 are invested.</w:t>
+        <w:t xml:space="preserve">All 34 stocks that passed every rule, ranked by 6-month RS skipping the latest month. The top 15 are the list; the top 8 are invested.</w:t>
       </w:r>
     </w:p>
     <w:tbl>
@@ -28605,7 +28863,7 @@
                 <w:sz w:val="18"/>
                 <w:szCs w:val="18"/>
               </w:rPr>
-              <w:t xml:space="preserve">VOLTAMP</w:t>
+              <w:t xml:space="preserve">ENGINERSIN</w:t>
             </w:r>
           </w:p>
         </w:tc>
@@ -28659,7 +28917,7 @@
                 <w:sz w:val="18"/>
                 <w:szCs w:val="18"/>
               </w:rPr>
-              <w:t xml:space="preserve">+18.3%</w:t>
+              <w:t xml:space="preserve">+24.1%</w:t>
             </w:r>
           </w:p>
         </w:tc>
@@ -28686,7 +28944,7 @@
                 <w:sz w:val="18"/>
                 <w:szCs w:val="18"/>
               </w:rPr>
-              <w:t xml:space="preserve">+8.0%</w:t>
+              <w:t xml:space="preserve">+30.8%</w:t>
             </w:r>
           </w:p>
         </w:tc>
@@ -28713,7 +28971,7 @@
                 <w:sz w:val="18"/>
                 <w:szCs w:val="18"/>
               </w:rPr>
-              <w:t xml:space="preserve">+15%</w:t>
+              <w:t xml:space="preserve">+142%</w:t>
             </w:r>
           </w:p>
         </w:tc>
@@ -28740,7 +28998,7 @@
                 <w:sz w:val="18"/>
                 <w:szCs w:val="18"/>
               </w:rPr>
-              <w:t xml:space="preserve">24.8</w:t>
+              <w:t xml:space="preserve">49.4</w:t>
             </w:r>
           </w:p>
         </w:tc>
@@ -28767,7 +29025,7 @@
                 <w:sz w:val="18"/>
                 <w:szCs w:val="18"/>
               </w:rPr>
-              <w:t xml:space="preserve">34</w:t>
+              <w:t xml:space="preserve">23</w:t>
             </w:r>
           </w:p>
         </w:tc>
@@ -28850,7 +29108,7 @@
                 <w:sz w:val="18"/>
                 <w:szCs w:val="18"/>
               </w:rPr>
-              <w:t xml:space="preserve">TEXRAIL</w:t>
+              <w:t xml:space="preserve">VOLTAMP</w:t>
             </w:r>
           </w:p>
         </w:tc>
@@ -28904,7 +29162,7 @@
                 <w:sz w:val="18"/>
                 <w:szCs w:val="18"/>
               </w:rPr>
-              <w:t xml:space="preserve">+15.2%</w:t>
+              <w:t xml:space="preserve">+18.3%</w:t>
             </w:r>
           </w:p>
         </w:tc>
@@ -28931,7 +29189,7 @@
                 <w:sz w:val="18"/>
                 <w:szCs w:val="18"/>
               </w:rPr>
-              <w:t xml:space="preserve">+18.6%</w:t>
+              <w:t xml:space="preserve">+8.0%</w:t>
             </w:r>
           </w:p>
         </w:tc>
@@ -28958,7 +29216,7 @@
                 <w:sz w:val="18"/>
                 <w:szCs w:val="18"/>
               </w:rPr>
-              <w:t xml:space="preserve">+67%</w:t>
+              <w:t xml:space="preserve">+15%</w:t>
             </w:r>
           </w:p>
         </w:tc>
@@ -28985,7 +29243,7 @@
                 <w:sz w:val="18"/>
                 <w:szCs w:val="18"/>
               </w:rPr>
-              <w:t xml:space="preserve">17.8</w:t>
+              <w:t xml:space="preserve">24.8</w:t>
             </w:r>
           </w:p>
         </w:tc>
@@ -29012,7 +29270,7 @@
                 <w:sz w:val="18"/>
                 <w:szCs w:val="18"/>
               </w:rPr>
-              <w:t xml:space="preserve">24</w:t>
+              <w:t xml:space="preserve">34</w:t>
             </w:r>
           </w:p>
         </w:tc>
@@ -29084,7 +29342,7 @@
                 <w:sz w:val="18"/>
                 <w:szCs w:val="18"/>
               </w:rPr>
-              <w:t xml:space="preserve">USHAMART</w:t>
+              <w:t xml:space="preserve">TEXRAIL</w:t>
             </w:r>
           </w:p>
         </w:tc>
@@ -29136,7 +29394,7 @@
                 <w:sz w:val="18"/>
                 <w:szCs w:val="18"/>
               </w:rPr>
-              <w:t xml:space="preserve">+14.1%</w:t>
+              <w:t xml:space="preserve">+15.2%</w:t>
             </w:r>
           </w:p>
         </w:tc>
@@ -29162,7 +29420,7 @@
                 <w:sz w:val="18"/>
                 <w:szCs w:val="18"/>
               </w:rPr>
-              <w:t xml:space="preserve">+8.8%</w:t>
+              <w:t xml:space="preserve">+18.6%</w:t>
             </w:r>
           </w:p>
         </w:tc>
@@ -29188,7 +29446,7 @@
                 <w:sz w:val="18"/>
                 <w:szCs w:val="18"/>
               </w:rPr>
-              <w:t xml:space="preserve">+41%</w:t>
+              <w:t xml:space="preserve">+67%</w:t>
             </w:r>
           </w:p>
         </w:tc>
@@ -29214,7 +29472,7 @@
                 <w:sz w:val="18"/>
                 <w:szCs w:val="18"/>
               </w:rPr>
-              <w:t xml:space="preserve">21.1</w:t>
+              <w:t xml:space="preserve">17.8</w:t>
             </w:r>
           </w:p>
         </w:tc>
@@ -29240,7 +29498,7 @@
                 <w:sz w:val="18"/>
                 <w:szCs w:val="18"/>
               </w:rPr>
-              <w:t xml:space="preserve">29</w:t>
+              <w:t xml:space="preserve">24</w:t>
             </w:r>
           </w:p>
         </w:tc>
@@ -29313,7 +29571,7 @@
                 <w:sz w:val="18"/>
                 <w:szCs w:val="18"/>
               </w:rPr>
-              <w:t xml:space="preserve">GMMPFAUDLR</w:t>
+              <w:t xml:space="preserve">CEIGALL</w:t>
             </w:r>
           </w:p>
         </w:tc>
@@ -29367,7 +29625,7 @@
                 <w:sz w:val="18"/>
                 <w:szCs w:val="18"/>
               </w:rPr>
-              <w:t xml:space="preserve">+9.9%</w:t>
+              <w:t xml:space="preserve">+14.3%</w:t>
             </w:r>
           </w:p>
         </w:tc>
@@ -29394,7 +29652,7 @@
                 <w:sz w:val="18"/>
                 <w:szCs w:val="18"/>
               </w:rPr>
-              <w:t xml:space="preserve">+91.6%</w:t>
+              <w:t xml:space="preserve">-1.3%</w:t>
             </w:r>
           </w:p>
         </w:tc>
@@ -29421,7 +29679,7 @@
                 <w:sz w:val="18"/>
                 <w:szCs w:val="18"/>
               </w:rPr>
-              <w:t xml:space="preserve">+114%</w:t>
+              <w:t xml:space="preserve">+18%</w:t>
             </w:r>
           </w:p>
         </w:tc>
@@ -29448,7 +29706,7 @@
                 <w:sz w:val="18"/>
                 <w:szCs w:val="18"/>
               </w:rPr>
-              <w:t xml:space="preserve">10.6</w:t>
+              <w:t xml:space="preserve">11.9</w:t>
             </w:r>
           </w:p>
         </w:tc>
@@ -29475,7 +29733,7 @@
                 <w:sz w:val="18"/>
                 <w:szCs w:val="18"/>
               </w:rPr>
-              <w:t xml:space="preserve">54</w:t>
+              <w:t xml:space="preserve">21</w:t>
             </w:r>
           </w:p>
         </w:tc>
@@ -29547,7 +29805,7 @@
                 <w:sz w:val="18"/>
                 <w:szCs w:val="18"/>
               </w:rPr>
-              <w:t xml:space="preserve">ENRIN</w:t>
+              <w:t xml:space="preserve">USHAMART</w:t>
             </w:r>
           </w:p>
         </w:tc>
@@ -29599,7 +29857,7 @@
                 <w:sz w:val="18"/>
                 <w:szCs w:val="18"/>
               </w:rPr>
-              <w:t xml:space="preserve">+9.3%</w:t>
+              <w:t xml:space="preserve">+14.1%</w:t>
             </w:r>
           </w:p>
         </w:tc>
@@ -29625,7 +29883,7 @@
                 <w:sz w:val="18"/>
                 <w:szCs w:val="18"/>
               </w:rPr>
-              <w:t xml:space="preserve">-5.8%</w:t>
+              <w:t xml:space="preserve">+8.8%</w:t>
             </w:r>
           </w:p>
         </w:tc>
@@ -29651,7 +29909,7 @@
                 <w:sz w:val="18"/>
                 <w:szCs w:val="18"/>
               </w:rPr>
-              <w:t xml:space="preserve">+68%</w:t>
+              <w:t xml:space="preserve">+41%</w:t>
             </w:r>
           </w:p>
         </w:tc>
@@ -29677,7 +29935,7 @@
                 <w:sz w:val="18"/>
                 <w:szCs w:val="18"/>
               </w:rPr>
-              <w:t xml:space="preserve">125.1</w:t>
+              <w:t xml:space="preserve">21.1</w:t>
             </w:r>
           </w:p>
         </w:tc>
@@ -29703,7 +29961,7 @@
                 <w:sz w:val="18"/>
                 <w:szCs w:val="18"/>
               </w:rPr>
-              <w:t xml:space="preserve">77</w:t>
+              <w:t xml:space="preserve">29</w:t>
             </w:r>
           </w:p>
         </w:tc>
@@ -29776,7 +30034,7 @@
                 <w:sz w:val="18"/>
                 <w:szCs w:val="18"/>
               </w:rPr>
-              <w:t xml:space="preserve">GRAPHITE</w:t>
+              <w:t xml:space="preserve">GMMPFAUDLR</w:t>
             </w:r>
           </w:p>
         </w:tc>
@@ -29830,7 +30088,7 @@
                 <w:sz w:val="18"/>
                 <w:szCs w:val="18"/>
               </w:rPr>
-              <w:t xml:space="preserve">+8.2%</w:t>
+              <w:t xml:space="preserve">+9.9%</w:t>
             </w:r>
           </w:p>
         </w:tc>
@@ -29857,7 +30115,7 @@
                 <w:sz w:val="18"/>
                 <w:szCs w:val="18"/>
               </w:rPr>
-              <w:t xml:space="preserve">+35.3%</w:t>
+              <w:t xml:space="preserve">+91.6%</w:t>
             </w:r>
           </w:p>
         </w:tc>
@@ -29884,7 +30142,7 @@
                 <w:sz w:val="18"/>
                 <w:szCs w:val="18"/>
               </w:rPr>
-              <w:t xml:space="preserve">+28%</w:t>
+              <w:t xml:space="preserve">+114%</w:t>
             </w:r>
           </w:p>
         </w:tc>
@@ -29911,7 +30169,7 @@
                 <w:sz w:val="18"/>
                 <w:szCs w:val="18"/>
               </w:rPr>
-              <w:t xml:space="preserve">59.5</w:t>
+              <w:t xml:space="preserve">10.6</w:t>
             </w:r>
           </w:p>
         </w:tc>
@@ -29938,7 +30196,7 @@
                 <w:sz w:val="18"/>
                 <w:szCs w:val="18"/>
               </w:rPr>
-              <w:t xml:space="preserve">73</w:t>
+              <w:t xml:space="preserve">54</w:t>
             </w:r>
           </w:p>
         </w:tc>
@@ -30010,7 +30268,7 @@
                 <w:sz w:val="18"/>
                 <w:szCs w:val="18"/>
               </w:rPr>
-              <w:t xml:space="preserve">MAHSEAMLES</w:t>
+              <w:t xml:space="preserve">ENRIN</w:t>
             </w:r>
           </w:p>
         </w:tc>
@@ -30062,7 +30320,7 @@
                 <w:sz w:val="18"/>
                 <w:szCs w:val="18"/>
               </w:rPr>
-              <w:t xml:space="preserve">+4.4%</w:t>
+              <w:t xml:space="preserve">+9.3%</w:t>
             </w:r>
           </w:p>
         </w:tc>
@@ -30088,7 +30346,7 @@
                 <w:sz w:val="18"/>
                 <w:szCs w:val="18"/>
               </w:rPr>
-              <w:t xml:space="preserve">+17.3%</w:t>
+              <w:t xml:space="preserve">-5.8%</w:t>
             </w:r>
           </w:p>
         </w:tc>
@@ -30114,7 +30372,7 @@
                 <w:sz w:val="18"/>
                 <w:szCs w:val="18"/>
               </w:rPr>
-              <w:t xml:space="preserve">+16%</w:t>
+              <w:t xml:space="preserve">+68%</w:t>
             </w:r>
           </w:p>
         </w:tc>
@@ -30140,7 +30398,7 @@
                 <w:sz w:val="18"/>
                 <w:szCs w:val="18"/>
               </w:rPr>
-              <w:t xml:space="preserve">8.5</w:t>
+              <w:t xml:space="preserve">125.1</w:t>
             </w:r>
           </w:p>
         </w:tc>
@@ -30166,7 +30424,7 @@
                 <w:sz w:val="18"/>
                 <w:szCs w:val="18"/>
               </w:rPr>
-              <w:t xml:space="preserve">13</w:t>
+              <w:t xml:space="preserve">77</w:t>
             </w:r>
           </w:p>
         </w:tc>
@@ -30239,7 +30497,7 @@
                 <w:sz w:val="18"/>
                 <w:szCs w:val="18"/>
               </w:rPr>
-              <w:t xml:space="preserve">NUVOCO</w:t>
+              <w:t xml:space="preserve">GRAPHITE</w:t>
             </w:r>
           </w:p>
         </w:tc>
@@ -30266,7 +30524,7 @@
                 <w:sz w:val="18"/>
                 <w:szCs w:val="18"/>
               </w:rPr>
-              <w:t xml:space="preserve">Cement</w:t>
+              <w:t xml:space="preserve">Capital Goods</w:t>
             </w:r>
           </w:p>
         </w:tc>
@@ -30293,7 +30551,7 @@
                 <w:sz w:val="18"/>
                 <w:szCs w:val="18"/>
               </w:rPr>
-              <w:t xml:space="preserve">+1.0%</w:t>
+              <w:t xml:space="preserve">+8.2%</w:t>
             </w:r>
           </w:p>
         </w:tc>
@@ -30320,7 +30578,7 @@
                 <w:sz w:val="18"/>
                 <w:szCs w:val="18"/>
               </w:rPr>
-              <w:t xml:space="preserve">+12.0%</w:t>
+              <w:t xml:space="preserve">+35.3%</w:t>
             </w:r>
           </w:p>
         </w:tc>
@@ -30347,7 +30605,7 @@
                 <w:sz w:val="18"/>
                 <w:szCs w:val="18"/>
               </w:rPr>
-              <w:t xml:space="preserve">+20%</w:t>
+              <w:t xml:space="preserve">+28%</w:t>
             </w:r>
           </w:p>
         </w:tc>
@@ -30374,7 +30632,7 @@
                 <w:sz w:val="18"/>
                 <w:szCs w:val="18"/>
               </w:rPr>
-              <w:t xml:space="preserve">9.9</w:t>
+              <w:t xml:space="preserve">59.5</w:t>
             </w:r>
           </w:p>
         </w:tc>
@@ -30401,7 +30659,7 @@
                 <w:sz w:val="18"/>
                 <w:szCs w:val="18"/>
               </w:rPr>
-              <w:t xml:space="preserve">29</w:t>
+              <w:t xml:space="preserve">73</w:t>
             </w:r>
           </w:p>
         </w:tc>
@@ -30473,7 +30731,7 @@
                 <w:sz w:val="18"/>
                 <w:szCs w:val="18"/>
               </w:rPr>
-              <w:t xml:space="preserve">APLAPOLLO</w:t>
+              <w:t xml:space="preserve">MAHSEAMLES</w:t>
             </w:r>
           </w:p>
         </w:tc>
@@ -30525,7 +30783,7 @@
                 <w:sz w:val="18"/>
                 <w:szCs w:val="18"/>
               </w:rPr>
-              <w:t xml:space="preserve">0.0%</w:t>
+              <w:t xml:space="preserve">+4.4%</w:t>
             </w:r>
           </w:p>
         </w:tc>
@@ -30551,7 +30809,7 @@
                 <w:sz w:val="18"/>
                 <w:szCs w:val="18"/>
               </w:rPr>
-              <w:t xml:space="preserve">+25.6%</w:t>
+              <w:t xml:space="preserve">+17.3%</w:t>
             </w:r>
           </w:p>
         </w:tc>
@@ -30577,7 +30835,7 @@
                 <w:sz w:val="18"/>
                 <w:szCs w:val="18"/>
               </w:rPr>
-              <w:t xml:space="preserve">+11%</w:t>
+              <w:t xml:space="preserve">+16%</w:t>
             </w:r>
           </w:p>
         </w:tc>
@@ -30603,7 +30861,7 @@
                 <w:sz w:val="18"/>
                 <w:szCs w:val="18"/>
               </w:rPr>
-              <w:t xml:space="preserve">104.9</w:t>
+              <w:t xml:space="preserve">8.5</w:t>
             </w:r>
           </w:p>
         </w:tc>
@@ -30629,7 +30887,7 @@
                 <w:sz w:val="18"/>
                 <w:szCs w:val="18"/>
               </w:rPr>
-              <w:t xml:space="preserve">50</w:t>
+              <w:t xml:space="preserve">13</w:t>
             </w:r>
           </w:p>
         </w:tc>
@@ -30702,7 +30960,7 @@
                 <w:sz w:val="18"/>
                 <w:szCs w:val="18"/>
               </w:rPr>
-              <w:t xml:space="preserve">WAAREERTL</w:t>
+              <w:t xml:space="preserve">NUVOCO</w:t>
             </w:r>
           </w:p>
         </w:tc>
@@ -30729,7 +30987,7 @@
                 <w:sz w:val="18"/>
                 <w:szCs w:val="18"/>
               </w:rPr>
-              <w:t xml:space="preserve">Capital Goods</w:t>
+              <w:t xml:space="preserve">Cement</w:t>
             </w:r>
           </w:p>
         </w:tc>
@@ -30756,7 +31014,7 @@
                 <w:sz w:val="18"/>
                 <w:szCs w:val="18"/>
               </w:rPr>
-              <w:t xml:space="preserve">-4.3%</w:t>
+              <w:t xml:space="preserve">+1.0%</w:t>
             </w:r>
           </w:p>
         </w:tc>
@@ -30783,7 +31041,7 @@
                 <w:sz w:val="18"/>
                 <w:szCs w:val="18"/>
               </w:rPr>
-              <w:t xml:space="preserve">-16.1%</w:t>
+              <w:t xml:space="preserve">+12.0%</w:t>
             </w:r>
           </w:p>
         </w:tc>
@@ -30810,7 +31068,7 @@
                 <w:sz w:val="18"/>
                 <w:szCs w:val="18"/>
               </w:rPr>
-              <w:t xml:space="preserve">+32%</w:t>
+              <w:t xml:space="preserve">+20%</w:t>
             </w:r>
           </w:p>
         </w:tc>
@@ -30837,7 +31095,7 @@
                 <w:sz w:val="18"/>
                 <w:szCs w:val="18"/>
               </w:rPr>
-              <w:t xml:space="preserve">10.8</w:t>
+              <w:t xml:space="preserve">9.9</w:t>
             </w:r>
           </w:p>
         </w:tc>
@@ -30864,7 +31122,7 @@
                 <w:sz w:val="18"/>
                 <w:szCs w:val="18"/>
               </w:rPr>
-              <w:t xml:space="preserve">17</w:t>
+              <w:t xml:space="preserve">29</w:t>
             </w:r>
           </w:p>
         </w:tc>
@@ -30936,7 +31194,7 @@
                 <w:sz w:val="18"/>
                 <w:szCs w:val="18"/>
               </w:rPr>
-              <w:t xml:space="preserve">RHIM</w:t>
+              <w:t xml:space="preserve">APLAPOLLO</w:t>
             </w:r>
           </w:p>
         </w:tc>
@@ -30988,7 +31246,7 @@
                 <w:sz w:val="18"/>
                 <w:szCs w:val="18"/>
               </w:rPr>
-              <w:t xml:space="preserve">-5.2%</w:t>
+              <w:t xml:space="preserve">0.0%</w:t>
             </w:r>
           </w:p>
         </w:tc>
@@ -31014,7 +31272,7 @@
                 <w:sz w:val="18"/>
                 <w:szCs w:val="18"/>
               </w:rPr>
-              <w:t xml:space="preserve">+5.3%</w:t>
+              <w:t xml:space="preserve">+25.6%</w:t>
             </w:r>
           </w:p>
         </w:tc>
@@ -31040,7 +31298,7 @@
                 <w:sz w:val="18"/>
                 <w:szCs w:val="18"/>
               </w:rPr>
-              <w:t xml:space="preserve">+83%</w:t>
+              <w:t xml:space="preserve">+11%</w:t>
             </w:r>
           </w:p>
         </w:tc>
@@ -31066,7 +31324,7 @@
                 <w:sz w:val="18"/>
                 <w:szCs w:val="18"/>
               </w:rPr>
-              <w:t xml:space="preserve">14.9</w:t>
+              <w:t xml:space="preserve">104.9</w:t>
             </w:r>
           </w:p>
         </w:tc>
@@ -31092,7 +31350,7 @@
                 <w:sz w:val="18"/>
                 <w:szCs w:val="18"/>
               </w:rPr>
-              <w:t xml:space="preserve">43</w:t>
+              <w:t xml:space="preserve">50</w:t>
             </w:r>
           </w:p>
         </w:tc>
@@ -31165,7 +31423,7 @@
                 <w:sz w:val="18"/>
                 <w:szCs w:val="18"/>
               </w:rPr>
-              <w:t xml:space="preserve">SKFINDIA</w:t>
+              <w:t xml:space="preserve">WAAREERTL</w:t>
             </w:r>
           </w:p>
         </w:tc>
@@ -31219,7 +31477,7 @@
                 <w:sz w:val="18"/>
                 <w:szCs w:val="18"/>
               </w:rPr>
-              <w:t xml:space="preserve">-5.6%</w:t>
+              <w:t xml:space="preserve">-4.3%</w:t>
             </w:r>
           </w:p>
         </w:tc>
@@ -31246,7 +31504,7 @@
                 <w:sz w:val="18"/>
                 <w:szCs w:val="18"/>
               </w:rPr>
-              <w:t xml:space="preserve">-5.3%</w:t>
+              <w:t xml:space="preserve">-16.1%</w:t>
             </w:r>
           </w:p>
         </w:tc>
@@ -31300,7 +31558,7 @@
                 <w:sz w:val="18"/>
                 <w:szCs w:val="18"/>
               </w:rPr>
-              <w:t xml:space="preserve">6.5</w:t>
+              <w:t xml:space="preserve">10.8</w:t>
             </w:r>
           </w:p>
         </w:tc>
@@ -31327,7 +31585,7 @@
                 <w:sz w:val="18"/>
                 <w:szCs w:val="18"/>
               </w:rPr>
-              <w:t xml:space="preserve">51</w:t>
+              <w:t xml:space="preserve">17</w:t>
             </w:r>
           </w:p>
         </w:tc>
@@ -31399,7 +31657,7 @@
                 <w:sz w:val="18"/>
                 <w:szCs w:val="18"/>
               </w:rPr>
-              <w:t xml:space="preserve">NHPC</w:t>
+              <w:t xml:space="preserve">RHIM</w:t>
             </w:r>
           </w:p>
         </w:tc>
@@ -31425,7 +31683,7 @@
                 <w:sz w:val="18"/>
                 <w:szCs w:val="18"/>
               </w:rPr>
-              <w:t xml:space="preserve">Power</w:t>
+              <w:t xml:space="preserve">Capital Goods</w:t>
             </w:r>
           </w:p>
         </w:tc>
@@ -31451,7 +31709,7 @@
                 <w:sz w:val="18"/>
                 <w:szCs w:val="18"/>
               </w:rPr>
-              <w:t xml:space="preserve">-12.7%</w:t>
+              <w:t xml:space="preserve">-5.2%</w:t>
             </w:r>
           </w:p>
         </w:tc>
@@ -31477,7 +31735,7 @@
                 <w:sz w:val="18"/>
                 <w:szCs w:val="18"/>
               </w:rPr>
-              <w:t xml:space="preserve">-5.1%</w:t>
+              <w:t xml:space="preserve">+5.3%</w:t>
             </w:r>
           </w:p>
         </w:tc>
@@ -31503,7 +31761,7 @@
                 <w:sz w:val="18"/>
                 <w:szCs w:val="18"/>
               </w:rPr>
-              <w:t xml:space="preserve">+3%</w:t>
+              <w:t xml:space="preserve">+83%</w:t>
             </w:r>
           </w:p>
         </w:tc>
@@ -31529,7 +31787,7 @@
                 <w:sz w:val="18"/>
                 <w:szCs w:val="18"/>
               </w:rPr>
-              <w:t xml:space="preserve">68.9</w:t>
+              <w:t xml:space="preserve">14.9</w:t>
             </w:r>
           </w:p>
         </w:tc>
@@ -31555,7 +31813,7 @@
                 <w:sz w:val="18"/>
                 <w:szCs w:val="18"/>
               </w:rPr>
-              <w:t xml:space="preserve">20</w:t>
+              <w:t xml:space="preserve">43</w:t>
             </w:r>
           </w:p>
         </w:tc>
@@ -31628,7 +31886,7 @@
                 <w:sz w:val="18"/>
                 <w:szCs w:val="18"/>
               </w:rPr>
-              <w:t xml:space="preserve">TIMKEN</w:t>
+              <w:t xml:space="preserve">SKFINDIA</w:t>
             </w:r>
           </w:p>
         </w:tc>
@@ -31682,7 +31940,7 @@
                 <w:sz w:val="18"/>
                 <w:szCs w:val="18"/>
               </w:rPr>
-              <w:t xml:space="preserve">-13.8%</w:t>
+              <w:t xml:space="preserve">-5.6%</w:t>
             </w:r>
           </w:p>
         </w:tc>
@@ -31709,7 +31967,7 @@
                 <w:sz w:val="18"/>
                 <w:szCs w:val="18"/>
               </w:rPr>
-              <w:t xml:space="preserve">-6.4%</w:t>
+              <w:t xml:space="preserve">-5.3%</w:t>
             </w:r>
           </w:p>
         </w:tc>
@@ -31736,7 +31994,7 @@
                 <w:sz w:val="18"/>
                 <w:szCs w:val="18"/>
               </w:rPr>
-              <w:t xml:space="preserve">+10%</w:t>
+              <w:t xml:space="preserve">+32%</w:t>
             </w:r>
           </w:p>
         </w:tc>
@@ -31763,7 +32021,7 @@
                 <w:sz w:val="18"/>
                 <w:szCs w:val="18"/>
               </w:rPr>
-              <w:t xml:space="preserve">10.6</w:t>
+              <w:t xml:space="preserve">6.5</w:t>
             </w:r>
           </w:p>
         </w:tc>
@@ -31790,7 +32048,7 @@
                 <w:sz w:val="18"/>
                 <w:szCs w:val="18"/>
               </w:rPr>
-              <w:t xml:space="preserve">59</w:t>
+              <w:t xml:space="preserve">51</w:t>
             </w:r>
           </w:p>
         </w:tc>
@@ -31862,7 +32120,7 @@
                 <w:sz w:val="18"/>
                 <w:szCs w:val="18"/>
               </w:rPr>
-              <w:t xml:space="preserve">SUPREMEIND</w:t>
+              <w:t xml:space="preserve">NHPC</w:t>
             </w:r>
           </w:p>
         </w:tc>
@@ -31888,7 +32146,7 @@
                 <w:sz w:val="18"/>
                 <w:szCs w:val="18"/>
               </w:rPr>
-              <w:t xml:space="preserve">Capital Goods</w:t>
+              <w:t xml:space="preserve">Power</w:t>
             </w:r>
           </w:p>
         </w:tc>
@@ -31914,7 +32172,7 @@
                 <w:sz w:val="18"/>
                 <w:szCs w:val="18"/>
               </w:rPr>
-              <w:t xml:space="preserve">-18.4%</w:t>
+              <w:t xml:space="preserve">-12.7%</w:t>
             </w:r>
           </w:p>
         </w:tc>
@@ -31940,7 +32198,7 @@
                 <w:sz w:val="18"/>
                 <w:szCs w:val="18"/>
               </w:rPr>
-              <w:t xml:space="preserve">+12.9%</w:t>
+              <w:t xml:space="preserve">-5.1%</w:t>
             </w:r>
           </w:p>
         </w:tc>
@@ -31966,7 +32224,7 @@
                 <w:sz w:val="18"/>
                 <w:szCs w:val="18"/>
               </w:rPr>
-              <w:t xml:space="preserve">+39%</w:t>
+              <w:t xml:space="preserve">+3%</w:t>
             </w:r>
           </w:p>
         </w:tc>
@@ -31992,7 +32250,7 @@
                 <w:sz w:val="18"/>
                 <w:szCs w:val="18"/>
               </w:rPr>
-              <w:t xml:space="preserve">56.1</w:t>
+              <w:t xml:space="preserve">68.9</w:t>
             </w:r>
           </w:p>
         </w:tc>
@@ -32018,7 +32276,7 @@
                 <w:sz w:val="18"/>
                 <w:szCs w:val="18"/>
               </w:rPr>
-              <w:t xml:space="preserve">44</w:t>
+              <w:t xml:space="preserve">20</w:t>
             </w:r>
           </w:p>
         </w:tc>
@@ -32091,7 +32349,7 @@
                 <w:sz w:val="18"/>
                 <w:szCs w:val="18"/>
               </w:rPr>
-              <w:t xml:space="preserve">TRANSRAILL</w:t>
+              <w:t xml:space="preserve">TIMKEN</w:t>
             </w:r>
           </w:p>
         </w:tc>
@@ -32145,7 +32403,7 @@
                 <w:sz w:val="18"/>
                 <w:szCs w:val="18"/>
               </w:rPr>
-              <w:t xml:space="preserve">-19.0%</w:t>
+              <w:t xml:space="preserve">-13.8%</w:t>
             </w:r>
           </w:p>
         </w:tc>
@@ -32172,7 +32430,7 @@
                 <w:sz w:val="18"/>
                 <w:szCs w:val="18"/>
               </w:rPr>
-              <w:t xml:space="preserve">-7.7%</w:t>
+              <w:t xml:space="preserve">-6.4%</w:t>
             </w:r>
           </w:p>
         </w:tc>
@@ -32199,7 +32457,7 @@
                 <w:sz w:val="18"/>
                 <w:szCs w:val="18"/>
               </w:rPr>
-              <w:t xml:space="preserve">+2%</w:t>
+              <w:t xml:space="preserve">+10%</w:t>
             </w:r>
           </w:p>
         </w:tc>
@@ -32226,7 +32484,7 @@
                 <w:sz w:val="18"/>
                 <w:szCs w:val="18"/>
               </w:rPr>
-              <w:t xml:space="preserve">15.1</w:t>
+              <w:t xml:space="preserve">10.6</w:t>
             </w:r>
           </w:p>
         </w:tc>
@@ -32253,7 +32511,7 @@
                 <w:sz w:val="18"/>
                 <w:szCs w:val="18"/>
               </w:rPr>
-              <w:t xml:space="preserve">15</w:t>
+              <w:t xml:space="preserve">59</w:t>
             </w:r>
           </w:p>
         </w:tc>
@@ -32325,7 +32583,7 @@
                 <w:sz w:val="18"/>
                 <w:szCs w:val="18"/>
               </w:rPr>
-              <w:t xml:space="preserve">NTPCGREEN</w:t>
+              <w:t xml:space="preserve">SUPREMEIND</w:t>
             </w:r>
           </w:p>
         </w:tc>
@@ -32351,7 +32609,7 @@
                 <w:sz w:val="18"/>
                 <w:szCs w:val="18"/>
               </w:rPr>
-              <w:t xml:space="preserve">Power</w:t>
+              <w:t xml:space="preserve">Capital Goods</w:t>
             </w:r>
           </w:p>
         </w:tc>
@@ -32377,7 +32635,7 @@
                 <w:sz w:val="18"/>
                 <w:szCs w:val="18"/>
               </w:rPr>
-              <w:t xml:space="preserve">-19.8%</w:t>
+              <w:t xml:space="preserve">-18.4%</w:t>
             </w:r>
           </w:p>
         </w:tc>
@@ -32403,7 +32661,7 @@
                 <w:sz w:val="18"/>
                 <w:szCs w:val="18"/>
               </w:rPr>
-              <w:t xml:space="preserve">+0.7%</w:t>
+              <w:t xml:space="preserve">+12.9%</w:t>
             </w:r>
           </w:p>
         </w:tc>
@@ -32429,7 +32687,7 @@
                 <w:sz w:val="18"/>
                 <w:szCs w:val="18"/>
               </w:rPr>
-              <w:t xml:space="preserve">+38%</w:t>
+              <w:t xml:space="preserve">+39%</w:t>
             </w:r>
           </w:p>
         </w:tc>
@@ -32455,7 +32713,7 @@
                 <w:sz w:val="18"/>
                 <w:szCs w:val="18"/>
               </w:rPr>
-              <w:t xml:space="preserve">21.5</w:t>
+              <w:t xml:space="preserve">56.1</w:t>
             </w:r>
           </w:p>
         </w:tc>
@@ -32481,7 +32739,7 @@
                 <w:sz w:val="18"/>
                 <w:szCs w:val="18"/>
               </w:rPr>
-              <w:t xml:space="preserve">130</w:t>
+              <w:t xml:space="preserve">44</w:t>
             </w:r>
           </w:p>
         </w:tc>
@@ -32528,6 +32786,469 @@
                 <w:szCs w:val="18"/>
               </w:rPr>
               <w:t xml:space="preserve">32</w:t>
+            </w:r>
+          </w:p>
+        </w:tc>
+        <w:tc>
+          <w:tcPr>
+            <w:tcW w:type="dxa" w:w="1676"/>
+            <w:shd w:fill="F2F2F2" w:color="auto" w:val="clear"/>
+            <w:tcMar>
+              <w:top w:type="dxa" w:w="60"/>
+              <w:left w:type="dxa" w:w="90"/>
+              <w:bottom w:type="dxa" w:w="60"/>
+              <w:right w:type="dxa" w:w="90"/>
+            </w:tcMar>
+          </w:tcPr>
+          <w:p>
+            <w:pPr>
+              <w:spacing w:after="0"/>
+              <w:jc w:val="left"/>
+            </w:pPr>
+            <w:r>
+              <w:rPr>
+                <w:b w:val="false"/>
+                <w:bCs w:val="false"/>
+                <w:sz w:val="18"/>
+                <w:szCs w:val="18"/>
+              </w:rPr>
+              <w:t xml:space="preserve">TRANSRAILL</w:t>
+            </w:r>
+          </w:p>
+        </w:tc>
+        <w:tc>
+          <w:tcPr>
+            <w:tcW w:type="dxa" w:w="1571"/>
+            <w:shd w:fill="F2F2F2" w:color="auto" w:val="clear"/>
+            <w:tcMar>
+              <w:top w:type="dxa" w:w="60"/>
+              <w:left w:type="dxa" w:w="90"/>
+              <w:bottom w:type="dxa" w:w="60"/>
+              <w:right w:type="dxa" w:w="90"/>
+            </w:tcMar>
+          </w:tcPr>
+          <w:p>
+            <w:pPr>
+              <w:spacing w:after="0"/>
+              <w:jc w:val="left"/>
+            </w:pPr>
+            <w:r>
+              <w:rPr>
+                <w:b w:val="false"/>
+                <w:bCs w:val="false"/>
+                <w:sz w:val="18"/>
+                <w:szCs w:val="18"/>
+              </w:rPr>
+              <w:t xml:space="preserve">Capital Goods</w:t>
+            </w:r>
+          </w:p>
+        </w:tc>
+        <w:tc>
+          <w:tcPr>
+            <w:tcW w:type="dxa" w:w="943"/>
+            <w:shd w:fill="F2F2F2" w:color="auto" w:val="clear"/>
+            <w:tcMar>
+              <w:top w:type="dxa" w:w="60"/>
+              <w:left w:type="dxa" w:w="90"/>
+              <w:bottom w:type="dxa" w:w="60"/>
+              <w:right w:type="dxa" w:w="90"/>
+            </w:tcMar>
+          </w:tcPr>
+          <w:p>
+            <w:pPr>
+              <w:spacing w:after="0"/>
+              <w:jc w:val="right"/>
+            </w:pPr>
+            <w:r>
+              <w:rPr>
+                <w:b w:val="false"/>
+                <w:bCs w:val="false"/>
+                <w:sz w:val="18"/>
+                <w:szCs w:val="18"/>
+              </w:rPr>
+              <w:t xml:space="preserve">-19.0%</w:t>
+            </w:r>
+          </w:p>
+        </w:tc>
+        <w:tc>
+          <w:tcPr>
+            <w:tcW w:type="dxa" w:w="943"/>
+            <w:shd w:fill="F2F2F2" w:color="auto" w:val="clear"/>
+            <w:tcMar>
+              <w:top w:type="dxa" w:w="60"/>
+              <w:left w:type="dxa" w:w="90"/>
+              <w:bottom w:type="dxa" w:w="60"/>
+              <w:right w:type="dxa" w:w="90"/>
+            </w:tcMar>
+          </w:tcPr>
+          <w:p>
+            <w:pPr>
+              <w:spacing w:after="0"/>
+              <w:jc w:val="right"/>
+            </w:pPr>
+            <w:r>
+              <w:rPr>
+                <w:b w:val="false"/>
+                <w:bCs w:val="false"/>
+                <w:sz w:val="18"/>
+                <w:szCs w:val="18"/>
+              </w:rPr>
+              <w:t xml:space="preserve">-7.7%</w:t>
+            </w:r>
+          </w:p>
+        </w:tc>
+        <w:tc>
+          <w:tcPr>
+            <w:tcW w:type="dxa" w:w="1048"/>
+            <w:shd w:fill="F2F2F2" w:color="auto" w:val="clear"/>
+            <w:tcMar>
+              <w:top w:type="dxa" w:w="60"/>
+              <w:left w:type="dxa" w:w="90"/>
+              <w:bottom w:type="dxa" w:w="60"/>
+              <w:right w:type="dxa" w:w="90"/>
+            </w:tcMar>
+          </w:tcPr>
+          <w:p>
+            <w:pPr>
+              <w:spacing w:after="0"/>
+              <w:jc w:val="right"/>
+            </w:pPr>
+            <w:r>
+              <w:rPr>
+                <w:b w:val="false"/>
+                <w:bCs w:val="false"/>
+                <w:sz w:val="18"/>
+                <w:szCs w:val="18"/>
+              </w:rPr>
+              <w:t xml:space="preserve">+2%</w:t>
+            </w:r>
+          </w:p>
+        </w:tc>
+        <w:tc>
+          <w:tcPr>
+            <w:tcW w:type="dxa" w:w="1152"/>
+            <w:shd w:fill="F2F2F2" w:color="auto" w:val="clear"/>
+            <w:tcMar>
+              <w:top w:type="dxa" w:w="60"/>
+              <w:left w:type="dxa" w:w="90"/>
+              <w:bottom w:type="dxa" w:w="60"/>
+              <w:right w:type="dxa" w:w="90"/>
+            </w:tcMar>
+          </w:tcPr>
+          <w:p>
+            <w:pPr>
+              <w:spacing w:after="0"/>
+              <w:jc w:val="right"/>
+            </w:pPr>
+            <w:r>
+              <w:rPr>
+                <w:b w:val="false"/>
+                <w:bCs w:val="false"/>
+                <w:sz w:val="18"/>
+                <w:szCs w:val="18"/>
+              </w:rPr>
+              <w:t xml:space="preserve">15.1</w:t>
+            </w:r>
+          </w:p>
+        </w:tc>
+        <w:tc>
+          <w:tcPr>
+            <w:tcW w:type="dxa" w:w="733"/>
+            <w:shd w:fill="F2F2F2" w:color="auto" w:val="clear"/>
+            <w:tcMar>
+              <w:top w:type="dxa" w:w="60"/>
+              <w:left w:type="dxa" w:w="90"/>
+              <w:bottom w:type="dxa" w:w="60"/>
+              <w:right w:type="dxa" w:w="90"/>
+            </w:tcMar>
+          </w:tcPr>
+          <w:p>
+            <w:pPr>
+              <w:spacing w:after="0"/>
+              <w:jc w:val="right"/>
+            </w:pPr>
+            <w:r>
+              <w:rPr>
+                <w:b w:val="false"/>
+                <w:bCs w:val="false"/>
+                <w:sz w:val="18"/>
+                <w:szCs w:val="18"/>
+              </w:rPr>
+              <w:t xml:space="preserve">15</w:t>
+            </w:r>
+          </w:p>
+        </w:tc>
+        <w:tc>
+          <w:tcPr>
+            <w:tcW w:type="dxa" w:w="1048"/>
+            <w:shd w:fill="F2F2F2" w:color="auto" w:val="clear"/>
+            <w:tcMar>
+              <w:top w:type="dxa" w:w="60"/>
+              <w:left w:type="dxa" w:w="90"/>
+              <w:bottom w:type="dxa" w:w="60"/>
+              <w:right w:type="dxa" w:w="90"/>
+            </w:tcMar>
+          </w:tcPr>
+          <w:p>
+            <w:pPr>
+              <w:spacing w:after="0"/>
+              <w:jc w:val="left"/>
+            </w:pPr>
+          </w:p>
+        </w:tc>
+      </w:tr>
+      <w:tr>
+        <w:tc>
+          <w:tcPr>
+            <w:tcW w:type="dxa" w:w="524"/>
+            <w:tcMar>
+              <w:top w:type="dxa" w:w="60"/>
+              <w:left w:type="dxa" w:w="90"/>
+              <w:bottom w:type="dxa" w:w="60"/>
+              <w:right w:type="dxa" w:w="90"/>
+            </w:tcMar>
+          </w:tcPr>
+          <w:p>
+            <w:pPr>
+              <w:spacing w:after="0"/>
+              <w:jc w:val="right"/>
+            </w:pPr>
+            <w:r>
+              <w:rPr>
+                <w:b w:val="false"/>
+                <w:bCs w:val="false"/>
+                <w:sz w:val="18"/>
+                <w:szCs w:val="18"/>
+              </w:rPr>
+              <w:t xml:space="preserve">33</w:t>
+            </w:r>
+          </w:p>
+        </w:tc>
+        <w:tc>
+          <w:tcPr>
+            <w:tcW w:type="dxa" w:w="1676"/>
+            <w:tcMar>
+              <w:top w:type="dxa" w:w="60"/>
+              <w:left w:type="dxa" w:w="90"/>
+              <w:bottom w:type="dxa" w:w="60"/>
+              <w:right w:type="dxa" w:w="90"/>
+            </w:tcMar>
+          </w:tcPr>
+          <w:p>
+            <w:pPr>
+              <w:spacing w:after="0"/>
+              <w:jc w:val="left"/>
+            </w:pPr>
+            <w:r>
+              <w:rPr>
+                <w:b w:val="false"/>
+                <w:bCs w:val="false"/>
+                <w:sz w:val="18"/>
+                <w:szCs w:val="18"/>
+              </w:rPr>
+              <w:t xml:space="preserve">NTPCGREEN</w:t>
+            </w:r>
+          </w:p>
+        </w:tc>
+        <w:tc>
+          <w:tcPr>
+            <w:tcW w:type="dxa" w:w="1571"/>
+            <w:tcMar>
+              <w:top w:type="dxa" w:w="60"/>
+              <w:left w:type="dxa" w:w="90"/>
+              <w:bottom w:type="dxa" w:w="60"/>
+              <w:right w:type="dxa" w:w="90"/>
+            </w:tcMar>
+          </w:tcPr>
+          <w:p>
+            <w:pPr>
+              <w:spacing w:after="0"/>
+              <w:jc w:val="left"/>
+            </w:pPr>
+            <w:r>
+              <w:rPr>
+                <w:b w:val="false"/>
+                <w:bCs w:val="false"/>
+                <w:sz w:val="18"/>
+                <w:szCs w:val="18"/>
+              </w:rPr>
+              <w:t xml:space="preserve">Power</w:t>
+            </w:r>
+          </w:p>
+        </w:tc>
+        <w:tc>
+          <w:tcPr>
+            <w:tcW w:type="dxa" w:w="943"/>
+            <w:tcMar>
+              <w:top w:type="dxa" w:w="60"/>
+              <w:left w:type="dxa" w:w="90"/>
+              <w:bottom w:type="dxa" w:w="60"/>
+              <w:right w:type="dxa" w:w="90"/>
+            </w:tcMar>
+          </w:tcPr>
+          <w:p>
+            <w:pPr>
+              <w:spacing w:after="0"/>
+              <w:jc w:val="right"/>
+            </w:pPr>
+            <w:r>
+              <w:rPr>
+                <w:b w:val="false"/>
+                <w:bCs w:val="false"/>
+                <w:sz w:val="18"/>
+                <w:szCs w:val="18"/>
+              </w:rPr>
+              <w:t xml:space="preserve">-19.8%</w:t>
+            </w:r>
+          </w:p>
+        </w:tc>
+        <w:tc>
+          <w:tcPr>
+            <w:tcW w:type="dxa" w:w="943"/>
+            <w:tcMar>
+              <w:top w:type="dxa" w:w="60"/>
+              <w:left w:type="dxa" w:w="90"/>
+              <w:bottom w:type="dxa" w:w="60"/>
+              <w:right w:type="dxa" w:w="90"/>
+            </w:tcMar>
+          </w:tcPr>
+          <w:p>
+            <w:pPr>
+              <w:spacing w:after="0"/>
+              <w:jc w:val="right"/>
+            </w:pPr>
+            <w:r>
+              <w:rPr>
+                <w:b w:val="false"/>
+                <w:bCs w:val="false"/>
+                <w:sz w:val="18"/>
+                <w:szCs w:val="18"/>
+              </w:rPr>
+              <w:t xml:space="preserve">+0.7%</w:t>
+            </w:r>
+          </w:p>
+        </w:tc>
+        <w:tc>
+          <w:tcPr>
+            <w:tcW w:type="dxa" w:w="1048"/>
+            <w:tcMar>
+              <w:top w:type="dxa" w:w="60"/>
+              <w:left w:type="dxa" w:w="90"/>
+              <w:bottom w:type="dxa" w:w="60"/>
+              <w:right w:type="dxa" w:w="90"/>
+            </w:tcMar>
+          </w:tcPr>
+          <w:p>
+            <w:pPr>
+              <w:spacing w:after="0"/>
+              <w:jc w:val="right"/>
+            </w:pPr>
+            <w:r>
+              <w:rPr>
+                <w:b w:val="false"/>
+                <w:bCs w:val="false"/>
+                <w:sz w:val="18"/>
+                <w:szCs w:val="18"/>
+              </w:rPr>
+              <w:t xml:space="preserve">+38%</w:t>
+            </w:r>
+          </w:p>
+        </w:tc>
+        <w:tc>
+          <w:tcPr>
+            <w:tcW w:type="dxa" w:w="1152"/>
+            <w:tcMar>
+              <w:top w:type="dxa" w:w="60"/>
+              <w:left w:type="dxa" w:w="90"/>
+              <w:bottom w:type="dxa" w:w="60"/>
+              <w:right w:type="dxa" w:w="90"/>
+            </w:tcMar>
+          </w:tcPr>
+          <w:p>
+            <w:pPr>
+              <w:spacing w:after="0"/>
+              <w:jc w:val="right"/>
+            </w:pPr>
+            <w:r>
+              <w:rPr>
+                <w:b w:val="false"/>
+                <w:bCs w:val="false"/>
+                <w:sz w:val="18"/>
+                <w:szCs w:val="18"/>
+              </w:rPr>
+              <w:t xml:space="preserve">21.5</w:t>
+            </w:r>
+          </w:p>
+        </w:tc>
+        <w:tc>
+          <w:tcPr>
+            <w:tcW w:type="dxa" w:w="733"/>
+            <w:tcMar>
+              <w:top w:type="dxa" w:w="60"/>
+              <w:left w:type="dxa" w:w="90"/>
+              <w:bottom w:type="dxa" w:w="60"/>
+              <w:right w:type="dxa" w:w="90"/>
+            </w:tcMar>
+          </w:tcPr>
+          <w:p>
+            <w:pPr>
+              <w:spacing w:after="0"/>
+              <w:jc w:val="right"/>
+            </w:pPr>
+            <w:r>
+              <w:rPr>
+                <w:b w:val="false"/>
+                <w:bCs w:val="false"/>
+                <w:sz w:val="18"/>
+                <w:szCs w:val="18"/>
+              </w:rPr>
+              <w:t xml:space="preserve">130</w:t>
+            </w:r>
+          </w:p>
+        </w:tc>
+        <w:tc>
+          <w:tcPr>
+            <w:tcW w:type="dxa" w:w="1048"/>
+            <w:tcMar>
+              <w:top w:type="dxa" w:w="60"/>
+              <w:left w:type="dxa" w:w="90"/>
+              <w:bottom w:type="dxa" w:w="60"/>
+              <w:right w:type="dxa" w:w="90"/>
+            </w:tcMar>
+          </w:tcPr>
+          <w:p>
+            <w:pPr>
+              <w:spacing w:after="0"/>
+              <w:jc w:val="left"/>
+            </w:pPr>
+          </w:p>
+        </w:tc>
+      </w:tr>
+      <w:tr>
+        <w:tc>
+          <w:tcPr>
+            <w:tcW w:type="dxa" w:w="524"/>
+            <w:shd w:fill="F2F2F2" w:color="auto" w:val="clear"/>
+            <w:tcMar>
+              <w:top w:type="dxa" w:w="60"/>
+              <w:left w:type="dxa" w:w="90"/>
+              <w:bottom w:type="dxa" w:w="60"/>
+              <w:right w:type="dxa" w:w="90"/>
+            </w:tcMar>
+          </w:tcPr>
+          <w:p>
+            <w:pPr>
+              <w:spacing w:after="0"/>
+              <w:jc w:val="right"/>
+            </w:pPr>
+            <w:r>
+              <w:rPr>
+                <w:b w:val="false"/>
+                <w:bCs w:val="false"/>
+                <w:sz w:val="18"/>
+                <w:szCs w:val="18"/>
+              </w:rPr>
+              <w:t xml:space="preserve">34</w:t>
             </w:r>
           </w:p>
         </w:tc>

</xml_diff>

<commit_message>
Remove the RRG (it drives nothing); label Capital Goods as Capital Goods & EPC
The RRG's only use was the conviction filter the backtest rejected, so the
dashboard chart, the weekly-tails step (rrg_tails.py), the static RRG plots
and the Pine script's RRG rows go. rrg.py keeps the quadrant/conviction
classification that research/conviction_study.py needs. The dashboard now
shows the Capital Goods sector as 'Capital Goods & EPC', matching the
professor's sheet; screening is unchanged. Brief updated.

Co-Authored-By: Claude Opus 5.5 <noreply@anthropic.com>
Claude-Session: https://claude.ai/code/session_018SrKZ3YP1T4SHJR1stpujJ
</commit_message>
<xml_diff>
--- a/docs/Defence_Brief_Capex_Portfolio.docx
+++ b/docs/Defence_Brief_Capex_Portfolio.docx
@@ -4061,7 +4061,7 @@
         <w:t xml:space="preserve">trailed</w:t>
       </w:r>
       <w:r>
-        <w:t xml:space="preserve"> the plain ranking in both periods (−2.7 pp per quarter in 2021-23, −1.1 pp in 2024-26; t = −0.8). A simpler 'still beating the Nifty over 3 months' filter did not help either. So we dropped it. The RRG is still shown on the dashboard as context.</w:t>
+        <w:t xml:space="preserve"> the plain ranking in both periods (−2.7 pp per quarter in 2021-23, −1.1 pp in 2024-26; t = −0.8). A simpler 'still beating the Nifty over 3 months' filter did not help either. So we dropped it, and since the RRG then drove nothing, we took it off the dashboard too.</w:t>
       </w:r>
     </w:p>
     <w:p>
@@ -7515,15 +7515,13 @@
         </w:tblBorders>
       </w:tblPr>
       <w:tblGrid>
-        <w:gridCol w:w="1441"/>
-        <w:gridCol w:w="721"/>
-        <w:gridCol w:w="721"/>
-        <w:gridCol w:w="811"/>
-        <w:gridCol w:w="721"/>
-        <w:gridCol w:w="1081"/>
-        <w:gridCol w:w="2162"/>
-        <w:gridCol w:w="901"/>
-        <w:gridCol w:w="1079"/>
+        <w:gridCol w:w="2112"/>
+        <w:gridCol w:w="1056"/>
+        <w:gridCol w:w="1056"/>
+        <w:gridCol w:w="1188"/>
+        <w:gridCol w:w="1056"/>
+        <w:gridCol w:w="1584"/>
+        <w:gridCol w:w="1586"/>
       </w:tblGrid>
       <w:tr>
         <w:trPr>
@@ -7531,7 +7529,7 @@
         </w:trPr>
         <w:tc>
           <w:tcPr>
-            <w:tcW w:type="dxa" w:w="1441"/>
+            <w:tcW w:type="dxa" w:w="2112"/>
             <w:shd w:fill="1F3864" w:color="auto" w:val="clear"/>
             <w:tcMar>
               <w:top w:type="dxa" w:w="60"/>
@@ -7559,7 +7557,7 @@
         </w:tc>
         <w:tc>
           <w:tcPr>
-            <w:tcW w:type="dxa" w:w="721"/>
+            <w:tcW w:type="dxa" w:w="1056"/>
             <w:shd w:fill="1F3864" w:color="auto" w:val="clear"/>
             <w:tcMar>
               <w:top w:type="dxa" w:w="60"/>
@@ -7587,7 +7585,7 @@
         </w:tc>
         <w:tc>
           <w:tcPr>
-            <w:tcW w:type="dxa" w:w="721"/>
+            <w:tcW w:type="dxa" w:w="1056"/>
             <w:shd w:fill="1F3864" w:color="auto" w:val="clear"/>
             <w:tcMar>
               <w:top w:type="dxa" w:w="60"/>
@@ -7615,7 +7613,7 @@
         </w:tc>
         <w:tc>
           <w:tcPr>
-            <w:tcW w:type="dxa" w:w="811"/>
+            <w:tcW w:type="dxa" w:w="1188"/>
             <w:shd w:fill="1F3864" w:color="auto" w:val="clear"/>
             <w:tcMar>
               <w:top w:type="dxa" w:w="60"/>
@@ -7643,7 +7641,7 @@
         </w:tc>
         <w:tc>
           <w:tcPr>
-            <w:tcW w:type="dxa" w:w="721"/>
+            <w:tcW w:type="dxa" w:w="1056"/>
             <w:shd w:fill="1F3864" w:color="auto" w:val="clear"/>
             <w:tcMar>
               <w:top w:type="dxa" w:w="60"/>
@@ -7671,7 +7669,7 @@
         </w:tc>
         <w:tc>
           <w:tcPr>
-            <w:tcW w:type="dxa" w:w="1081"/>
+            <w:tcW w:type="dxa" w:w="1584"/>
             <w:shd w:fill="1F3864" w:color="auto" w:val="clear"/>
             <w:tcMar>
               <w:top w:type="dxa" w:w="60"/>
@@ -7699,7 +7697,7 @@
         </w:tc>
         <w:tc>
           <w:tcPr>
-            <w:tcW w:type="dxa" w:w="2162"/>
+            <w:tcW w:type="dxa" w:w="1586"/>
             <w:shd w:fill="1F3864" w:color="auto" w:val="clear"/>
             <w:tcMar>
               <w:top w:type="dxa" w:w="60"/>
@@ -7721,62 +7719,6 @@
                 <w:sz w:val="18"/>
                 <w:szCs w:val="18"/>
               </w:rPr>
-              <w:t xml:space="preserve">RRG vs N500 / sector</w:t>
-            </w:r>
-          </w:p>
-        </w:tc>
-        <w:tc>
-          <w:tcPr>
-            <w:tcW w:type="dxa" w:w="901"/>
-            <w:shd w:fill="1F3864" w:color="auto" w:val="clear"/>
-            <w:tcMar>
-              <w:top w:type="dxa" w:w="60"/>
-              <w:left w:type="dxa" w:w="90"/>
-              <w:bottom w:type="dxa" w:w="60"/>
-              <w:right w:type="dxa" w:w="90"/>
-            </w:tcMar>
-          </w:tcPr>
-          <w:p>
-            <w:pPr>
-              <w:spacing w:after="0"/>
-              <w:jc w:val="left"/>
-            </w:pPr>
-            <w:r>
-              <w:rPr>
-                <w:b/>
-                <w:bCs/>
-                <w:color w:val="FFFFFF"/>
-                <w:sz w:val="18"/>
-                <w:szCs w:val="18"/>
-              </w:rPr>
-              <w:t xml:space="preserve">Conviction</w:t>
-            </w:r>
-          </w:p>
-        </w:tc>
-        <w:tc>
-          <w:tcPr>
-            <w:tcW w:type="dxa" w:w="1079"/>
-            <w:shd w:fill="1F3864" w:color="auto" w:val="clear"/>
-            <w:tcMar>
-              <w:top w:type="dxa" w:w="60"/>
-              <w:left w:type="dxa" w:w="90"/>
-              <w:bottom w:type="dxa" w:w="60"/>
-              <w:right w:type="dxa" w:w="90"/>
-            </w:tcMar>
-          </w:tcPr>
-          <w:p>
-            <w:pPr>
-              <w:spacing w:after="0"/>
-              <w:jc w:val="left"/>
-            </w:pPr>
-            <w:r>
-              <w:rPr>
-                <w:b/>
-                <w:bCs/>
-                <w:color w:val="FFFFFF"/>
-                <w:sz w:val="18"/>
-                <w:szCs w:val="18"/>
-              </w:rPr>
               <w:t xml:space="preserve">Q2 results</w:t>
             </w:r>
           </w:p>
@@ -7785,7 +7727,7 @@
       <w:tr>
         <w:tc>
           <w:tcPr>
-            <w:tcW w:type="dxa" w:w="1441"/>
+            <w:tcW w:type="dxa" w:w="2112"/>
             <w:tcMar>
               <w:top w:type="dxa" w:w="60"/>
               <w:left w:type="dxa" w:w="90"/>
@@ -7811,7 +7753,7 @@
         </w:tc>
         <w:tc>
           <w:tcPr>
-            <w:tcW w:type="dxa" w:w="721"/>
+            <w:tcW w:type="dxa" w:w="1056"/>
             <w:tcMar>
               <w:top w:type="dxa" w:w="60"/>
               <w:left w:type="dxa" w:w="90"/>
@@ -7837,7 +7779,7 @@
         </w:tc>
         <w:tc>
           <w:tcPr>
-            <w:tcW w:type="dxa" w:w="721"/>
+            <w:tcW w:type="dxa" w:w="1056"/>
             <w:tcMar>
               <w:top w:type="dxa" w:w="60"/>
               <w:left w:type="dxa" w:w="90"/>
@@ -7863,7 +7805,7 @@
         </w:tc>
         <w:tc>
           <w:tcPr>
-            <w:tcW w:type="dxa" w:w="811"/>
+            <w:tcW w:type="dxa" w:w="1188"/>
             <w:tcMar>
               <w:top w:type="dxa" w:w="60"/>
               <w:left w:type="dxa" w:w="90"/>
@@ -7889,7 +7831,7 @@
         </w:tc>
         <w:tc>
           <w:tcPr>
-            <w:tcW w:type="dxa" w:w="721"/>
+            <w:tcW w:type="dxa" w:w="1056"/>
             <w:tcMar>
               <w:top w:type="dxa" w:w="60"/>
               <w:left w:type="dxa" w:w="90"/>
@@ -7915,7 +7857,7 @@
         </w:tc>
         <w:tc>
           <w:tcPr>
-            <w:tcW w:type="dxa" w:w="1081"/>
+            <w:tcW w:type="dxa" w:w="1584"/>
             <w:tcMar>
               <w:top w:type="dxa" w:w="60"/>
               <w:left w:type="dxa" w:w="90"/>
@@ -7941,59 +7883,7 @@
         </w:tc>
         <w:tc>
           <w:tcPr>
-            <w:tcW w:type="dxa" w:w="2162"/>
-            <w:tcMar>
-              <w:top w:type="dxa" w:w="60"/>
-              <w:left w:type="dxa" w:w="90"/>
-              <w:bottom w:type="dxa" w:w="60"/>
-              <w:right w:type="dxa" w:w="90"/>
-            </w:tcMar>
-          </w:tcPr>
-          <w:p>
-            <w:pPr>
-              <w:spacing w:after="0"/>
-              <w:jc w:val="left"/>
-            </w:pPr>
-            <w:r>
-              <w:rPr>
-                <w:b w:val="false"/>
-                <w:bCs w:val="false"/>
-                <w:sz w:val="18"/>
-                <w:szCs w:val="18"/>
-              </w:rPr>
-              <w:t xml:space="preserve">LEADING / LEADING</w:t>
-            </w:r>
-          </w:p>
-        </w:tc>
-        <w:tc>
-          <w:tcPr>
-            <w:tcW w:type="dxa" w:w="901"/>
-            <w:tcMar>
-              <w:top w:type="dxa" w:w="60"/>
-              <w:left w:type="dxa" w:w="90"/>
-              <w:bottom w:type="dxa" w:w="60"/>
-              <w:right w:type="dxa" w:w="90"/>
-            </w:tcMar>
-          </w:tcPr>
-          <w:p>
-            <w:pPr>
-              <w:spacing w:after="0"/>
-              <w:jc w:val="left"/>
-            </w:pPr>
-            <w:r>
-              <w:rPr>
-                <w:b w:val="false"/>
-                <w:bCs w:val="false"/>
-                <w:sz w:val="18"/>
-                <w:szCs w:val="18"/>
-              </w:rPr>
-              <w:t xml:space="preserve">High</w:t>
-            </w:r>
-          </w:p>
-        </w:tc>
-        <w:tc>
-          <w:tcPr>
-            <w:tcW w:type="dxa" w:w="1079"/>
+            <w:tcW w:type="dxa" w:w="1586"/>
             <w:tcMar>
               <w:top w:type="dxa" w:w="60"/>
               <w:left w:type="dxa" w:w="90"/>
@@ -8021,7 +7911,7 @@
       <w:tr>
         <w:tc>
           <w:tcPr>
-            <w:tcW w:type="dxa" w:w="1441"/>
+            <w:tcW w:type="dxa" w:w="2112"/>
             <w:shd w:fill="F2F2F2" w:color="auto" w:val="clear"/>
             <w:tcMar>
               <w:top w:type="dxa" w:w="60"/>
@@ -8048,7 +7938,7 @@
         </w:tc>
         <w:tc>
           <w:tcPr>
-            <w:tcW w:type="dxa" w:w="721"/>
+            <w:tcW w:type="dxa" w:w="1056"/>
             <w:shd w:fill="F2F2F2" w:color="auto" w:val="clear"/>
             <w:tcMar>
               <w:top w:type="dxa" w:w="60"/>
@@ -8075,7 +7965,7 @@
         </w:tc>
         <w:tc>
           <w:tcPr>
-            <w:tcW w:type="dxa" w:w="721"/>
+            <w:tcW w:type="dxa" w:w="1056"/>
             <w:shd w:fill="F2F2F2" w:color="auto" w:val="clear"/>
             <w:tcMar>
               <w:top w:type="dxa" w:w="60"/>
@@ -8102,7 +7992,7 @@
         </w:tc>
         <w:tc>
           <w:tcPr>
-            <w:tcW w:type="dxa" w:w="811"/>
+            <w:tcW w:type="dxa" w:w="1188"/>
             <w:shd w:fill="F2F2F2" w:color="auto" w:val="clear"/>
             <w:tcMar>
               <w:top w:type="dxa" w:w="60"/>
@@ -8129,7 +8019,7 @@
         </w:tc>
         <w:tc>
           <w:tcPr>
-            <w:tcW w:type="dxa" w:w="721"/>
+            <w:tcW w:type="dxa" w:w="1056"/>
             <w:shd w:fill="F2F2F2" w:color="auto" w:val="clear"/>
             <w:tcMar>
               <w:top w:type="dxa" w:w="60"/>
@@ -8156,7 +8046,7 @@
         </w:tc>
         <w:tc>
           <w:tcPr>
-            <w:tcW w:type="dxa" w:w="1081"/>
+            <w:tcW w:type="dxa" w:w="1584"/>
             <w:shd w:fill="F2F2F2" w:color="auto" w:val="clear"/>
             <w:tcMar>
               <w:top w:type="dxa" w:w="60"/>
@@ -8183,61 +8073,7 @@
         </w:tc>
         <w:tc>
           <w:tcPr>
-            <w:tcW w:type="dxa" w:w="2162"/>
-            <w:shd w:fill="F2F2F2" w:color="auto" w:val="clear"/>
-            <w:tcMar>
-              <w:top w:type="dxa" w:w="60"/>
-              <w:left w:type="dxa" w:w="90"/>
-              <w:bottom w:type="dxa" w:w="60"/>
-              <w:right w:type="dxa" w:w="90"/>
-            </w:tcMar>
-          </w:tcPr>
-          <w:p>
-            <w:pPr>
-              <w:spacing w:after="0"/>
-              <w:jc w:val="left"/>
-            </w:pPr>
-            <w:r>
-              <w:rPr>
-                <w:b w:val="false"/>
-                <w:bCs w:val="false"/>
-                <w:sz w:val="18"/>
-                <w:szCs w:val="18"/>
-              </w:rPr>
-              <w:t xml:space="preserve">WEAKENING / LEADING</w:t>
-            </w:r>
-          </w:p>
-        </w:tc>
-        <w:tc>
-          <w:tcPr>
-            <w:tcW w:type="dxa" w:w="901"/>
-            <w:shd w:fill="F2F2F2" w:color="auto" w:val="clear"/>
-            <w:tcMar>
-              <w:top w:type="dxa" w:w="60"/>
-              <w:left w:type="dxa" w:w="90"/>
-              <w:bottom w:type="dxa" w:w="60"/>
-              <w:right w:type="dxa" w:w="90"/>
-            </w:tcMar>
-          </w:tcPr>
-          <w:p>
-            <w:pPr>
-              <w:spacing w:after="0"/>
-              <w:jc w:val="left"/>
-            </w:pPr>
-            <w:r>
-              <w:rPr>
-                <w:b w:val="false"/>
-                <w:bCs w:val="false"/>
-                <w:sz w:val="18"/>
-                <w:szCs w:val="18"/>
-              </w:rPr>
-              <w:t xml:space="preserve">Moderate</w:t>
-            </w:r>
-          </w:p>
-        </w:tc>
-        <w:tc>
-          <w:tcPr>
-            <w:tcW w:type="dxa" w:w="1079"/>
+            <w:tcW w:type="dxa" w:w="1586"/>
             <w:shd w:fill="F2F2F2" w:color="auto" w:val="clear"/>
             <w:tcMar>
               <w:top w:type="dxa" w:w="60"/>
@@ -8266,7 +8102,7 @@
       <w:tr>
         <w:tc>
           <w:tcPr>
-            <w:tcW w:type="dxa" w:w="1441"/>
+            <w:tcW w:type="dxa" w:w="2112"/>
             <w:tcMar>
               <w:top w:type="dxa" w:w="60"/>
               <w:left w:type="dxa" w:w="90"/>
@@ -8292,7 +8128,7 @@
         </w:tc>
         <w:tc>
           <w:tcPr>
-            <w:tcW w:type="dxa" w:w="721"/>
+            <w:tcW w:type="dxa" w:w="1056"/>
             <w:tcMar>
               <w:top w:type="dxa" w:w="60"/>
               <w:left w:type="dxa" w:w="90"/>
@@ -8318,7 +8154,7 @@
         </w:tc>
         <w:tc>
           <w:tcPr>
-            <w:tcW w:type="dxa" w:w="721"/>
+            <w:tcW w:type="dxa" w:w="1056"/>
             <w:tcMar>
               <w:top w:type="dxa" w:w="60"/>
               <w:left w:type="dxa" w:w="90"/>
@@ -8344,7 +8180,7 @@
         </w:tc>
         <w:tc>
           <w:tcPr>
-            <w:tcW w:type="dxa" w:w="811"/>
+            <w:tcW w:type="dxa" w:w="1188"/>
             <w:tcMar>
               <w:top w:type="dxa" w:w="60"/>
               <w:left w:type="dxa" w:w="90"/>
@@ -8370,7 +8206,7 @@
         </w:tc>
         <w:tc>
           <w:tcPr>
-            <w:tcW w:type="dxa" w:w="721"/>
+            <w:tcW w:type="dxa" w:w="1056"/>
             <w:tcMar>
               <w:top w:type="dxa" w:w="60"/>
               <w:left w:type="dxa" w:w="90"/>
@@ -8396,7 +8232,7 @@
         </w:tc>
         <w:tc>
           <w:tcPr>
-            <w:tcW w:type="dxa" w:w="1081"/>
+            <w:tcW w:type="dxa" w:w="1584"/>
             <w:tcMar>
               <w:top w:type="dxa" w:w="60"/>
               <w:left w:type="dxa" w:w="90"/>
@@ -8422,59 +8258,7 @@
         </w:tc>
         <w:tc>
           <w:tcPr>
-            <w:tcW w:type="dxa" w:w="2162"/>
-            <w:tcMar>
-              <w:top w:type="dxa" w:w="60"/>
-              <w:left w:type="dxa" w:w="90"/>
-              <w:bottom w:type="dxa" w:w="60"/>
-              <w:right w:type="dxa" w:w="90"/>
-            </w:tcMar>
-          </w:tcPr>
-          <w:p>
-            <w:pPr>
-              <w:spacing w:after="0"/>
-              <w:jc w:val="left"/>
-            </w:pPr>
-            <w:r>
-              <w:rPr>
-                <w:b w:val="false"/>
-                <w:bCs w:val="false"/>
-                <w:sz w:val="18"/>
-                <w:szCs w:val="18"/>
-              </w:rPr>
-              <w:t xml:space="preserve">WEAKENING / LEADING</w:t>
-            </w:r>
-          </w:p>
-        </w:tc>
-        <w:tc>
-          <w:tcPr>
-            <w:tcW w:type="dxa" w:w="901"/>
-            <w:tcMar>
-              <w:top w:type="dxa" w:w="60"/>
-              <w:left w:type="dxa" w:w="90"/>
-              <w:bottom w:type="dxa" w:w="60"/>
-              <w:right w:type="dxa" w:w="90"/>
-            </w:tcMar>
-          </w:tcPr>
-          <w:p>
-            <w:pPr>
-              <w:spacing w:after="0"/>
-              <w:jc w:val="left"/>
-            </w:pPr>
-            <w:r>
-              <w:rPr>
-                <w:b w:val="false"/>
-                <w:bCs w:val="false"/>
-                <w:sz w:val="18"/>
-                <w:szCs w:val="18"/>
-              </w:rPr>
-              <w:t xml:space="preserve">Moderate</w:t>
-            </w:r>
-          </w:p>
-        </w:tc>
-        <w:tc>
-          <w:tcPr>
-            <w:tcW w:type="dxa" w:w="1079"/>
+            <w:tcW w:type="dxa" w:w="1586"/>
             <w:tcMar>
               <w:top w:type="dxa" w:w="60"/>
               <w:left w:type="dxa" w:w="90"/>
@@ -8502,7 +8286,7 @@
       <w:tr>
         <w:tc>
           <w:tcPr>
-            <w:tcW w:type="dxa" w:w="1441"/>
+            <w:tcW w:type="dxa" w:w="2112"/>
             <w:shd w:fill="F2F2F2" w:color="auto" w:val="clear"/>
             <w:tcMar>
               <w:top w:type="dxa" w:w="60"/>
@@ -8529,7 +8313,7 @@
         </w:tc>
         <w:tc>
           <w:tcPr>
-            <w:tcW w:type="dxa" w:w="721"/>
+            <w:tcW w:type="dxa" w:w="1056"/>
             <w:shd w:fill="F2F2F2" w:color="auto" w:val="clear"/>
             <w:tcMar>
               <w:top w:type="dxa" w:w="60"/>
@@ -8556,7 +8340,7 @@
         </w:tc>
         <w:tc>
           <w:tcPr>
-            <w:tcW w:type="dxa" w:w="721"/>
+            <w:tcW w:type="dxa" w:w="1056"/>
             <w:shd w:fill="F2F2F2" w:color="auto" w:val="clear"/>
             <w:tcMar>
               <w:top w:type="dxa" w:w="60"/>
@@ -8583,7 +8367,7 @@
         </w:tc>
         <w:tc>
           <w:tcPr>
-            <w:tcW w:type="dxa" w:w="811"/>
+            <w:tcW w:type="dxa" w:w="1188"/>
             <w:shd w:fill="F2F2F2" w:color="auto" w:val="clear"/>
             <w:tcMar>
               <w:top w:type="dxa" w:w="60"/>
@@ -8610,7 +8394,7 @@
         </w:tc>
         <w:tc>
           <w:tcPr>
-            <w:tcW w:type="dxa" w:w="721"/>
+            <w:tcW w:type="dxa" w:w="1056"/>
             <w:shd w:fill="F2F2F2" w:color="auto" w:val="clear"/>
             <w:tcMar>
               <w:top w:type="dxa" w:w="60"/>
@@ -8637,7 +8421,7 @@
         </w:tc>
         <w:tc>
           <w:tcPr>
-            <w:tcW w:type="dxa" w:w="1081"/>
+            <w:tcW w:type="dxa" w:w="1584"/>
             <w:shd w:fill="F2F2F2" w:color="auto" w:val="clear"/>
             <w:tcMar>
               <w:top w:type="dxa" w:w="60"/>
@@ -8664,61 +8448,7 @@
         </w:tc>
         <w:tc>
           <w:tcPr>
-            <w:tcW w:type="dxa" w:w="2162"/>
-            <w:shd w:fill="F2F2F2" w:color="auto" w:val="clear"/>
-            <w:tcMar>
-              <w:top w:type="dxa" w:w="60"/>
-              <w:left w:type="dxa" w:w="90"/>
-              <w:bottom w:type="dxa" w:w="60"/>
-              <w:right w:type="dxa" w:w="90"/>
-            </w:tcMar>
-          </w:tcPr>
-          <w:p>
-            <w:pPr>
-              <w:spacing w:after="0"/>
-              <w:jc w:val="left"/>
-            </w:pPr>
-            <w:r>
-              <w:rPr>
-                <w:b w:val="false"/>
-                <w:bCs w:val="false"/>
-                <w:sz w:val="18"/>
-                <w:szCs w:val="18"/>
-              </w:rPr>
-              <w:t xml:space="preserve">WEAKENING / WEAKENING</w:t>
-            </w:r>
-          </w:p>
-        </w:tc>
-        <w:tc>
-          <w:tcPr>
-            <w:tcW w:type="dxa" w:w="901"/>
-            <w:shd w:fill="F2F2F2" w:color="auto" w:val="clear"/>
-            <w:tcMar>
-              <w:top w:type="dxa" w:w="60"/>
-              <w:left w:type="dxa" w:w="90"/>
-              <w:bottom w:type="dxa" w:w="60"/>
-              <w:right w:type="dxa" w:w="90"/>
-            </w:tcMar>
-          </w:tcPr>
-          <w:p>
-            <w:pPr>
-              <w:spacing w:after="0"/>
-              <w:jc w:val="left"/>
-            </w:pPr>
-            <w:r>
-              <w:rPr>
-                <w:b w:val="false"/>
-                <w:bCs w:val="false"/>
-                <w:sz w:val="18"/>
-                <w:szCs w:val="18"/>
-              </w:rPr>
-              <w:t xml:space="preserve">Low</w:t>
-            </w:r>
-          </w:p>
-        </w:tc>
-        <w:tc>
-          <w:tcPr>
-            <w:tcW w:type="dxa" w:w="1079"/>
+            <w:tcW w:type="dxa" w:w="1586"/>
             <w:shd w:fill="F2F2F2" w:color="auto" w:val="clear"/>
             <w:tcMar>
               <w:top w:type="dxa" w:w="60"/>
@@ -8747,7 +8477,7 @@
       <w:tr>
         <w:tc>
           <w:tcPr>
-            <w:tcW w:type="dxa" w:w="1441"/>
+            <w:tcW w:type="dxa" w:w="2112"/>
             <w:tcMar>
               <w:top w:type="dxa" w:w="60"/>
               <w:left w:type="dxa" w:w="90"/>
@@ -8773,7 +8503,7 @@
         </w:tc>
         <w:tc>
           <w:tcPr>
-            <w:tcW w:type="dxa" w:w="721"/>
+            <w:tcW w:type="dxa" w:w="1056"/>
             <w:tcMar>
               <w:top w:type="dxa" w:w="60"/>
               <w:left w:type="dxa" w:w="90"/>
@@ -8799,7 +8529,7 @@
         </w:tc>
         <w:tc>
           <w:tcPr>
-            <w:tcW w:type="dxa" w:w="721"/>
+            <w:tcW w:type="dxa" w:w="1056"/>
             <w:tcMar>
               <w:top w:type="dxa" w:w="60"/>
               <w:left w:type="dxa" w:w="90"/>
@@ -8825,7 +8555,7 @@
         </w:tc>
         <w:tc>
           <w:tcPr>
-            <w:tcW w:type="dxa" w:w="811"/>
+            <w:tcW w:type="dxa" w:w="1188"/>
             <w:tcMar>
               <w:top w:type="dxa" w:w="60"/>
               <w:left w:type="dxa" w:w="90"/>
@@ -8851,7 +8581,7 @@
         </w:tc>
         <w:tc>
           <w:tcPr>
-            <w:tcW w:type="dxa" w:w="721"/>
+            <w:tcW w:type="dxa" w:w="1056"/>
             <w:tcMar>
               <w:top w:type="dxa" w:w="60"/>
               <w:left w:type="dxa" w:w="90"/>
@@ -8877,7 +8607,7 @@
         </w:tc>
         <w:tc>
           <w:tcPr>
-            <w:tcW w:type="dxa" w:w="1081"/>
+            <w:tcW w:type="dxa" w:w="1584"/>
             <w:tcMar>
               <w:top w:type="dxa" w:w="60"/>
               <w:left w:type="dxa" w:w="90"/>
@@ -8903,59 +8633,7 @@
         </w:tc>
         <w:tc>
           <w:tcPr>
-            <w:tcW w:type="dxa" w:w="2162"/>
-            <w:tcMar>
-              <w:top w:type="dxa" w:w="60"/>
-              <w:left w:type="dxa" w:w="90"/>
-              <w:bottom w:type="dxa" w:w="60"/>
-              <w:right w:type="dxa" w:w="90"/>
-            </w:tcMar>
-          </w:tcPr>
-          <w:p>
-            <w:pPr>
-              <w:spacing w:after="0"/>
-              <w:jc w:val="left"/>
-            </w:pPr>
-            <w:r>
-              <w:rPr>
-                <w:b w:val="false"/>
-                <w:bCs w:val="false"/>
-                <w:sz w:val="18"/>
-                <w:szCs w:val="18"/>
-              </w:rPr>
-              <w:t xml:space="preserve">WEAKENING / WEAKENING</w:t>
-            </w:r>
-          </w:p>
-        </w:tc>
-        <w:tc>
-          <w:tcPr>
-            <w:tcW w:type="dxa" w:w="901"/>
-            <w:tcMar>
-              <w:top w:type="dxa" w:w="60"/>
-              <w:left w:type="dxa" w:w="90"/>
-              <w:bottom w:type="dxa" w:w="60"/>
-              <w:right w:type="dxa" w:w="90"/>
-            </w:tcMar>
-          </w:tcPr>
-          <w:p>
-            <w:pPr>
-              <w:spacing w:after="0"/>
-              <w:jc w:val="left"/>
-            </w:pPr>
-            <w:r>
-              <w:rPr>
-                <w:b w:val="false"/>
-                <w:bCs w:val="false"/>
-                <w:sz w:val="18"/>
-                <w:szCs w:val="18"/>
-              </w:rPr>
-              <w:t xml:space="preserve">Low</w:t>
-            </w:r>
-          </w:p>
-        </w:tc>
-        <w:tc>
-          <w:tcPr>
-            <w:tcW w:type="dxa" w:w="1079"/>
+            <w:tcW w:type="dxa" w:w="1586"/>
             <w:tcMar>
               <w:top w:type="dxa" w:w="60"/>
               <w:left w:type="dxa" w:w="90"/>
@@ -8983,7 +8661,7 @@
       <w:tr>
         <w:tc>
           <w:tcPr>
-            <w:tcW w:type="dxa" w:w="1441"/>
+            <w:tcW w:type="dxa" w:w="2112"/>
             <w:shd w:fill="F2F2F2" w:color="auto" w:val="clear"/>
             <w:tcMar>
               <w:top w:type="dxa" w:w="60"/>
@@ -9010,7 +8688,7 @@
         </w:tc>
         <w:tc>
           <w:tcPr>
-            <w:tcW w:type="dxa" w:w="721"/>
+            <w:tcW w:type="dxa" w:w="1056"/>
             <w:shd w:fill="F2F2F2" w:color="auto" w:val="clear"/>
             <w:tcMar>
               <w:top w:type="dxa" w:w="60"/>
@@ -9037,7 +8715,7 @@
         </w:tc>
         <w:tc>
           <w:tcPr>
-            <w:tcW w:type="dxa" w:w="721"/>
+            <w:tcW w:type="dxa" w:w="1056"/>
             <w:shd w:fill="F2F2F2" w:color="auto" w:val="clear"/>
             <w:tcMar>
               <w:top w:type="dxa" w:w="60"/>
@@ -9064,7 +8742,7 @@
         </w:tc>
         <w:tc>
           <w:tcPr>
-            <w:tcW w:type="dxa" w:w="811"/>
+            <w:tcW w:type="dxa" w:w="1188"/>
             <w:shd w:fill="F2F2F2" w:color="auto" w:val="clear"/>
             <w:tcMar>
               <w:top w:type="dxa" w:w="60"/>
@@ -9091,7 +8769,7 @@
         </w:tc>
         <w:tc>
           <w:tcPr>
-            <w:tcW w:type="dxa" w:w="721"/>
+            <w:tcW w:type="dxa" w:w="1056"/>
             <w:shd w:fill="F2F2F2" w:color="auto" w:val="clear"/>
             <w:tcMar>
               <w:top w:type="dxa" w:w="60"/>
@@ -9118,7 +8796,7 @@
         </w:tc>
         <w:tc>
           <w:tcPr>
-            <w:tcW w:type="dxa" w:w="1081"/>
+            <w:tcW w:type="dxa" w:w="1584"/>
             <w:shd w:fill="F2F2F2" w:color="auto" w:val="clear"/>
             <w:tcMar>
               <w:top w:type="dxa" w:w="60"/>
@@ -9145,61 +8823,7 @@
         </w:tc>
         <w:tc>
           <w:tcPr>
-            <w:tcW w:type="dxa" w:w="2162"/>
-            <w:shd w:fill="F2F2F2" w:color="auto" w:val="clear"/>
-            <w:tcMar>
-              <w:top w:type="dxa" w:w="60"/>
-              <w:left w:type="dxa" w:w="90"/>
-              <w:bottom w:type="dxa" w:w="60"/>
-              <w:right w:type="dxa" w:w="90"/>
-            </w:tcMar>
-          </w:tcPr>
-          <w:p>
-            <w:pPr>
-              <w:spacing w:after="0"/>
-              <w:jc w:val="left"/>
-            </w:pPr>
-            <w:r>
-              <w:rPr>
-                <w:b w:val="false"/>
-                <w:bCs w:val="false"/>
-                <w:sz w:val="18"/>
-                <w:szCs w:val="18"/>
-              </w:rPr>
-              <w:t xml:space="preserve">WEAKENING / WEAKENING</w:t>
-            </w:r>
-          </w:p>
-        </w:tc>
-        <w:tc>
-          <w:tcPr>
-            <w:tcW w:type="dxa" w:w="901"/>
-            <w:shd w:fill="F2F2F2" w:color="auto" w:val="clear"/>
-            <w:tcMar>
-              <w:top w:type="dxa" w:w="60"/>
-              <w:left w:type="dxa" w:w="90"/>
-              <w:bottom w:type="dxa" w:w="60"/>
-              <w:right w:type="dxa" w:w="90"/>
-            </w:tcMar>
-          </w:tcPr>
-          <w:p>
-            <w:pPr>
-              <w:spacing w:after="0"/>
-              <w:jc w:val="left"/>
-            </w:pPr>
-            <w:r>
-              <w:rPr>
-                <w:b w:val="false"/>
-                <w:bCs w:val="false"/>
-                <w:sz w:val="18"/>
-                <w:szCs w:val="18"/>
-              </w:rPr>
-              <w:t xml:space="preserve">Low</w:t>
-            </w:r>
-          </w:p>
-        </w:tc>
-        <w:tc>
-          <w:tcPr>
-            <w:tcW w:type="dxa" w:w="1079"/>
+            <w:tcW w:type="dxa" w:w="1586"/>
             <w:shd w:fill="F2F2F2" w:color="auto" w:val="clear"/>
             <w:tcMar>
               <w:top w:type="dxa" w:w="60"/>
@@ -9228,7 +8852,7 @@
       <w:tr>
         <w:tc>
           <w:tcPr>
-            <w:tcW w:type="dxa" w:w="1441"/>
+            <w:tcW w:type="dxa" w:w="2112"/>
             <w:tcMar>
               <w:top w:type="dxa" w:w="60"/>
               <w:left w:type="dxa" w:w="90"/>
@@ -9254,7 +8878,7 @@
         </w:tc>
         <w:tc>
           <w:tcPr>
-            <w:tcW w:type="dxa" w:w="721"/>
+            <w:tcW w:type="dxa" w:w="1056"/>
             <w:tcMar>
               <w:top w:type="dxa" w:w="60"/>
               <w:left w:type="dxa" w:w="90"/>
@@ -9280,7 +8904,7 @@
         </w:tc>
         <w:tc>
           <w:tcPr>
-            <w:tcW w:type="dxa" w:w="721"/>
+            <w:tcW w:type="dxa" w:w="1056"/>
             <w:tcMar>
               <w:top w:type="dxa" w:w="60"/>
               <w:left w:type="dxa" w:w="90"/>
@@ -9306,7 +8930,7 @@
         </w:tc>
         <w:tc>
           <w:tcPr>
-            <w:tcW w:type="dxa" w:w="811"/>
+            <w:tcW w:type="dxa" w:w="1188"/>
             <w:tcMar>
               <w:top w:type="dxa" w:w="60"/>
               <w:left w:type="dxa" w:w="90"/>
@@ -9332,7 +8956,7 @@
         </w:tc>
         <w:tc>
           <w:tcPr>
-            <w:tcW w:type="dxa" w:w="721"/>
+            <w:tcW w:type="dxa" w:w="1056"/>
             <w:tcMar>
               <w:top w:type="dxa" w:w="60"/>
               <w:left w:type="dxa" w:w="90"/>
@@ -9358,7 +8982,7 @@
         </w:tc>
         <w:tc>
           <w:tcPr>
-            <w:tcW w:type="dxa" w:w="1081"/>
+            <w:tcW w:type="dxa" w:w="1584"/>
             <w:tcMar>
               <w:top w:type="dxa" w:w="60"/>
               <w:left w:type="dxa" w:w="90"/>
@@ -9384,59 +9008,7 @@
         </w:tc>
         <w:tc>
           <w:tcPr>
-            <w:tcW w:type="dxa" w:w="2162"/>
-            <w:tcMar>
-              <w:top w:type="dxa" w:w="60"/>
-              <w:left w:type="dxa" w:w="90"/>
-              <w:bottom w:type="dxa" w:w="60"/>
-              <w:right w:type="dxa" w:w="90"/>
-            </w:tcMar>
-          </w:tcPr>
-          <w:p>
-            <w:pPr>
-              <w:spacing w:after="0"/>
-              <w:jc w:val="left"/>
-            </w:pPr>
-            <w:r>
-              <w:rPr>
-                <w:b w:val="false"/>
-                <w:bCs w:val="false"/>
-                <w:sz w:val="18"/>
-                <w:szCs w:val="18"/>
-              </w:rPr>
-              <w:t xml:space="preserve">WEAKENING / WEAKENING</w:t>
-            </w:r>
-          </w:p>
-        </w:tc>
-        <w:tc>
-          <w:tcPr>
-            <w:tcW w:type="dxa" w:w="901"/>
-            <w:tcMar>
-              <w:top w:type="dxa" w:w="60"/>
-              <w:left w:type="dxa" w:w="90"/>
-              <w:bottom w:type="dxa" w:w="60"/>
-              <w:right w:type="dxa" w:w="90"/>
-            </w:tcMar>
-          </w:tcPr>
-          <w:p>
-            <w:pPr>
-              <w:spacing w:after="0"/>
-              <w:jc w:val="left"/>
-            </w:pPr>
-            <w:r>
-              <w:rPr>
-                <w:b w:val="false"/>
-                <w:bCs w:val="false"/>
-                <w:sz w:val="18"/>
-                <w:szCs w:val="18"/>
-              </w:rPr>
-              <w:t xml:space="preserve">Low</w:t>
-            </w:r>
-          </w:p>
-        </w:tc>
-        <w:tc>
-          <w:tcPr>
-            <w:tcW w:type="dxa" w:w="1079"/>
+            <w:tcW w:type="dxa" w:w="1586"/>
             <w:tcMar>
               <w:top w:type="dxa" w:w="60"/>
               <w:left w:type="dxa" w:w="90"/>
@@ -9464,7 +9036,7 @@
       <w:tr>
         <w:tc>
           <w:tcPr>
-            <w:tcW w:type="dxa" w:w="1441"/>
+            <w:tcW w:type="dxa" w:w="2112"/>
             <w:shd w:fill="F2F2F2" w:color="auto" w:val="clear"/>
             <w:tcMar>
               <w:top w:type="dxa" w:w="60"/>
@@ -9491,7 +9063,7 @@
         </w:tc>
         <w:tc>
           <w:tcPr>
-            <w:tcW w:type="dxa" w:w="721"/>
+            <w:tcW w:type="dxa" w:w="1056"/>
             <w:shd w:fill="F2F2F2" w:color="auto" w:val="clear"/>
             <w:tcMar>
               <w:top w:type="dxa" w:w="60"/>
@@ -9518,7 +9090,7 @@
         </w:tc>
         <w:tc>
           <w:tcPr>
-            <w:tcW w:type="dxa" w:w="721"/>
+            <w:tcW w:type="dxa" w:w="1056"/>
             <w:shd w:fill="F2F2F2" w:color="auto" w:val="clear"/>
             <w:tcMar>
               <w:top w:type="dxa" w:w="60"/>
@@ -9545,7 +9117,7 @@
         </w:tc>
         <w:tc>
           <w:tcPr>
-            <w:tcW w:type="dxa" w:w="811"/>
+            <w:tcW w:type="dxa" w:w="1188"/>
             <w:shd w:fill="F2F2F2" w:color="auto" w:val="clear"/>
             <w:tcMar>
               <w:top w:type="dxa" w:w="60"/>
@@ -9572,7 +9144,7 @@
         </w:tc>
         <w:tc>
           <w:tcPr>
-            <w:tcW w:type="dxa" w:w="721"/>
+            <w:tcW w:type="dxa" w:w="1056"/>
             <w:shd w:fill="F2F2F2" w:color="auto" w:val="clear"/>
             <w:tcMar>
               <w:top w:type="dxa" w:w="60"/>
@@ -9599,7 +9171,7 @@
         </w:tc>
         <w:tc>
           <w:tcPr>
-            <w:tcW w:type="dxa" w:w="1081"/>
+            <w:tcW w:type="dxa" w:w="1584"/>
             <w:shd w:fill="F2F2F2" w:color="auto" w:val="clear"/>
             <w:tcMar>
               <w:top w:type="dxa" w:w="60"/>
@@ -9626,61 +9198,7 @@
         </w:tc>
         <w:tc>
           <w:tcPr>
-            <w:tcW w:type="dxa" w:w="2162"/>
-            <w:shd w:fill="F2F2F2" w:color="auto" w:val="clear"/>
-            <w:tcMar>
-              <w:top w:type="dxa" w:w="60"/>
-              <w:left w:type="dxa" w:w="90"/>
-              <w:bottom w:type="dxa" w:w="60"/>
-              <w:right w:type="dxa" w:w="90"/>
-            </w:tcMar>
-          </w:tcPr>
-          <w:p>
-            <w:pPr>
-              <w:spacing w:after="0"/>
-              <w:jc w:val="left"/>
-            </w:pPr>
-            <w:r>
-              <w:rPr>
-                <w:b w:val="false"/>
-                <w:bCs w:val="false"/>
-                <w:sz w:val="18"/>
-                <w:szCs w:val="18"/>
-              </w:rPr>
-              <w:t xml:space="preserve">LEADING / LEADING</w:t>
-            </w:r>
-          </w:p>
-        </w:tc>
-        <w:tc>
-          <w:tcPr>
-            <w:tcW w:type="dxa" w:w="901"/>
-            <w:shd w:fill="F2F2F2" w:color="auto" w:val="clear"/>
-            <w:tcMar>
-              <w:top w:type="dxa" w:w="60"/>
-              <w:left w:type="dxa" w:w="90"/>
-              <w:bottom w:type="dxa" w:w="60"/>
-              <w:right w:type="dxa" w:w="90"/>
-            </w:tcMar>
-          </w:tcPr>
-          <w:p>
-            <w:pPr>
-              <w:spacing w:after="0"/>
-              <w:jc w:val="left"/>
-            </w:pPr>
-            <w:r>
-              <w:rPr>
-                <w:b w:val="false"/>
-                <w:bCs w:val="false"/>
-                <w:sz w:val="18"/>
-                <w:szCs w:val="18"/>
-              </w:rPr>
-              <w:t xml:space="preserve">High</w:t>
-            </w:r>
-          </w:p>
-        </w:tc>
-        <w:tc>
-          <w:tcPr>
-            <w:tcW w:type="dxa" w:w="1079"/>
+            <w:tcW w:type="dxa" w:w="1586"/>
             <w:shd w:fill="F2F2F2" w:color="auto" w:val="clear"/>
             <w:tcMar>
               <w:top w:type="dxa" w:w="60"/>
@@ -9725,14 +9243,13 @@
         </w:tblBorders>
       </w:tblPr>
       <w:tblGrid>
-        <w:gridCol w:w="2017"/>
-        <w:gridCol w:w="784"/>
-        <w:gridCol w:w="1121"/>
-        <w:gridCol w:w="1121"/>
-        <w:gridCol w:w="1121"/>
-        <w:gridCol w:w="1345"/>
-        <w:gridCol w:w="897"/>
-        <w:gridCol w:w="1232"/>
+        <w:gridCol w:w="2313"/>
+        <w:gridCol w:w="900"/>
+        <w:gridCol w:w="1285"/>
+        <w:gridCol w:w="1285"/>
+        <w:gridCol w:w="1285"/>
+        <w:gridCol w:w="1542"/>
+        <w:gridCol w:w="1028"/>
       </w:tblGrid>
       <w:tr>
         <w:trPr>
@@ -9740,7 +9257,7 @@
         </w:trPr>
         <w:tc>
           <w:tcPr>
-            <w:tcW w:type="dxa" w:w="2017"/>
+            <w:tcW w:type="dxa" w:w="2313"/>
             <w:shd w:fill="1F3864" w:color="auto" w:val="clear"/>
             <w:tcMar>
               <w:top w:type="dxa" w:w="60"/>
@@ -9768,7 +9285,7 @@
         </w:tc>
         <w:tc>
           <w:tcPr>
-            <w:tcW w:type="dxa" w:w="784"/>
+            <w:tcW w:type="dxa" w:w="900"/>
             <w:shd w:fill="1F3864" w:color="auto" w:val="clear"/>
             <w:tcMar>
               <w:top w:type="dxa" w:w="60"/>
@@ -9796,7 +9313,7 @@
         </w:tc>
         <w:tc>
           <w:tcPr>
-            <w:tcW w:type="dxa" w:w="1121"/>
+            <w:tcW w:type="dxa" w:w="1285"/>
             <w:shd w:fill="1F3864" w:color="auto" w:val="clear"/>
             <w:tcMar>
               <w:top w:type="dxa" w:w="60"/>
@@ -9824,7 +9341,7 @@
         </w:tc>
         <w:tc>
           <w:tcPr>
-            <w:tcW w:type="dxa" w:w="1121"/>
+            <w:tcW w:type="dxa" w:w="1285"/>
             <w:shd w:fill="1F3864" w:color="auto" w:val="clear"/>
             <w:tcMar>
               <w:top w:type="dxa" w:w="60"/>
@@ -9852,7 +9369,7 @@
         </w:tc>
         <w:tc>
           <w:tcPr>
-            <w:tcW w:type="dxa" w:w="1121"/>
+            <w:tcW w:type="dxa" w:w="1285"/>
             <w:shd w:fill="1F3864" w:color="auto" w:val="clear"/>
             <w:tcMar>
               <w:top w:type="dxa" w:w="60"/>
@@ -9880,7 +9397,7 @@
         </w:tc>
         <w:tc>
           <w:tcPr>
-            <w:tcW w:type="dxa" w:w="1345"/>
+            <w:tcW w:type="dxa" w:w="1542"/>
             <w:shd w:fill="1F3864" w:color="auto" w:val="clear"/>
             <w:tcMar>
               <w:top w:type="dxa" w:w="60"/>
@@ -9908,7 +9425,7 @@
         </w:tc>
         <w:tc>
           <w:tcPr>
-            <w:tcW w:type="dxa" w:w="897"/>
+            <w:tcW w:type="dxa" w:w="1028"/>
             <w:shd w:fill="1F3864" w:color="auto" w:val="clear"/>
             <w:tcMar>
               <w:top w:type="dxa" w:w="60"/>
@@ -9934,39 +9451,11 @@
             </w:r>
           </w:p>
         </w:tc>
-        <w:tc>
-          <w:tcPr>
-            <w:tcW w:type="dxa" w:w="1232"/>
-            <w:shd w:fill="1F3864" w:color="auto" w:val="clear"/>
-            <w:tcMar>
-              <w:top w:type="dxa" w:w="60"/>
-              <w:left w:type="dxa" w:w="90"/>
-              <w:bottom w:type="dxa" w:w="60"/>
-              <w:right w:type="dxa" w:w="90"/>
-            </w:tcMar>
-          </w:tcPr>
-          <w:p>
-            <w:pPr>
-              <w:spacing w:after="0"/>
-              <w:jc w:val="left"/>
-            </w:pPr>
-            <w:r>
-              <w:rPr>
-                <w:b/>
-                <w:bCs/>
-                <w:color w:val="FFFFFF"/>
-                <w:sz w:val="18"/>
-                <w:szCs w:val="18"/>
-              </w:rPr>
-              <w:t xml:space="preserve">Conviction</w:t>
-            </w:r>
-          </w:p>
-        </w:tc>
       </w:tr>
       <w:tr>
         <w:tc>
           <w:tcPr>
-            <w:tcW w:type="dxa" w:w="2017"/>
+            <w:tcW w:type="dxa" w:w="2313"/>
             <w:tcMar>
               <w:top w:type="dxa" w:w="60"/>
               <w:left w:type="dxa" w:w="90"/>
@@ -9992,7 +9481,7 @@
         </w:tc>
         <w:tc>
           <w:tcPr>
-            <w:tcW w:type="dxa" w:w="784"/>
+            <w:tcW w:type="dxa" w:w="900"/>
             <w:tcMar>
               <w:top w:type="dxa" w:w="60"/>
               <w:left w:type="dxa" w:w="90"/>
@@ -10018,7 +9507,7 @@
         </w:tc>
         <w:tc>
           <w:tcPr>
-            <w:tcW w:type="dxa" w:w="1121"/>
+            <w:tcW w:type="dxa" w:w="1285"/>
             <w:tcMar>
               <w:top w:type="dxa" w:w="60"/>
               <w:left w:type="dxa" w:w="90"/>
@@ -10044,7 +9533,7 @@
         </w:tc>
         <w:tc>
           <w:tcPr>
-            <w:tcW w:type="dxa" w:w="1121"/>
+            <w:tcW w:type="dxa" w:w="1285"/>
             <w:tcMar>
               <w:top w:type="dxa" w:w="60"/>
               <w:left w:type="dxa" w:w="90"/>
@@ -10070,7 +9559,7 @@
         </w:tc>
         <w:tc>
           <w:tcPr>
-            <w:tcW w:type="dxa" w:w="1121"/>
+            <w:tcW w:type="dxa" w:w="1285"/>
             <w:tcMar>
               <w:top w:type="dxa" w:w="60"/>
               <w:left w:type="dxa" w:w="90"/>
@@ -10096,7 +9585,7 @@
         </w:tc>
         <w:tc>
           <w:tcPr>
-            <w:tcW w:type="dxa" w:w="1345"/>
+            <w:tcW w:type="dxa" w:w="1542"/>
             <w:tcMar>
               <w:top w:type="dxa" w:w="60"/>
               <w:left w:type="dxa" w:w="90"/>
@@ -10122,7 +9611,7 @@
         </w:tc>
         <w:tc>
           <w:tcPr>
-            <w:tcW w:type="dxa" w:w="897"/>
+            <w:tcW w:type="dxa" w:w="1028"/>
             <w:tcMar>
               <w:top w:type="dxa" w:w="60"/>
               <w:left w:type="dxa" w:w="90"/>
@@ -10143,32 +9632,6 @@
                 <w:szCs w:val="18"/>
               </w:rPr>
               <w:t xml:space="preserve">88</w:t>
-            </w:r>
-          </w:p>
-        </w:tc>
-        <w:tc>
-          <w:tcPr>
-            <w:tcW w:type="dxa" w:w="1232"/>
-            <w:tcMar>
-              <w:top w:type="dxa" w:w="60"/>
-              <w:left w:type="dxa" w:w="90"/>
-              <w:bottom w:type="dxa" w:w="60"/>
-              <w:right w:type="dxa" w:w="90"/>
-            </w:tcMar>
-          </w:tcPr>
-          <w:p>
-            <w:pPr>
-              <w:spacing w:after="0"/>
-              <w:jc w:val="left"/>
-            </w:pPr>
-            <w:r>
-              <w:rPr>
-                <w:b w:val="false"/>
-                <w:bCs w:val="false"/>
-                <w:sz w:val="18"/>
-                <w:szCs w:val="18"/>
-              </w:rPr>
-              <w:t xml:space="preserve">Low</w:t>
             </w:r>
           </w:p>
         </w:tc>
@@ -10176,7 +9639,7 @@
       <w:tr>
         <w:tc>
           <w:tcPr>
-            <w:tcW w:type="dxa" w:w="2017"/>
+            <w:tcW w:type="dxa" w:w="2313"/>
             <w:shd w:fill="F2F2F2" w:color="auto" w:val="clear"/>
             <w:tcMar>
               <w:top w:type="dxa" w:w="60"/>
@@ -10203,7 +9666,7 @@
         </w:tc>
         <w:tc>
           <w:tcPr>
-            <w:tcW w:type="dxa" w:w="784"/>
+            <w:tcW w:type="dxa" w:w="900"/>
             <w:shd w:fill="F2F2F2" w:color="auto" w:val="clear"/>
             <w:tcMar>
               <w:top w:type="dxa" w:w="60"/>
@@ -10230,7 +9693,7 @@
         </w:tc>
         <w:tc>
           <w:tcPr>
-            <w:tcW w:type="dxa" w:w="1121"/>
+            <w:tcW w:type="dxa" w:w="1285"/>
             <w:shd w:fill="F2F2F2" w:color="auto" w:val="clear"/>
             <w:tcMar>
               <w:top w:type="dxa" w:w="60"/>
@@ -10257,7 +9720,7 @@
         </w:tc>
         <w:tc>
           <w:tcPr>
-            <w:tcW w:type="dxa" w:w="1121"/>
+            <w:tcW w:type="dxa" w:w="1285"/>
             <w:shd w:fill="F2F2F2" w:color="auto" w:val="clear"/>
             <w:tcMar>
               <w:top w:type="dxa" w:w="60"/>
@@ -10284,7 +9747,7 @@
         </w:tc>
         <w:tc>
           <w:tcPr>
-            <w:tcW w:type="dxa" w:w="1121"/>
+            <w:tcW w:type="dxa" w:w="1285"/>
             <w:shd w:fill="F2F2F2" w:color="auto" w:val="clear"/>
             <w:tcMar>
               <w:top w:type="dxa" w:w="60"/>
@@ -10311,7 +9774,7 @@
         </w:tc>
         <w:tc>
           <w:tcPr>
-            <w:tcW w:type="dxa" w:w="1345"/>
+            <w:tcW w:type="dxa" w:w="1542"/>
             <w:shd w:fill="F2F2F2" w:color="auto" w:val="clear"/>
             <w:tcMar>
               <w:top w:type="dxa" w:w="60"/>
@@ -10338,7 +9801,7 @@
         </w:tc>
         <w:tc>
           <w:tcPr>
-            <w:tcW w:type="dxa" w:w="897"/>
+            <w:tcW w:type="dxa" w:w="1028"/>
             <w:shd w:fill="F2F2F2" w:color="auto" w:val="clear"/>
             <w:tcMar>
               <w:top w:type="dxa" w:w="60"/>
@@ -10360,33 +9823,6 @@
                 <w:szCs w:val="18"/>
               </w:rPr>
               <w:t xml:space="preserve">28</w:t>
-            </w:r>
-          </w:p>
-        </w:tc>
-        <w:tc>
-          <w:tcPr>
-            <w:tcW w:type="dxa" w:w="1232"/>
-            <w:shd w:fill="F2F2F2" w:color="auto" w:val="clear"/>
-            <w:tcMar>
-              <w:top w:type="dxa" w:w="60"/>
-              <w:left w:type="dxa" w:w="90"/>
-              <w:bottom w:type="dxa" w:w="60"/>
-              <w:right w:type="dxa" w:w="90"/>
-            </w:tcMar>
-          </w:tcPr>
-          <w:p>
-            <w:pPr>
-              <w:spacing w:after="0"/>
-              <w:jc w:val="left"/>
-            </w:pPr>
-            <w:r>
-              <w:rPr>
-                <w:b w:val="false"/>
-                <w:bCs w:val="false"/>
-                <w:sz w:val="18"/>
-                <w:szCs w:val="18"/>
-              </w:rPr>
-              <w:t xml:space="preserve">High</w:t>
             </w:r>
           </w:p>
         </w:tc>
@@ -10394,7 +9830,7 @@
       <w:tr>
         <w:tc>
           <w:tcPr>
-            <w:tcW w:type="dxa" w:w="2017"/>
+            <w:tcW w:type="dxa" w:w="2313"/>
             <w:tcMar>
               <w:top w:type="dxa" w:w="60"/>
               <w:left w:type="dxa" w:w="90"/>
@@ -10420,7 +9856,7 @@
         </w:tc>
         <w:tc>
           <w:tcPr>
-            <w:tcW w:type="dxa" w:w="784"/>
+            <w:tcW w:type="dxa" w:w="900"/>
             <w:tcMar>
               <w:top w:type="dxa" w:w="60"/>
               <w:left w:type="dxa" w:w="90"/>
@@ -10446,7 +9882,7 @@
         </w:tc>
         <w:tc>
           <w:tcPr>
-            <w:tcW w:type="dxa" w:w="1121"/>
+            <w:tcW w:type="dxa" w:w="1285"/>
             <w:tcMar>
               <w:top w:type="dxa" w:w="60"/>
               <w:left w:type="dxa" w:w="90"/>
@@ -10472,7 +9908,7 @@
         </w:tc>
         <w:tc>
           <w:tcPr>
-            <w:tcW w:type="dxa" w:w="1121"/>
+            <w:tcW w:type="dxa" w:w="1285"/>
             <w:tcMar>
               <w:top w:type="dxa" w:w="60"/>
               <w:left w:type="dxa" w:w="90"/>
@@ -10498,7 +9934,7 @@
         </w:tc>
         <w:tc>
           <w:tcPr>
-            <w:tcW w:type="dxa" w:w="1121"/>
+            <w:tcW w:type="dxa" w:w="1285"/>
             <w:tcMar>
               <w:top w:type="dxa" w:w="60"/>
               <w:left w:type="dxa" w:w="90"/>
@@ -10524,7 +9960,7 @@
         </w:tc>
         <w:tc>
           <w:tcPr>
-            <w:tcW w:type="dxa" w:w="1345"/>
+            <w:tcW w:type="dxa" w:w="1542"/>
             <w:tcMar>
               <w:top w:type="dxa" w:w="60"/>
               <w:left w:type="dxa" w:w="90"/>
@@ -10550,7 +9986,7 @@
         </w:tc>
         <w:tc>
           <w:tcPr>
-            <w:tcW w:type="dxa" w:w="897"/>
+            <w:tcW w:type="dxa" w:w="1028"/>
             <w:tcMar>
               <w:top w:type="dxa" w:w="60"/>
               <w:left w:type="dxa" w:w="90"/>
@@ -10571,32 +10007,6 @@
                 <w:szCs w:val="18"/>
               </w:rPr>
               <w:t xml:space="preserve">50</w:t>
-            </w:r>
-          </w:p>
-        </w:tc>
-        <w:tc>
-          <w:tcPr>
-            <w:tcW w:type="dxa" w:w="1232"/>
-            <w:tcMar>
-              <w:top w:type="dxa" w:w="60"/>
-              <w:left w:type="dxa" w:w="90"/>
-              <w:bottom w:type="dxa" w:w="60"/>
-              <w:right w:type="dxa" w:w="90"/>
-            </w:tcMar>
-          </w:tcPr>
-          <w:p>
-            <w:pPr>
-              <w:spacing w:after="0"/>
-              <w:jc w:val="left"/>
-            </w:pPr>
-            <w:r>
-              <w:rPr>
-                <w:b w:val="false"/>
-                <w:bCs w:val="false"/>
-                <w:sz w:val="18"/>
-                <w:szCs w:val="18"/>
-              </w:rPr>
-              <w:t xml:space="preserve">Low</w:t>
             </w:r>
           </w:p>
         </w:tc>
@@ -10604,7 +10014,7 @@
       <w:tr>
         <w:tc>
           <w:tcPr>
-            <w:tcW w:type="dxa" w:w="2017"/>
+            <w:tcW w:type="dxa" w:w="2313"/>
             <w:shd w:fill="F2F2F2" w:color="auto" w:val="clear"/>
             <w:tcMar>
               <w:top w:type="dxa" w:w="60"/>
@@ -10631,7 +10041,7 @@
         </w:tc>
         <w:tc>
           <w:tcPr>
-            <w:tcW w:type="dxa" w:w="784"/>
+            <w:tcW w:type="dxa" w:w="900"/>
             <w:shd w:fill="F2F2F2" w:color="auto" w:val="clear"/>
             <w:tcMar>
               <w:top w:type="dxa" w:w="60"/>
@@ -10658,7 +10068,7 @@
         </w:tc>
         <w:tc>
           <w:tcPr>
-            <w:tcW w:type="dxa" w:w="1121"/>
+            <w:tcW w:type="dxa" w:w="1285"/>
             <w:shd w:fill="F2F2F2" w:color="auto" w:val="clear"/>
             <w:tcMar>
               <w:top w:type="dxa" w:w="60"/>
@@ -10685,7 +10095,7 @@
         </w:tc>
         <w:tc>
           <w:tcPr>
-            <w:tcW w:type="dxa" w:w="1121"/>
+            <w:tcW w:type="dxa" w:w="1285"/>
             <w:shd w:fill="F2F2F2" w:color="auto" w:val="clear"/>
             <w:tcMar>
               <w:top w:type="dxa" w:w="60"/>
@@ -10712,7 +10122,7 @@
         </w:tc>
         <w:tc>
           <w:tcPr>
-            <w:tcW w:type="dxa" w:w="1121"/>
+            <w:tcW w:type="dxa" w:w="1285"/>
             <w:shd w:fill="F2F2F2" w:color="auto" w:val="clear"/>
             <w:tcMar>
               <w:top w:type="dxa" w:w="60"/>
@@ -10739,7 +10149,7 @@
         </w:tc>
         <w:tc>
           <w:tcPr>
-            <w:tcW w:type="dxa" w:w="1345"/>
+            <w:tcW w:type="dxa" w:w="1542"/>
             <w:shd w:fill="F2F2F2" w:color="auto" w:val="clear"/>
             <w:tcMar>
               <w:top w:type="dxa" w:w="60"/>
@@ -10766,7 +10176,7 @@
         </w:tc>
         <w:tc>
           <w:tcPr>
-            <w:tcW w:type="dxa" w:w="897"/>
+            <w:tcW w:type="dxa" w:w="1028"/>
             <w:shd w:fill="F2F2F2" w:color="auto" w:val="clear"/>
             <w:tcMar>
               <w:top w:type="dxa" w:w="60"/>
@@ -10788,33 +10198,6 @@
                 <w:szCs w:val="18"/>
               </w:rPr>
               <w:t xml:space="preserve">33</w:t>
-            </w:r>
-          </w:p>
-        </w:tc>
-        <w:tc>
-          <w:tcPr>
-            <w:tcW w:type="dxa" w:w="1232"/>
-            <w:shd w:fill="F2F2F2" w:color="auto" w:val="clear"/>
-            <w:tcMar>
-              <w:top w:type="dxa" w:w="60"/>
-              <w:left w:type="dxa" w:w="90"/>
-              <w:bottom w:type="dxa" w:w="60"/>
-              <w:right w:type="dxa" w:w="90"/>
-            </w:tcMar>
-          </w:tcPr>
-          <w:p>
-            <w:pPr>
-              <w:spacing w:after="0"/>
-              <w:jc w:val="left"/>
-            </w:pPr>
-            <w:r>
-              <w:rPr>
-                <w:b w:val="false"/>
-                <w:bCs w:val="false"/>
-                <w:sz w:val="18"/>
-                <w:szCs w:val="18"/>
-              </w:rPr>
-              <w:t xml:space="preserve">High</w:t>
             </w:r>
           </w:p>
         </w:tc>
@@ -10822,7 +10205,7 @@
       <w:tr>
         <w:tc>
           <w:tcPr>
-            <w:tcW w:type="dxa" w:w="2017"/>
+            <w:tcW w:type="dxa" w:w="2313"/>
             <w:tcMar>
               <w:top w:type="dxa" w:w="60"/>
               <w:left w:type="dxa" w:w="90"/>
@@ -10848,7 +10231,7 @@
         </w:tc>
         <w:tc>
           <w:tcPr>
-            <w:tcW w:type="dxa" w:w="784"/>
+            <w:tcW w:type="dxa" w:w="900"/>
             <w:tcMar>
               <w:top w:type="dxa" w:w="60"/>
               <w:left w:type="dxa" w:w="90"/>
@@ -10874,7 +10257,7 @@
         </w:tc>
         <w:tc>
           <w:tcPr>
-            <w:tcW w:type="dxa" w:w="1121"/>
+            <w:tcW w:type="dxa" w:w="1285"/>
             <w:tcMar>
               <w:top w:type="dxa" w:w="60"/>
               <w:left w:type="dxa" w:w="90"/>
@@ -10900,7 +10283,7 @@
         </w:tc>
         <w:tc>
           <w:tcPr>
-            <w:tcW w:type="dxa" w:w="1121"/>
+            <w:tcW w:type="dxa" w:w="1285"/>
             <w:tcMar>
               <w:top w:type="dxa" w:w="60"/>
               <w:left w:type="dxa" w:w="90"/>
@@ -10926,7 +10309,7 @@
         </w:tc>
         <w:tc>
           <w:tcPr>
-            <w:tcW w:type="dxa" w:w="1121"/>
+            <w:tcW w:type="dxa" w:w="1285"/>
             <w:tcMar>
               <w:top w:type="dxa" w:w="60"/>
               <w:left w:type="dxa" w:w="90"/>
@@ -10952,7 +10335,7 @@
         </w:tc>
         <w:tc>
           <w:tcPr>
-            <w:tcW w:type="dxa" w:w="1345"/>
+            <w:tcW w:type="dxa" w:w="1542"/>
             <w:tcMar>
               <w:top w:type="dxa" w:w="60"/>
               <w:left w:type="dxa" w:w="90"/>
@@ -10978,7 +10361,7 @@
         </w:tc>
         <w:tc>
           <w:tcPr>
-            <w:tcW w:type="dxa" w:w="897"/>
+            <w:tcW w:type="dxa" w:w="1028"/>
             <w:tcMar>
               <w:top w:type="dxa" w:w="60"/>
               <w:left w:type="dxa" w:w="90"/>
@@ -10999,32 +10382,6 @@
                 <w:szCs w:val="18"/>
               </w:rPr>
               <w:t xml:space="preserve">97</w:t>
-            </w:r>
-          </w:p>
-        </w:tc>
-        <w:tc>
-          <w:tcPr>
-            <w:tcW w:type="dxa" w:w="1232"/>
-            <w:tcMar>
-              <w:top w:type="dxa" w:w="60"/>
-              <w:left w:type="dxa" w:w="90"/>
-              <w:bottom w:type="dxa" w:w="60"/>
-              <w:right w:type="dxa" w:w="90"/>
-            </w:tcMar>
-          </w:tcPr>
-          <w:p>
-            <w:pPr>
-              <w:spacing w:after="0"/>
-              <w:jc w:val="left"/>
-            </w:pPr>
-            <w:r>
-              <w:rPr>
-                <w:b w:val="false"/>
-                <w:bCs w:val="false"/>
-                <w:sz w:val="18"/>
-                <w:szCs w:val="18"/>
-              </w:rPr>
-              <w:t xml:space="preserve">High</w:t>
             </w:r>
           </w:p>
         </w:tc>
@@ -11032,7 +10389,7 @@
       <w:tr>
         <w:tc>
           <w:tcPr>
-            <w:tcW w:type="dxa" w:w="2017"/>
+            <w:tcW w:type="dxa" w:w="2313"/>
             <w:shd w:fill="F2F2F2" w:color="auto" w:val="clear"/>
             <w:tcMar>
               <w:top w:type="dxa" w:w="60"/>
@@ -11059,7 +10416,7 @@
         </w:tc>
         <w:tc>
           <w:tcPr>
-            <w:tcW w:type="dxa" w:w="784"/>
+            <w:tcW w:type="dxa" w:w="900"/>
             <w:shd w:fill="F2F2F2" w:color="auto" w:val="clear"/>
             <w:tcMar>
               <w:top w:type="dxa" w:w="60"/>
@@ -11086,7 +10443,7 @@
         </w:tc>
         <w:tc>
           <w:tcPr>
-            <w:tcW w:type="dxa" w:w="1121"/>
+            <w:tcW w:type="dxa" w:w="1285"/>
             <w:shd w:fill="F2F2F2" w:color="auto" w:val="clear"/>
             <w:tcMar>
               <w:top w:type="dxa" w:w="60"/>
@@ -11113,7 +10470,7 @@
         </w:tc>
         <w:tc>
           <w:tcPr>
-            <w:tcW w:type="dxa" w:w="1121"/>
+            <w:tcW w:type="dxa" w:w="1285"/>
             <w:shd w:fill="F2F2F2" w:color="auto" w:val="clear"/>
             <w:tcMar>
               <w:top w:type="dxa" w:w="60"/>
@@ -11140,7 +10497,7 @@
         </w:tc>
         <w:tc>
           <w:tcPr>
-            <w:tcW w:type="dxa" w:w="1121"/>
+            <w:tcW w:type="dxa" w:w="1285"/>
             <w:shd w:fill="F2F2F2" w:color="auto" w:val="clear"/>
             <w:tcMar>
               <w:top w:type="dxa" w:w="60"/>
@@ -11167,7 +10524,7 @@
         </w:tc>
         <w:tc>
           <w:tcPr>
-            <w:tcW w:type="dxa" w:w="1345"/>
+            <w:tcW w:type="dxa" w:w="1542"/>
             <w:shd w:fill="F2F2F2" w:color="auto" w:val="clear"/>
             <w:tcMar>
               <w:top w:type="dxa" w:w="60"/>
@@ -11194,7 +10551,7 @@
         </w:tc>
         <w:tc>
           <w:tcPr>
-            <w:tcW w:type="dxa" w:w="897"/>
+            <w:tcW w:type="dxa" w:w="1028"/>
             <w:shd w:fill="F2F2F2" w:color="auto" w:val="clear"/>
             <w:tcMar>
               <w:top w:type="dxa" w:w="60"/>
@@ -11216,33 +10573,6 @@
                 <w:szCs w:val="18"/>
               </w:rPr>
               <w:t xml:space="preserve">26</w:t>
-            </w:r>
-          </w:p>
-        </w:tc>
-        <w:tc>
-          <w:tcPr>
-            <w:tcW w:type="dxa" w:w="1232"/>
-            <w:shd w:fill="F2F2F2" w:color="auto" w:val="clear"/>
-            <w:tcMar>
-              <w:top w:type="dxa" w:w="60"/>
-              <w:left w:type="dxa" w:w="90"/>
-              <w:bottom w:type="dxa" w:w="60"/>
-              <w:right w:type="dxa" w:w="90"/>
-            </w:tcMar>
-          </w:tcPr>
-          <w:p>
-            <w:pPr>
-              <w:spacing w:after="0"/>
-              <w:jc w:val="left"/>
-            </w:pPr>
-            <w:r>
-              <w:rPr>
-                <w:b w:val="false"/>
-                <w:bCs w:val="false"/>
-                <w:sz w:val="18"/>
-                <w:szCs w:val="18"/>
-              </w:rPr>
-              <w:t xml:space="preserve">High</w:t>
             </w:r>
           </w:p>
         </w:tc>
@@ -11250,7 +10580,7 @@
       <w:tr>
         <w:tc>
           <w:tcPr>
-            <w:tcW w:type="dxa" w:w="2017"/>
+            <w:tcW w:type="dxa" w:w="2313"/>
             <w:tcMar>
               <w:top w:type="dxa" w:w="60"/>
               <w:left w:type="dxa" w:w="90"/>
@@ -11276,7 +10606,7 @@
         </w:tc>
         <w:tc>
           <w:tcPr>
-            <w:tcW w:type="dxa" w:w="784"/>
+            <w:tcW w:type="dxa" w:w="900"/>
             <w:tcMar>
               <w:top w:type="dxa" w:w="60"/>
               <w:left w:type="dxa" w:w="90"/>
@@ -11302,7 +10632,7 @@
         </w:tc>
         <w:tc>
           <w:tcPr>
-            <w:tcW w:type="dxa" w:w="1121"/>
+            <w:tcW w:type="dxa" w:w="1285"/>
             <w:tcMar>
               <w:top w:type="dxa" w:w="60"/>
               <w:left w:type="dxa" w:w="90"/>
@@ -11328,7 +10658,7 @@
         </w:tc>
         <w:tc>
           <w:tcPr>
-            <w:tcW w:type="dxa" w:w="1121"/>
+            <w:tcW w:type="dxa" w:w="1285"/>
             <w:tcMar>
               <w:top w:type="dxa" w:w="60"/>
               <w:left w:type="dxa" w:w="90"/>
@@ -11354,7 +10684,7 @@
         </w:tc>
         <w:tc>
           <w:tcPr>
-            <w:tcW w:type="dxa" w:w="1121"/>
+            <w:tcW w:type="dxa" w:w="1285"/>
             <w:tcMar>
               <w:top w:type="dxa" w:w="60"/>
               <w:left w:type="dxa" w:w="90"/>
@@ -11380,7 +10710,7 @@
         </w:tc>
         <w:tc>
           <w:tcPr>
-            <w:tcW w:type="dxa" w:w="1345"/>
+            <w:tcW w:type="dxa" w:w="1542"/>
             <w:tcMar>
               <w:top w:type="dxa" w:w="60"/>
               <w:left w:type="dxa" w:w="90"/>
@@ -11406,7 +10736,7 @@
         </w:tc>
         <w:tc>
           <w:tcPr>
-            <w:tcW w:type="dxa" w:w="897"/>
+            <w:tcW w:type="dxa" w:w="1028"/>
             <w:tcMar>
               <w:top w:type="dxa" w:w="60"/>
               <w:left w:type="dxa" w:w="90"/>
@@ -11427,32 +10757,6 @@
                 <w:szCs w:val="18"/>
               </w:rPr>
               <w:t xml:space="preserve">23</w:t>
-            </w:r>
-          </w:p>
-        </w:tc>
-        <w:tc>
-          <w:tcPr>
-            <w:tcW w:type="dxa" w:w="1232"/>
-            <w:tcMar>
-              <w:top w:type="dxa" w:w="60"/>
-              <w:left w:type="dxa" w:w="90"/>
-              <w:bottom w:type="dxa" w:w="60"/>
-              <w:right w:type="dxa" w:w="90"/>
-            </w:tcMar>
-          </w:tcPr>
-          <w:p>
-            <w:pPr>
-              <w:spacing w:after="0"/>
-              <w:jc w:val="left"/>
-            </w:pPr>
-            <w:r>
-              <w:rPr>
-                <w:b w:val="false"/>
-                <w:bCs w:val="false"/>
-                <w:sz w:val="18"/>
-                <w:szCs w:val="18"/>
-              </w:rPr>
-              <w:t xml:space="preserve">High</w:t>
             </w:r>
           </w:p>
         </w:tc>
@@ -21973,7 +21277,7 @@
                 <w:sz w:val="18"/>
                 <w:szCs w:val="18"/>
               </w:rPr>
-              <w:t xml:space="preserve">Our backtest showed excluding such names lowered returns; the RRG is context, not a rule.</w:t>
+              <w:t xml:space="preserve">Our backtest showed excluding such names lowered returns; so we no longer use or show the RRG.</w:t>
             </w:r>
           </w:p>
         </w:tc>
@@ -22609,7 +21913,7 @@
           <w:b/>
           <w:bCs/>
         </w:rPr>
-        <w:t xml:space="preserve">Why did you drop the RRG conviction filter?</w:t>
+        <w:t xml:space="preserve">Why is there no RRG on your dashboard?</w:t>
       </w:r>
     </w:p>
     <w:p>
@@ -22626,7 +21930,7 @@
         <w:t xml:space="preserve">A. </w:t>
       </w:r>
       <w:r>
-        <w:t xml:space="preserve">A pre-registered backtest showed it lowered returns in both periods and changed the top 8 almost every month. It was built on 3-month RS, the weakest signal in our study.</w:t>
+        <w:t xml:space="preserve">It drove nothing. Its only use was the conviction filter, which our backtest rejected (it lowered returns in both periods). A chart that decides nothing is noise, so we removed it; the RS it is built from is still shown, and 6-month RS drives the ranking.</w:t>
       </w:r>
     </w:p>
     <w:p>
@@ -22647,7 +21951,7 @@
           <w:b/>
           <w:bCs/>
         </w:rPr>
-        <w:t xml:space="preserve">Isn't dropping a filter after seeing the results data-mining?</w:t>
+        <w:t xml:space="preserve">Why did you drop the RRG conviction filter?</w:t>
       </w:r>
     </w:p>
     <w:p>
@@ -22664,7 +21968,7 @@
         <w:t xml:space="preserve">A. </w:t>
       </w:r>
       <w:r>
-        <w:t xml:space="preserve">The test design and the decision rule were written before running it; the result went against what we believed. Keeping a filter that the data says hurts would be the bias.</w:t>
+        <w:t xml:space="preserve">A pre-registered backtest showed it lowered returns in both periods and changed the top 8 almost every month. It was built on 3-month RS, the weakest signal in our study.</w:t>
       </w:r>
     </w:p>
     <w:p>
@@ -22685,7 +21989,7 @@
           <w:b/>
           <w:bCs/>
         </w:rPr>
-        <w:t xml:space="preserve">What did you test that did not work?</w:t>
+        <w:t xml:space="preserve">Isn't dropping a filter after seeing the results data-mining?</w:t>
       </w:r>
     </w:p>
     <w:p>
@@ -22702,15 +22006,7 @@
         <w:t xml:space="preserve">A. </w:t>
       </w:r>
       <w:r>
-        <w:t xml:space="preserve">~25 signals across four studies: RS over 5 windows, 52-week high, volatility, risk-adjusted momentum, 200-day MA, delivery %, turnover, sector momentum, ADX, RSI, RRG conviction, residual momentum, frog-in-the-pan, earnings announcement returns.</w:t>
-      </w:r>
-    </w:p>
-    <w:p>
-      <w:pPr>
-        <w:pStyle w:val="Heading2"/>
-      </w:pPr>
-      <w:r>
-        <w:t xml:space="preserve">Specific stocks</w:t>
+        <w:t xml:space="preserve">The test design and the decision rule were written before running it; the result went against what we believed. Keeping a filter that the data says hurts would be the bias.</w:t>
       </w:r>
     </w:p>
     <w:p>
@@ -22731,7 +22027,7 @@
           <w:b/>
           <w:bCs/>
         </w:rPr>
-        <w:t xml:space="preserve">WELCORP is up 4x. Isn't it too late?</w:t>
+        <w:t xml:space="preserve">What did you test that did not work?</w:t>
       </w:r>
     </w:p>
     <w:p>
@@ -22748,7 +22044,15 @@
         <w:t xml:space="preserve">A. </w:t>
       </w:r>
       <w:r>
-        <w:t xml:space="preserve">Its latest rise followed new orders (Aramco ~₹2,000 cr on 20-Sep, a record ₹4,000 cr US order on 24-Sep) and profit up 199%. It is extended, which is why it has a 13.9% stop and an equal-risk weight, not a bigger bet.</w:t>
+        <w:t xml:space="preserve">~25 signals across four studies: RS over 5 windows, 52-week high, volatility, risk-adjusted momentum, 200-day MA, delivery %, turnover, sector momentum, ADX, RSI, RRG conviction, residual momentum, frog-in-the-pan, earnings announcement returns.</w:t>
+      </w:r>
+    </w:p>
+    <w:p>
+      <w:pPr>
+        <w:pStyle w:val="Heading2"/>
+      </w:pPr>
+      <w:r>
+        <w:t xml:space="preserve">Specific stocks</w:t>
       </w:r>
     </w:p>
     <w:p>
@@ -22769,7 +22073,7 @@
           <w:b/>
           <w:bCs/>
         </w:rPr>
-        <w:t xml:space="preserve">RPEL is a refractory maker. How is that capital goods?</w:t>
+        <w:t xml:space="preserve">WELCORP is up 4x. Isn't it too late?</w:t>
       </w:r>
     </w:p>
     <w:p>
@@ -22786,7 +22090,7 @@
         <w:t xml:space="preserve">A. </w:t>
       </w:r>
       <w:r>
-        <w:t xml:space="preserve">NSE classifies it as Capital Goods &gt; Industrial Products &gt; Electrodes &amp; Refractories, and its demand is construction steel. We flag it as borderline on the dashboard rather than hide it.</w:t>
+        <w:t xml:space="preserve">Its latest rise followed new orders (Aramco ~₹2,000 cr on 20-Sep, a record ₹4,000 cr US order on 24-Sep) and profit up 199%. It is extended, which is why it has a 13.9% stop and an equal-risk weight, not a bigger bet.</w:t>
       </w:r>
     </w:p>
     <w:p>
@@ -22807,7 +22111,7 @@
           <w:b/>
           <w:bCs/>
         </w:rPr>
-        <w:t xml:space="preserve">RAMRAT fails OPM and cash flow. Why hold it?</w:t>
+        <w:t xml:space="preserve">RPEL is a refractory maker. How is that capital goods?</w:t>
       </w:r>
     </w:p>
     <w:p>
@@ -22824,7 +22128,7 @@
         <w:t xml:space="preserve">A. </w:t>
       </w:r>
       <w:r>
-        <w:t xml:space="preserve">Those are soft criteria: long-run quality, already priced. It passes all hard rules (debt/equity 1.17 &lt; 1.5, no pledge). The negative cash flow is working capital for 89% revenue growth.</w:t>
+        <w:t xml:space="preserve">NSE classifies it as Capital Goods &gt; Industrial Products &gt; Electrodes &amp; Refractories, and its demand is construction steel. We flag it as borderline on the dashboard rather than hide it.</w:t>
       </w:r>
     </w:p>
     <w:p>
@@ -22845,7 +22149,7 @@
           <w:b/>
           <w:bCs/>
         </w:rPr>
-        <w:t xml:space="preserve">TDPOWERSYS is raising equity. Won't that hurt?</w:t>
+        <w:t xml:space="preserve">RAMRAT fails OPM and cash flow. Why hold it?</w:t>
       </w:r>
     </w:p>
     <w:p>
@@ -22862,7 +22166,7 @@
         <w:t xml:space="preserve">A. </w:t>
       </w:r>
       <w:r>
-        <w:t xml:space="preserve">It can cap the price near term; it is disclosed and the stop handles it. The raise funds a business growing ~70% with 3.4 quarters of orders in hand.</w:t>
+        <w:t xml:space="preserve">Those are soft criteria: long-run quality, already priced. It passes all hard rules (debt/equity 1.17 &lt; 1.5, no pledge). The negative cash flow is working capital for 89% revenue growth.</w:t>
       </w:r>
     </w:p>
     <w:p>
@@ -22883,7 +22187,7 @@
           <w:b/>
           <w:bCs/>
         </w:rPr>
-        <w:t xml:space="preserve">Four of your stocks have fading momentum on the RRG. Explain.</w:t>
+        <w:t xml:space="preserve">TDPOWERSYS is raising equity. Won't that hurt?</w:t>
       </w:r>
     </w:p>
     <w:p>
@@ -22900,7 +22204,45 @@
         <w:t xml:space="preserve">A. </w:t>
       </w:r>
       <w:r>
-        <w:t xml:space="preserve">Their 6-month strength is intact; the RRG measures the last few weeks. Our backtest found that excluding such names lowered returns, so we show the RRG as context only.</w:t>
+        <w:t xml:space="preserve">It can cap the price near term; it is disclosed and the stop handles it. The raise funds a business growing ~70% with 3.4 quarters of orders in hand.</w:t>
+      </w:r>
+    </w:p>
+    <w:p>
+      <w:pPr>
+        <w:keepNext/>
+        <w:spacing w:after="60" w:before="120"/>
+      </w:pPr>
+      <w:r>
+        <w:rPr>
+          <w:b/>
+          <w:bCs/>
+          <w:color w:val="1F3864"/>
+        </w:rPr>
+        <w:t xml:space="preserve">Q. </w:t>
+      </w:r>
+      <w:r>
+        <w:rPr>
+          <w:b/>
+          <w:bCs/>
+        </w:rPr>
+        <w:t xml:space="preserve">Four of your stocks have fading momentum on the RRG. Explain.</w:t>
+      </w:r>
+    </w:p>
+    <w:p>
+      <w:pPr>
+        <w:spacing w:after="60" w:line="264"/>
+        <w:ind w:left="360"/>
+      </w:pPr>
+      <w:r>
+        <w:rPr>
+          <w:b/>
+          <w:bCs/>
+          <w:color w:val="2E7D32"/>
+        </w:rPr>
+        <w:t xml:space="preserve">A. </w:t>
+      </w:r>
+      <w:r>
+        <w:t xml:space="preserve">Their 6-month strength is intact; the RRG measures the last few weeks. Our backtest found that excluding such names lowered returns, so the RRG plays no part in the method, and we removed it from the dashboard.</w:t>
       </w:r>
     </w:p>
     <w:p>

</xml_diff>

<commit_message>
Brief: why EPC shares the Capital Goods criteria
Co-Authored-By: Claude Opus 5.5 <noreply@anthropic.com>
Claude-Session: https://claude.ai/code/session_018SrKZ3YP1T4SHJR1stpujJ
</commit_message>
<xml_diff>
--- a/docs/Defence_Brief_Capex_Portfolio.docx
+++ b/docs/Defence_Brief_Capex_Portfolio.docx
@@ -22395,6 +22395,44 @@
       </w:r>
       <w:r>
         <w:t xml:space="preserve">EPC contractors are in the universe (Screener's Construction export, 20 above ₹5,000 cr). The same rules apply: ENGINERSIN passes and is reserve #7; the rest fail on trend (L&amp;T, KEC, RVNL, CEMPRO), pledge (HCC, KPIL) or falling profit (WELENT). Most EPC stocks are not in an uptrend right now, and the rule has no sector quotas, so it does not force them in.</w:t>
+      </w:r>
+    </w:p>
+    <w:p>
+      <w:pPr>
+        <w:keepNext/>
+        <w:spacing w:after="60" w:before="120"/>
+      </w:pPr>
+      <w:r>
+        <w:rPr>
+          <w:b/>
+          <w:bCs/>
+          <w:color w:val="1F3864"/>
+        </w:rPr>
+        <w:t xml:space="preserve">Q. </w:t>
+      </w:r>
+      <w:r>
+        <w:rPr>
+          <w:b/>
+          <w:bCs/>
+        </w:rPr>
+        <w:t xml:space="preserve">Why no separate fundamental criteria for EPC?</w:t>
+      </w:r>
+    </w:p>
+    <w:p>
+      <w:pPr>
+        <w:spacing w:after="60" w:line="264"/>
+        <w:ind w:left="360"/>
+      </w:pPr>
+      <w:r>
+        <w:rPr>
+          <w:b/>
+          <w:bCs/>
+          <w:color w:val="2E7D32"/>
+        </w:rPr>
+        <w:t xml:space="preserve">A. </w:t>
+      </w:r>
+      <w:r>
+        <w:t xml:space="preserve">Because none would change anything. The soft tests (OPM, cash flow) never exclude a stock. On the HARD side no EPC stock fails debt/equity, and adding Power's interest-cover test (&gt; 1.5) would only catch HCC and Afcons, which already fail the pledge rule. The same 34 stocks pass either way. Power has its own set for a structural reason (plants are funded with project debt, so interest cover, not debt/equity, is the solvency test); cement differs only in a soft OPM bar.</w:t>
       </w:r>
     </w:p>
     <w:p>

</xml_diff>

<commit_message>
Brief: non-synchronous beta and risk-free rate answers
Co-Authored-By: Claude Opus 5.5 <noreply@anthropic.com>
Claude-Session: https://claude.ai/code/session_018SrKZ3YP1T4SHJR1stpujJ
</commit_message>
<xml_diff>
--- a/docs/Defence_Brief_Capex_Portfolio.docx
+++ b/docs/Defence_Brief_Capex_Portfolio.docx
@@ -22791,6 +22791,82 @@
       </w:r>
       <w:r>
         <w:t xml:space="preserve">Sell; the proceeds buy the next reserve stock that still passes every rule that day; if none does, they top up the other holdings that are still in an uptrend, none above the 15% cap; if none can take it, they wait in the liquid ETF until a stock qualifies. We never add stop-loss money to falling stocks.</w:t>
+      </w:r>
+    </w:p>
+    <w:p>
+      <w:pPr>
+        <w:keepNext/>
+        <w:spacing w:after="60" w:before="120"/>
+      </w:pPr>
+      <w:r>
+        <w:rPr>
+          <w:b/>
+          <w:bCs/>
+          <w:color w:val="1F3864"/>
+        </w:rPr>
+        <w:t xml:space="preserve">Q. </w:t>
+      </w:r>
+      <w:r>
+        <w:rPr>
+          <w:b/>
+          <w:bCs/>
+        </w:rPr>
+        <w:t xml:space="preserve">Daily betas understate mid-caps that react a day late. Did you check?</w:t>
+      </w:r>
+    </w:p>
+    <w:p>
+      <w:pPr>
+        <w:spacing w:after="60" w:line="264"/>
+        <w:ind w:left="360"/>
+      </w:pPr>
+      <w:r>
+        <w:rPr>
+          <w:b/>
+          <w:bCs/>
+          <w:color w:val="2E7D32"/>
+        </w:rPr>
+        <w:t xml:space="preserve">A. </w:t>
+      </w:r>
+      <w:r>
+        <w:t xml:space="preserve">Yes. A Dimson regression (adding yesterday's and tomorrow's market return) gives a portfolio beta of 1.45 against 1.27 from same-day returns; the lag term is borderline significant (t = 2.2). Weekly returns give 1.25, the same as daily. So the evidence is mixed; if the true beta is 1.45, the hedge would need 9 lots instead of 8 (about ₹9,500 more). We kept 8 and state it as a known limitation.</w:t>
+      </w:r>
+    </w:p>
+    <w:p>
+      <w:pPr>
+        <w:keepNext/>
+        <w:spacing w:after="60" w:before="120"/>
+      </w:pPr>
+      <w:r>
+        <w:rPr>
+          <w:b/>
+          <w:bCs/>
+          <w:color w:val="1F3864"/>
+        </w:rPr>
+        <w:t xml:space="preserve">Q. </w:t>
+      </w:r>
+      <w:r>
+        <w:rPr>
+          <w:b/>
+          <w:bCs/>
+        </w:rPr>
+        <w:t xml:space="preserve">Why the overnight rate as risk-free, not the 91-day T-bill?</w:t>
+      </w:r>
+    </w:p>
+    <w:p>
+      <w:pPr>
+        <w:spacing w:after="60" w:line="264"/>
+        <w:ind w:left="360"/>
+      </w:pPr>
+      <w:r>
+        <w:rPr>
+          <w:b/>
+          <w:bCs/>
+          <w:color w:val="2E7D32"/>
+        </w:rPr>
+        <w:t xml:space="preserve">A. </w:t>
+      </w:r>
+      <w:r>
+        <w:t xml:space="preserve">Because it is what our cash actually earns: the undeployed money sits in a liquid ETF that tracks the overnight rate (4.95% annualised over the last quarter; 5.33% over the year). A T-bill rate would be a few tenths of a percent higher; it would move a Sharpe ratio in the second decimal and no decision.</w:t>
       </w:r>
     </w:p>
     <w:p>

</xml_diff>

<commit_message>
Brief: covariance shrinkage, lower-circuit and static-hold answers
Co-Authored-By: Claude Opus 5.5 <noreply@anthropic.com>
Claude-Session: https://claude.ai/code/session_018SrKZ3YP1T4SHJR1stpujJ
</commit_message>
<xml_diff>
--- a/docs/Defence_Brief_Capex_Portfolio.docx
+++ b/docs/Defence_Brief_Capex_Portfolio.docx
@@ -21951,7 +21951,7 @@
           <w:b/>
           <w:bCs/>
         </w:rPr>
-        <w:t xml:space="preserve">Why did you drop the RRG conviction filter?</w:t>
+        <w:t xml:space="preserve">Momentum portfolios rebalance monthly. Doesn't a 3-month buy-and-hold let the factor decay?</w:t>
       </w:r>
     </w:p>
     <w:p>
@@ -21968,7 +21968,7 @@
         <w:t xml:space="preserve">A. </w:t>
       </w:r>
       <w:r>
-        <w:t xml:space="preserve">A pre-registered backtest showed it lowered returns in both periods and changed the top 8 almost every month. It was built on 3-month RS, the weakest signal in our study.</w:t>
+        <w:t xml:space="preserve">Our backtest already measures exactly that: the top 8 are picked once and held for 63 sessions with no rebalancing, and the outcome is their return over those 3 months. The figures we quote (hit rates, quintile spreads) include the decay. The mandate fixes the list after 5-Oct, so monthly rebalancing is not an option anyway; replacements happen only through stops.</w:t>
       </w:r>
     </w:p>
     <w:p>
@@ -21989,7 +21989,7 @@
           <w:b/>
           <w:bCs/>
         </w:rPr>
-        <w:t xml:space="preserve">Isn't dropping a filter after seeing the results data-mining?</w:t>
+        <w:t xml:space="preserve">Why did you drop the RRG conviction filter?</w:t>
       </w:r>
     </w:p>
     <w:p>
@@ -22006,7 +22006,7 @@
         <w:t xml:space="preserve">A. </w:t>
       </w:r>
       <w:r>
-        <w:t xml:space="preserve">The test design and the decision rule were written before running it; the result went against what we believed. Keeping a filter that the data says hurts would be the bias.</w:t>
+        <w:t xml:space="preserve">A pre-registered backtest showed it lowered returns in both periods and changed the top 8 almost every month. It was built on 3-month RS, the weakest signal in our study.</w:t>
       </w:r>
     </w:p>
     <w:p>
@@ -22027,7 +22027,7 @@
           <w:b/>
           <w:bCs/>
         </w:rPr>
-        <w:t xml:space="preserve">What did you test that did not work?</w:t>
+        <w:t xml:space="preserve">Isn't dropping a filter after seeing the results data-mining?</w:t>
       </w:r>
     </w:p>
     <w:p>
@@ -22044,15 +22044,7 @@
         <w:t xml:space="preserve">A. </w:t>
       </w:r>
       <w:r>
-        <w:t xml:space="preserve">~25 signals across four studies: RS over 5 windows, 52-week high, volatility, risk-adjusted momentum, 200-day MA, delivery %, turnover, sector momentum, ADX, RSI, RRG conviction, residual momentum, frog-in-the-pan, earnings announcement returns.</w:t>
-      </w:r>
-    </w:p>
-    <w:p>
-      <w:pPr>
-        <w:pStyle w:val="Heading2"/>
-      </w:pPr>
-      <w:r>
-        <w:t xml:space="preserve">Specific stocks</w:t>
+        <w:t xml:space="preserve">The test design and the decision rule were written before running it; the result went against what we believed. Keeping a filter that the data says hurts would be the bias.</w:t>
       </w:r>
     </w:p>
     <w:p>
@@ -22073,7 +22065,7 @@
           <w:b/>
           <w:bCs/>
         </w:rPr>
-        <w:t xml:space="preserve">WELCORP is up 4x. Isn't it too late?</w:t>
+        <w:t xml:space="preserve">What did you test that did not work?</w:t>
       </w:r>
     </w:p>
     <w:p>
@@ -22090,7 +22082,15 @@
         <w:t xml:space="preserve">A. </w:t>
       </w:r>
       <w:r>
-        <w:t xml:space="preserve">Its latest rise followed new orders (Aramco ~₹2,000 cr on 20-Sep, a record ₹4,000 cr US order on 24-Sep) and profit up 199%. It is extended, which is why it has a 13.9% stop and an equal-risk weight, not a bigger bet.</w:t>
+        <w:t xml:space="preserve">~25 signals across four studies: RS over 5 windows, 52-week high, volatility, risk-adjusted momentum, 200-day MA, delivery %, turnover, sector momentum, ADX, RSI, RRG conviction, residual momentum, frog-in-the-pan, earnings announcement returns.</w:t>
+      </w:r>
+    </w:p>
+    <w:p>
+      <w:pPr>
+        <w:pStyle w:val="Heading2"/>
+      </w:pPr>
+      <w:r>
+        <w:t xml:space="preserve">Specific stocks</w:t>
       </w:r>
     </w:p>
     <w:p>
@@ -22111,7 +22111,7 @@
           <w:b/>
           <w:bCs/>
         </w:rPr>
-        <w:t xml:space="preserve">RPEL is a refractory maker. How is that capital goods?</w:t>
+        <w:t xml:space="preserve">WELCORP is up 4x. Isn't it too late?</w:t>
       </w:r>
     </w:p>
     <w:p>
@@ -22128,7 +22128,7 @@
         <w:t xml:space="preserve">A. </w:t>
       </w:r>
       <w:r>
-        <w:t xml:space="preserve">NSE classifies it as Capital Goods &gt; Industrial Products &gt; Electrodes &amp; Refractories, and its demand is construction steel. We flag it as borderline on the dashboard rather than hide it.</w:t>
+        <w:t xml:space="preserve">Its latest rise followed new orders (Aramco ~₹2,000 cr on 20-Sep, a record ₹4,000 cr US order on 24-Sep) and profit up 199%. It is extended, which is why it has a 13.9% stop and an equal-risk weight, not a bigger bet.</w:t>
       </w:r>
     </w:p>
     <w:p>
@@ -22149,7 +22149,7 @@
           <w:b/>
           <w:bCs/>
         </w:rPr>
-        <w:t xml:space="preserve">RAMRAT fails OPM and cash flow. Why hold it?</w:t>
+        <w:t xml:space="preserve">RPEL is a refractory maker. How is that capital goods?</w:t>
       </w:r>
     </w:p>
     <w:p>
@@ -22166,7 +22166,7 @@
         <w:t xml:space="preserve">A. </w:t>
       </w:r>
       <w:r>
-        <w:t xml:space="preserve">Those are soft criteria: long-run quality, already priced. It passes all hard rules (debt/equity 1.17 &lt; 1.5, no pledge). The negative cash flow is working capital for 89% revenue growth.</w:t>
+        <w:t xml:space="preserve">NSE classifies it as Capital Goods &gt; Industrial Products &gt; Electrodes &amp; Refractories, and its demand is construction steel. We flag it as borderline on the dashboard rather than hide it.</w:t>
       </w:r>
     </w:p>
     <w:p>
@@ -22187,7 +22187,7 @@
           <w:b/>
           <w:bCs/>
         </w:rPr>
-        <w:t xml:space="preserve">TDPOWERSYS is raising equity. Won't that hurt?</w:t>
+        <w:t xml:space="preserve">RAMRAT fails OPM and cash flow. Why hold it?</w:t>
       </w:r>
     </w:p>
     <w:p>
@@ -22204,7 +22204,7 @@
         <w:t xml:space="preserve">A. </w:t>
       </w:r>
       <w:r>
-        <w:t xml:space="preserve">It can cap the price near term; it is disclosed and the stop handles it. The raise funds a business growing ~70% with 3.4 quarters of orders in hand.</w:t>
+        <w:t xml:space="preserve">Those are soft criteria: long-run quality, already priced. It passes all hard rules (debt/equity 1.17 &lt; 1.5, no pledge). The negative cash flow is working capital for 89% revenue growth.</w:t>
       </w:r>
     </w:p>
     <w:p>
@@ -22225,7 +22225,7 @@
           <w:b/>
           <w:bCs/>
         </w:rPr>
-        <w:t xml:space="preserve">Four of your stocks have fading momentum on the RRG. Explain.</w:t>
+        <w:t xml:space="preserve">TDPOWERSYS is raising equity. Won't that hurt?</w:t>
       </w:r>
     </w:p>
     <w:p>
@@ -22242,7 +22242,7 @@
         <w:t xml:space="preserve">A. </w:t>
       </w:r>
       <w:r>
-        <w:t xml:space="preserve">Their 6-month strength is intact; the RRG measures the last few weeks. Our backtest found that excluding such names lowered returns, so the RRG plays no part in the method, and we removed it from the dashboard.</w:t>
+        <w:t xml:space="preserve">It can cap the price near term; it is disclosed and the stop handles it. The raise funds a business growing ~70% with 3.4 quarters of orders in hand.</w:t>
       </w:r>
     </w:p>
     <w:p>
@@ -22263,7 +22263,7 @@
           <w:b/>
           <w:bCs/>
         </w:rPr>
-        <w:t xml:space="preserve">Why is ACMESOLAR capped at 15%?</w:t>
+        <w:t xml:space="preserve">Four of your stocks have fading momentum on the RRG. Explain.</w:t>
       </w:r>
     </w:p>
     <w:p>
@@ -22280,7 +22280,7 @@
         <w:t xml:space="preserve">A. </w:t>
       </w:r>
       <w:r>
-        <w:t xml:space="preserve">It is the least volatile (beta 0.40) and the least correlated with the rest (average correlation 0.11 with the other seven vs 0.25 among them), so equal-risk weighting wants to give it more than 15%; the cap binds. It is our diversifier. Its low CAPM figure (7.8%) is a low REQUIRED return for low market risk, not a low forecast.</w:t>
+        <w:t xml:space="preserve">Their 6-month strength is intact; the RRG measures the last few weeks. Our backtest found that excluding such names lowered returns, so the RRG plays no part in the method, and we removed it from the dashboard.</w:t>
       </w:r>
     </w:p>
     <w:p>
@@ -22301,7 +22301,7 @@
           <w:b/>
           <w:bCs/>
         </w:rPr>
-        <w:t xml:space="preserve">If ACMESOLAR diversifies so well, why not 25-30% in it?</w:t>
+        <w:t xml:space="preserve">Why is ACMESOLAR capped at 15%?</w:t>
       </w:r>
     </w:p>
     <w:p>
@@ -22318,7 +22318,7 @@
         <w:t xml:space="preserve">A. </w:t>
       </w:r>
       <w:r>
-        <w:t xml:space="preserve">Without bounds, ERC would give it 19.7% (our run on the same covariance matrix), not 25-30%. We cap every stock at 15% so no single name, least of all a 0.40-beta power producer, dominates a momentum portfolio; the cap costs little because ERC and the bounded minimum-variance portfolio are almost identical (Sharpe 3.44 vs 3.43).</w:t>
+        <w:t xml:space="preserve">It is the least volatile (beta 0.40) and the least correlated with the rest (average correlation 0.11 with the other seven vs 0.25 among them), so equal-risk weighting wants to give it more than 15%; the cap binds. It is our diversifier. Its low CAPM figure (7.8%) is a low REQUIRED return for low market risk, not a low forecast.</w:t>
       </w:r>
     </w:p>
     <w:p>
@@ -22339,7 +22339,7 @@
           <w:b/>
           <w:bCs/>
         </w:rPr>
-        <w:t xml:space="preserve">How different is ERC from 1/N here?</w:t>
+        <w:t xml:space="preserve">If ACMESOLAR diversifies so well, why not 25-30% in it?</w:t>
       </w:r>
     </w:p>
     <w:p>
@@ -22356,7 +22356,7 @@
         <w:t xml:space="preserve">A. </w:t>
       </w:r>
       <w:r>
-        <w:t xml:space="preserve">Weights differ from 12.5% by at most 3.3 pp, and ERC's volatility is 27.0% vs 28.0% for equal weight: a modest, free gain, because the eight stocks' volatilities are similar. The method matters more when a stock is much riskier than the rest.</w:t>
+        <w:t xml:space="preserve">Without bounds, ERC would give it 19.7% (our run on the same covariance matrix), not 25-30%. We cap every stock at 15% so no single name, least of all a 0.40-beta power producer, dominates a momentum portfolio; the cap costs little because ERC and the bounded minimum-variance portfolio are almost identical (Sharpe 3.44 vs 3.43).</w:t>
       </w:r>
     </w:p>
     <w:p>
@@ -22377,7 +22377,7 @@
           <w:b/>
           <w:bCs/>
         </w:rPr>
-        <w:t xml:space="preserve">Your sheet says 'Capital Goods &amp; EPC'. Where is EPC?</w:t>
+        <w:t xml:space="preserve">A one-year sample covariance of 8 volatile mid-caps is noisy. Did you shrink it?</w:t>
       </w:r>
     </w:p>
     <w:p>
@@ -22394,7 +22394,7 @@
         <w:t xml:space="preserve">A. </w:t>
       </w:r>
       <w:r>
-        <w:t xml:space="preserve">EPC contractors are in the universe (Screener's Construction export, 20 above ₹5,000 cr). The same rules apply: ENGINERSIN passes and is reserve #7; the rest fail on trend (L&amp;T, KEC, RVNL, CEMPRO), pledge (HCC, KPIL) or falling profit (WELENT). Most EPC stocks are not in an uptrend right now, and the rule has no sector quotas, so it does not force them in.</w:t>
+        <w:t xml:space="preserve">We tested it. Ledoit-Wolf shrinkage (towards a scaled identity; estimated intensity 0.14) moves no weight by more than 0.21 pp; a constant-correlation target moves them by at most 1.4 pp; estimating on each half-year separately moves them by at most 2.4 pp. ERC depends mainly on each stock's own volatility, which is estimated precisely, so the weights are robust to covariance noise.</w:t>
       </w:r>
     </w:p>
     <w:p>
@@ -22415,7 +22415,7 @@
           <w:b/>
           <w:bCs/>
         </w:rPr>
-        <w:t xml:space="preserve">Why no separate fundamental criteria for EPC?</w:t>
+        <w:t xml:space="preserve">How different is ERC from 1/N here?</w:t>
       </w:r>
     </w:p>
     <w:p>
@@ -22432,7 +22432,7 @@
         <w:t xml:space="preserve">A. </w:t>
       </w:r>
       <w:r>
-        <w:t xml:space="preserve">Because none would change anything. The soft tests (OPM, cash flow) never exclude a stock. On the HARD side no EPC stock fails debt/equity, and adding Power's interest-cover test (&gt; 1.5) would only catch HCC and Afcons, which already fail the pledge rule. The same 34 stocks pass either way. Power has its own set for a structural reason (plants are funded with project debt, so interest cover, not debt/equity, is the solvency test); cement differs only in a soft OPM bar.</w:t>
+        <w:t xml:space="preserve">Weights differ from 12.5% by at most 3.3 pp, and ERC's volatility is 27.0% vs 28.0% for equal weight: a modest, free gain, because the eight stocks' volatilities are similar. The method matters more when a stock is much riskier than the rest.</w:t>
       </w:r>
     </w:p>
     <w:p>
@@ -22453,7 +22453,7 @@
           <w:b/>
           <w:bCs/>
         </w:rPr>
-        <w:t xml:space="preserve">Why no Tata Power / L&amp;T?</w:t>
+        <w:t xml:space="preserve">Your sheet says 'Capital Goods &amp; EPC'. Where is EPC?</w:t>
       </w:r>
     </w:p>
     <w:p>
@@ -22470,15 +22470,7 @@
         <w:t xml:space="preserve">A. </w:t>
       </w:r>
       <w:r>
-        <w:t xml:space="preserve">Tata Power: 6-month RS −20%, last of 34. L&amp;T: in the universe as EPC, but its trend is bearish (DI gap −3.8) and 6-month RS only +6.8%.</w:t>
-      </w:r>
-    </w:p>
-    <w:p>
-      <w:pPr>
-        <w:pStyle w:val="Heading2"/>
-      </w:pPr>
-      <w:r>
-        <w:t xml:space="preserve">Weights and construction</w:t>
+        <w:t xml:space="preserve">EPC contractors are in the universe (Screener's Construction export, 20 above ₹5,000 cr). The same rules apply: ENGINERSIN passes and is reserve #7; the rest fail on trend (L&amp;T, KEC, RVNL, CEMPRO), pledge (HCC, KPIL) or falling profit (WELENT). Most EPC stocks are not in an uptrend right now, and the rule has no sector quotas, so it does not force them in.</w:t>
       </w:r>
     </w:p>
     <w:p>
@@ -22499,7 +22491,7 @@
           <w:b/>
           <w:bCs/>
         </w:rPr>
-        <w:t xml:space="preserve">Why equal risk contribution and not equal weight or Markowitz?</w:t>
+        <w:t xml:space="preserve">Why no separate fundamental criteria for EPC?</w:t>
       </w:r>
     </w:p>
     <w:p>
@@ -22516,7 +22508,7 @@
         <w:t xml:space="preserve">A. </w:t>
       </w:r>
       <w:r>
-        <w:t xml:space="preserve">Equal weight gives volatile stocks more risk; Markowitz needs return forecasts, which are unreliable (and put 37% in one stock here). ERC needs only the covariance and keeps every stock's risk share equal.</w:t>
+        <w:t xml:space="preserve">Because none would change anything. The soft tests (OPM, cash flow) never exclude a stock. On the HARD side no EPC stock fails debt/equity, and adding Power's interest-cover test (&gt; 1.5) would only catch HCC and Afcons, which already fail the pledge rule. The same 34 stocks pass either way. Power has its own set for a structural reason (plants are funded with project debt, so interest cover, not debt/equity, is the solvency test); cement differs only in a soft OPM bar.</w:t>
       </w:r>
     </w:p>
     <w:p>
@@ -22537,7 +22529,7 @@
           <w:b/>
           <w:bCs/>
         </w:rPr>
-        <w:t xml:space="preserve">Is 5% minimum met?</w:t>
+        <w:t xml:space="preserve">Why no Tata Power / L&amp;T?</w:t>
       </w:r>
     </w:p>
     <w:p>
@@ -22554,7 +22546,15 @@
         <w:t xml:space="preserve">A. </w:t>
       </w:r>
       <w:r>
-        <w:t xml:space="preserve">Yes: the smallest weight is AEROFLEX at 9.2%; the largest is ACMESOLAR at the 15% cap.</w:t>
+        <w:t xml:space="preserve">Tata Power: 6-month RS −20%, last of 34. L&amp;T: in the universe as EPC, but its trend is bearish (DI gap −3.8) and 6-month RS only +6.8%.</w:t>
+      </w:r>
+    </w:p>
+    <w:p>
+      <w:pPr>
+        <w:pStyle w:val="Heading2"/>
+      </w:pPr>
+      <w:r>
+        <w:t xml:space="preserve">Weights and construction</w:t>
       </w:r>
     </w:p>
     <w:p>
@@ -22575,7 +22575,7 @@
           <w:b/>
           <w:bCs/>
         </w:rPr>
-        <w:t xml:space="preserve">What is the 'weighted variance' the brief mentions?</w:t>
+        <w:t xml:space="preserve">Why equal risk contribution and not equal weight or Markowitz?</w:t>
       </w:r>
     </w:p>
     <w:p>
@@ -22592,7 +22592,7 @@
         <w:t xml:space="preserve">A. </w:t>
       </w:r>
       <w:r>
-        <w:t xml:space="preserve">Portfolio variance w'Σw; each stock's contribution is w_i(Σw)_i. ERC sets these contributions equal.</w:t>
+        <w:t xml:space="preserve">Equal weight gives volatile stocks more risk; Markowitz needs return forecasts, which are unreliable (and put 37% in one stock here). ERC needs only the covariance and keeps every stock's risk share equal.</w:t>
       </w:r>
     </w:p>
     <w:p>
@@ -22613,7 +22613,7 @@
           <w:b/>
           <w:bCs/>
         </w:rPr>
-        <w:t xml:space="preserve">Where is the global minimum variance portfolio?</w:t>
+        <w:t xml:space="preserve">Is 5% minimum met?</w:t>
       </w:r>
     </w:p>
     <w:p>
@@ -22630,7 +22630,7 @@
         <w:t xml:space="preserve">A. </w:t>
       </w:r>
       <w:r>
-        <w:t xml:space="preserve">Computed from the same 8 stocks: long-only it is 24.7% volatility with 35% in one stock; within 5-15% it is almost identical to ours (26.6% vs 27.0%, Sharpe 3.43 vs 3.44).</w:t>
+        <w:t xml:space="preserve">Yes: the smallest weight is AEROFLEX at 9.2%; the largest is ACMESOLAR at the 15% cap.</w:t>
       </w:r>
     </w:p>
     <w:p>
@@ -22651,7 +22651,7 @@
           <w:b/>
           <w:bCs/>
         </w:rPr>
-        <w:t xml:space="preserve">Why not invest in all 15?</w:t>
+        <w:t xml:space="preserve">What is the 'weighted variance' the brief mentions?</w:t>
       </w:r>
     </w:p>
     <w:p>
@@ -22668,6 +22668,82 @@
         <w:t xml:space="preserve">A. </w:t>
       </w:r>
       <w:r>
+        <w:t xml:space="preserve">Portfolio variance w'Σw; each stock's contribution is w_i(Σw)_i. ERC sets these contributions equal.</w:t>
+      </w:r>
+    </w:p>
+    <w:p>
+      <w:pPr>
+        <w:keepNext/>
+        <w:spacing w:after="60" w:before="120"/>
+      </w:pPr>
+      <w:r>
+        <w:rPr>
+          <w:b/>
+          <w:bCs/>
+          <w:color w:val="1F3864"/>
+        </w:rPr>
+        <w:t xml:space="preserve">Q. </w:t>
+      </w:r>
+      <w:r>
+        <w:rPr>
+          <w:b/>
+          <w:bCs/>
+        </w:rPr>
+        <w:t xml:space="preserve">Where is the global minimum variance portfolio?</w:t>
+      </w:r>
+    </w:p>
+    <w:p>
+      <w:pPr>
+        <w:spacing w:after="60" w:line="264"/>
+        <w:ind w:left="360"/>
+      </w:pPr>
+      <w:r>
+        <w:rPr>
+          <w:b/>
+          <w:bCs/>
+          <w:color w:val="2E7D32"/>
+        </w:rPr>
+        <w:t xml:space="preserve">A. </w:t>
+      </w:r>
+      <w:r>
+        <w:t xml:space="preserve">Computed from the same 8 stocks: long-only it is 24.7% volatility with 35% in one stock; within 5-15% it is almost identical to ours (26.6% vs 27.0%, Sharpe 3.43 vs 3.44).</w:t>
+      </w:r>
+    </w:p>
+    <w:p>
+      <w:pPr>
+        <w:keepNext/>
+        <w:spacing w:after="60" w:before="120"/>
+      </w:pPr>
+      <w:r>
+        <w:rPr>
+          <w:b/>
+          <w:bCs/>
+          <w:color w:val="1F3864"/>
+        </w:rPr>
+        <w:t xml:space="preserve">Q. </w:t>
+      </w:r>
+      <w:r>
+        <w:rPr>
+          <w:b/>
+          <w:bCs/>
+        </w:rPr>
+        <w:t xml:space="preserve">Why not invest in all 15?</w:t>
+      </w:r>
+    </w:p>
+    <w:p>
+      <w:pPr>
+        <w:spacing w:after="60" w:line="264"/>
+        <w:ind w:left="360"/>
+      </w:pPr>
+      <w:r>
+        <w:rPr>
+          <w:b/>
+          <w:bCs/>
+          <w:color w:val="2E7D32"/>
+        </w:rPr>
+        <w:t xml:space="preserve">A. </w:t>
+      </w:r>
+      <w:r>
         <w:t xml:space="preserve">The brief asks for 7-10 invested. Spreading over 15 barely lowered volatility (23.6% → 22.3%) and halved the weight of the strongest names.</w:t>
       </w:r>
     </w:p>
@@ -22677,6 +22753,44 @@
       </w:pPr>
       <w:r>
         <w:t xml:space="preserve">Risk and hedging</w:t>
+      </w:r>
+    </w:p>
+    <w:p>
+      <w:pPr>
+        <w:keepNext/>
+        <w:spacing w:after="60" w:before="120"/>
+      </w:pPr>
+      <w:r>
+        <w:rPr>
+          <w:b/>
+          <w:bCs/>
+          <w:color w:val="1F3864"/>
+        </w:rPr>
+        <w:t xml:space="preserve">Q. </w:t>
+      </w:r>
+      <w:r>
+        <w:rPr>
+          <w:b/>
+          <w:bCs/>
+        </w:rPr>
+        <w:t xml:space="preserve">What if a stock opens locked at its lower circuit after results?</w:t>
+      </w:r>
+    </w:p>
+    <w:p>
+      <w:pPr>
+        <w:spacing w:after="60" w:line="264"/>
+        <w:ind w:left="360"/>
+      </w:pPr>
+      <w:r>
+        <w:rPr>
+          <w:b/>
+          <w:bCs/>
+          <w:color w:val="2E7D32"/>
+        </w:rPr>
+        <w:t xml:space="preserve">A. </w:t>
+      </w:r>
+      <w:r>
+        <w:t xml:space="preserve">Then the stop cannot execute that day, true. Our stop is on the close, so we sell at the next session with buyers. The damage is bounded by sizing, not by the stop: most of our holdings have a 20% daily price band, so even a full locked day on our largest position (15%) costs about 3% of the portfolio. The results calendar warns 7 days ahead so this is never a surprise.</w:t>
       </w:r>
     </w:p>
     <w:p>

</xml_diff>

<commit_message>
Research: sector quotas vs the pure ranking
research/sector_quota_study.py tests forcing the theme's pillars into the
top 8 (one Cement + one Power; balanced 3/3/2) on the monthly 2021-2026
panel. Both trailed the pure ranking in both periods (not significant),
narrowed outcomes only in 2021-23 and lowered the out-of-sample hit rate.
Written after the list was frozen and labelled as not pre-registered.
README and brief updated.

Co-Authored-By: Claude Opus 5.5 <noreply@anthropic.com>
Claude-Session: https://claude.ai/code/session_018SrKZ3YP1T4SHJR1stpujJ
</commit_message>
<xml_diff>
--- a/docs/Defence_Brief_Capex_Portfolio.docx
+++ b/docs/Defence_Brief_Capex_Portfolio.docx
@@ -542,7 +542,7 @@
               <w:t xml:space="preserve">We tested our own assumptions.</w:t>
             </w:r>
             <w:r>
-              <w:t xml:space="preserve"> Four pre-registered backtests; we dropped a filter we liked (RRG conviction) because the data said it hurt.</w:t>
+              <w:t xml:space="preserve"> Four pre-registered backtests (and a fifth on sector quotas); we dropped a filter we liked (RRG conviction) because the data said it hurt.</w:t>
             </w:r>
           </w:p>
         </w:tc>
@@ -4702,7 +4702,23 @@
         <w:pStyle w:val="Heading2"/>
       </w:pPr>
       <w:r>
-        <w:t xml:space="preserve">5.5 Limitations you must be ready to state</w:t>
+        <w:t xml:space="preserve">5.5 Sector quotas (research/sector_quota_study.py)</w:t>
+      </w:r>
+    </w:p>
+    <w:p>
+      <w:pPr>
+        <w:spacing w:after="120" w:line="276"/>
+      </w:pPr>
+      <w:r>
+        <w:t xml:space="preserve">Written after the list was frozen, in answer to 'a three-pillar theme should hold all three pillars' (not pre-registered). Forcing one Cement and one Power stock into the top 8 trailed the plain ranking in both periods (−2.1 pp per quarter in 2021-23, −1.3 pp in 2024-26); balanced 3/3/2 pillars trailed by −2.6 and −1.1 pp. Neither is significant, but the direction is the same in both periods, the share of quarters beating the Nifty 500 fell out of sample (50% and 47% vs 57%), and the spread of outcomes narrowed only in 2021-23. Quotas cost return and did not reliably buy safety.</w:t>
+      </w:r>
+    </w:p>
+    <w:p>
+      <w:pPr>
+        <w:pStyle w:val="Heading2"/>
+      </w:pPr>
+      <w:r>
+        <w:t xml:space="preserve">5.6 Limitations you must be ready to state</w:t>
       </w:r>
     </w:p>
     <w:p>
@@ -21167,7 +21183,7 @@
                 <w:sz w:val="18"/>
                 <w:szCs w:val="18"/>
               </w:rPr>
-              <w:t xml:space="preserve">The rule is sector-neutral; forcing balance means buying weaker stocks. Cement leg available if required (NUVOCO).</w:t>
+              <w:t xml:space="preserve">The rule has no sector quotas. We tested quotas (research/sector_quota_study.py): one Cement + one Power in the top 8 trailed the pure ranking by 2.1 and 1.3 pp per quarter (2021-23, 2024-26), balanced 3/3/2 pillars by 2.6 and 1.1 pp, and neither lowered risk out of sample. The holdings are also less alike than the label suggests (average correlation 0.25). Cement leg available if required (NUVOCO).</w:t>
             </w:r>
           </w:p>
         </w:tc>

</xml_diff>

<commit_message>
Stop-loss widened from 3 to 5 x ATR(14), trailed (before the snapshot)
research/stop_rule_study.py (point-in-time universe, 2021-2026, next-day
exits, replacement rule, 0.25% costs): a 3-ATR trailing stop fired on ~8
stocks a quarter and cost 3.3 pp per quarter vs holding (t -3.4) without
improving the worst quarter. 5 ATR trailing cost 1.4 pp and had the best
worst quarter (-11.6 pp). Stops now sit 22-29% below price. Config, tests,
Pine script, README and the brief (incl. the survivorship results) updated.

Co-Authored-By: Claude Opus 5.5 <noreply@anthropic.com>
Claude-Session: https://claude.ai/code/session_018SrKZ3YP1T4SHJR1stpujJ
</commit_message>
<xml_diff>
--- a/docs/Defence_Brief_Capex_Portfolio.docx
+++ b/docs/Defence_Brief_Capex_Portfolio.docx
@@ -1214,7 +1214,7 @@
                 <w:sz w:val="18"/>
                 <w:szCs w:val="18"/>
               </w:rPr>
-              <w:t xml:space="preserve">3x ATR stop adjusted to support, trailed; annualised volatility; CAPM expected return; ERC weight.</w:t>
+              <w:t xml:space="preserve">5x ATR stop adjusted to support, trailed (widened from 3x after a backtest); annualised volatility; CAPM expected return; ERC weight.</w:t>
             </w:r>
           </w:p>
         </w:tc>
@@ -4738,7 +4738,7 @@
         <w:t xml:space="preserve">Survivorship bias:</w:t>
       </w:r>
       <w:r>
-        <w:t xml:space="preserve"> the studies use today's universe, so stocks that disappeared since 2020 are missing; absolute returns are flattered, comparisons between rules less so.</w:t>
+        <w:t xml:space="preserve"> the studies use today's universe. research/survivorship_study.py rebuilt it point in time (approximate market cap and liquidity on each date, from all 603 NSE companies in the exports): the old figures overstated the top 8 by about 3.1 pp per quarter (2021-23: +9.9 pp point in time vs +14.3 pp; 2024-26: +1.0 vs +2.7), but the ranking signal is as strong or stronger (rank IC 0.071 vs 0.053). Companies delisted since 2020 are still missing.</w:t>
       </w:r>
     </w:p>
     <w:p>
@@ -5395,7 +5395,7 @@
                 <w:sz w:val="18"/>
                 <w:szCs w:val="18"/>
               </w:rPr>
-              <w:t xml:space="preserve">13.9%</w:t>
+              <w:t xml:space="preserve">23.1%</w:t>
             </w:r>
           </w:p>
         </w:tc>
@@ -5692,7 +5692,7 @@
                 <w:sz w:val="18"/>
                 <w:szCs w:val="18"/>
               </w:rPr>
-              <w:t xml:space="preserve">17.2%</w:t>
+              <w:t xml:space="preserve">28.6%</w:t>
             </w:r>
           </w:p>
         </w:tc>
@@ -5982,7 +5982,7 @@
                 <w:sz w:val="18"/>
                 <w:szCs w:val="18"/>
               </w:rPr>
-              <w:t xml:space="preserve">15.4%</w:t>
+              <w:t xml:space="preserve">25.7%</w:t>
             </w:r>
           </w:p>
         </w:tc>
@@ -6279,7 +6279,7 @@
                 <w:sz w:val="18"/>
                 <w:szCs w:val="18"/>
               </w:rPr>
-              <w:t xml:space="preserve">15.4%</w:t>
+              <w:t xml:space="preserve">25.7%</w:t>
             </w:r>
           </w:p>
         </w:tc>
@@ -6569,7 +6569,7 @@
                 <w:sz w:val="18"/>
                 <w:szCs w:val="18"/>
               </w:rPr>
-              <w:t xml:space="preserve">14.7%</w:t>
+              <w:t xml:space="preserve">24.4%</w:t>
             </w:r>
           </w:p>
         </w:tc>
@@ -6866,7 +6866,7 @@
                 <w:sz w:val="18"/>
                 <w:szCs w:val="18"/>
               </w:rPr>
-              <w:t xml:space="preserve">13.4%</w:t>
+              <w:t xml:space="preserve">22.3%</w:t>
             </w:r>
           </w:p>
         </w:tc>
@@ -7156,7 +7156,7 @@
                 <w:sz w:val="18"/>
                 <w:szCs w:val="18"/>
               </w:rPr>
-              <w:t xml:space="preserve">13.5%</w:t>
+              <w:t xml:space="preserve">22.5%</w:t>
             </w:r>
           </w:p>
         </w:tc>
@@ -7453,7 +7453,7 @@
                 <w:sz w:val="18"/>
                 <w:szCs w:val="18"/>
               </w:rPr>
-              <w:t xml:space="preserve">14.7%</w:t>
+              <w:t xml:space="preserve">22.2%</w:t>
             </w:r>
           </w:p>
         </w:tc>
@@ -11121,7 +11121,7 @@
                 <w:sz w:val="18"/>
                 <w:szCs w:val="18"/>
               </w:rPr>
-              <w:t xml:space="preserve">₹2,440 (13.9% below, 3x ATR)</w:t>
+              <w:t xml:space="preserve">₹2,178 (23.1% below, 5x ATR)</w:t>
             </w:r>
           </w:p>
         </w:tc>
@@ -11445,7 +11445,7 @@
                 <w:sz w:val="18"/>
                 <w:szCs w:val="18"/>
               </w:rPr>
-              <w:t xml:space="preserve">1.54</w:t>
+              <w:t xml:space="preserve">0.92</w:t>
             </w:r>
           </w:p>
         </w:tc>
@@ -11535,7 +11535,7 @@
         <w:t xml:space="preserve">Our answer.</w:t>
       </w:r>
       <w:r>
-        <w:t xml:space="preserve"> The momentum is backed by fresh, dated order wins and a doubling of quarterly profit, so it is not a stale story. The extension is the reason it has a stop-loss 13.9% below the price and an equal-risk weight (13.9%) rather than a conviction-sized bet.</w:t>
+        <w:t xml:space="preserve"> The momentum is backed by fresh, dated order wins and a doubling of quarterly profit, so it is not a stale story. The extension is the reason it has a stop-loss 23% below the price and an equal-risk weight (13.9%) rather than a conviction-sized bet.</w:t>
       </w:r>
     </w:p>
     <w:p>
@@ -11868,7 +11868,7 @@
                 <w:sz w:val="18"/>
                 <w:szCs w:val="18"/>
               </w:rPr>
-              <w:t xml:space="preserve">₹1,408 (17.2% below, 3x ATR)</w:t>
+              <w:t xml:space="preserve">₹1,213 (28.6% below, 5x ATR)</w:t>
             </w:r>
           </w:p>
         </w:tc>
@@ -12192,7 +12192,7 @@
                 <w:sz w:val="18"/>
                 <w:szCs w:val="18"/>
               </w:rPr>
-              <w:t xml:space="preserve">1.54</w:t>
+              <w:t xml:space="preserve">0.93</w:t>
             </w:r>
           </w:p>
         </w:tc>
@@ -12615,7 +12615,7 @@
                 <w:sz w:val="18"/>
                 <w:szCs w:val="18"/>
               </w:rPr>
-              <w:t xml:space="preserve">₹976 (15.4% below, 3x ATR)</w:t>
+              <w:t xml:space="preserve">₹858 (25.7% below, 5x ATR)</w:t>
             </w:r>
           </w:p>
         </w:tc>
@@ -12939,7 +12939,7 @@
                 <w:sz w:val="18"/>
                 <w:szCs w:val="18"/>
               </w:rPr>
-              <w:t xml:space="preserve">1.81</w:t>
+              <w:t xml:space="preserve">1.09</w:t>
             </w:r>
           </w:p>
         </w:tc>
@@ -13362,7 +13362,7 @@
                 <w:sz w:val="18"/>
                 <w:szCs w:val="18"/>
               </w:rPr>
-              <w:t xml:space="preserve">₹445 (15.4% below, 3x ATR)</w:t>
+              <w:t xml:space="preserve">₹391 (25.7% below, 5x ATR)</w:t>
             </w:r>
           </w:p>
         </w:tc>
@@ -13686,7 +13686,7 @@
                 <w:sz w:val="18"/>
                 <w:szCs w:val="18"/>
               </w:rPr>
-              <w:t xml:space="preserve">1.96</w:t>
+              <w:t xml:space="preserve">1.17</w:t>
             </w:r>
           </w:p>
         </w:tc>
@@ -14109,7 +14109,7 @@
                 <w:sz w:val="18"/>
                 <w:szCs w:val="18"/>
               </w:rPr>
-              <w:t xml:space="preserve">₹641 (14.7% below, 3x ATR)</w:t>
+              <w:t xml:space="preserve">₹568 (24.4% below, 5x ATR)</w:t>
             </w:r>
           </w:p>
         </w:tc>
@@ -14433,7 +14433,7 @@
                 <w:sz w:val="18"/>
                 <w:szCs w:val="18"/>
               </w:rPr>
-              <w:t xml:space="preserve">1.87</w:t>
+              <w:t xml:space="preserve">1.12</w:t>
             </w:r>
           </w:p>
         </w:tc>
@@ -14856,7 +14856,7 @@
                 <w:sz w:val="18"/>
                 <w:szCs w:val="18"/>
               </w:rPr>
-              <w:t xml:space="preserve">₹494 (13.4% below, 3x ATR)</w:t>
+              <w:t xml:space="preserve">₹443 (22.3% below, 5x ATR)</w:t>
             </w:r>
           </w:p>
         </w:tc>
@@ -15180,7 +15180,7 @@
                 <w:sz w:val="18"/>
                 <w:szCs w:val="18"/>
               </w:rPr>
-              <w:t xml:space="preserve">1.61</w:t>
+              <w:t xml:space="preserve">0.96</w:t>
             </w:r>
           </w:p>
         </w:tc>
@@ -15603,7 +15603,7 @@
                 <w:sz w:val="18"/>
                 <w:szCs w:val="18"/>
               </w:rPr>
-              <w:t xml:space="preserve">₹15,381 (13.5% below, 3x ATR)</w:t>
+              <w:t xml:space="preserve">₹13,784 (22.5% below, 5x ATR)</w:t>
             </w:r>
           </w:p>
         </w:tc>
@@ -15927,7 +15927,7 @@
                 <w:sz w:val="18"/>
                 <w:szCs w:val="18"/>
               </w:rPr>
-              <w:t xml:space="preserve">1.74</w:t>
+              <w:t xml:space="preserve">1.04</w:t>
             </w:r>
           </w:p>
         </w:tc>
@@ -16350,7 +16350,7 @@
                 <w:sz w:val="18"/>
                 <w:szCs w:val="18"/>
               </w:rPr>
-              <w:t xml:space="preserve">₹378 (14.7% below, support-adjusted)</w:t>
+              <w:t xml:space="preserve">₹345 (22.2% below, 5x ATR)</w:t>
             </w:r>
           </w:p>
         </w:tc>
@@ -16674,7 +16674,7 @@
                 <w:sz w:val="18"/>
                 <w:szCs w:val="18"/>
               </w:rPr>
-              <w:t xml:space="preserve">1.29</w:t>
+              <w:t xml:space="preserve">0.85</w:t>
             </w:r>
           </w:p>
         </w:tc>
@@ -20103,7 +20103,7 @@
         <w:spacing w:after="120" w:line="276"/>
       </w:pPr>
       <w:r>
-        <w:t xml:space="preserve">Stop = price − 3 × ATR(14) (average true range: the stock's typical daily move, Wilder). If a support level lies within 1 ATR below that, the stop moves to just under the support (0.25 ATR buffer), so it is not placed where the price usually bounces. From the snapshot on, stops </w:t>
+        <w:t xml:space="preserve">Stop = price − 5 × ATR(14) (average true range: the stock's typical daily move, Wilder). If a support level lies within 1 ATR below that, the stop moves to just under the support (0.25 ATR buffer), so it is not placed where the price usually bounces. From the snapshot on, stops </w:t>
       </w:r>
       <w:r>
         <w:rPr>
@@ -20113,7 +20113,17 @@
         <w:t xml:space="preserve">only ever rise</w:t>
       </w:r>
       <w:r>
-        <w:t xml:space="preserve"> (trailed at every refresh). Current stops are 13.4-17.2% below price. Why 3 ATR: wide enough that normal daily noise does not trigger it, tight enough to cap a stock's loss at roughly one volatility-month.</w:t>
+        <w:t xml:space="preserve"> (trailed at every refresh). Current stops are 22.2-28.6% below price. </w:t>
+      </w:r>
+      <w:r>
+        <w:rPr>
+          <w:b/>
+          <w:bCs/>
+        </w:rPr>
+        <w:t xml:space="preserve">Why 5 ATR (it was 3 until 28-Sep):</w:t>
+      </w:r>
+      <w:r>
+        <w:t xml:space="preserve"> research/stop_rule_study.py replayed the rule on a point-in-time universe, 2021-2026, with next-day exits, the replacement rule and 0.25% trading costs. On these volatile mid-caps a 3-ATR trailing stop (~13%) sat inside ordinary noise: it fired on about 8 stocks a quarter and cost 3.3 pp per quarter against simply holding (t = −3.4), without improving the worst quarter. Wider stops cost less; 5 ATR trailing cost 1.4 pp and had the best worst quarter of all (−11.6 pp vs −18.0 pp holding). The brief requires a stop, so we keep one at the width that still caps a collapse.</w:t>
       </w:r>
     </w:p>
     <w:p>
@@ -21127,7 +21137,7 @@
                 <w:sz w:val="18"/>
                 <w:szCs w:val="18"/>
               </w:rPr>
-              <w:t xml:space="preserve">Acknowledged; it inflates absolute returns but affects the comparison between rules much less.</w:t>
+              <w:t xml:space="preserve">Measured and mostly corrected (research/survivorship_study.py): it inflated the top 8 by ~3 pp per quarter; point in time the rule still beat the Nifty 500 (+9.9 pp in 2021-23, +1.0 pp in 2024-26) and the signal was slightly stronger. Delisted companies remain a residual bias.</w:t>
             </w:r>
           </w:p>
         </w:tc>
@@ -22144,7 +22154,7 @@
         <w:t xml:space="preserve">A. </w:t>
       </w:r>
       <w:r>
-        <w:t xml:space="preserve">Its latest rise followed new orders (Aramco ~₹2,000 cr on 20-Sep, a record ₹4,000 cr US order on 24-Sep) and profit up 199%. It is extended, which is why it has a 13.9% stop and an equal-risk weight, not a bigger bet.</w:t>
+        <w:t xml:space="preserve">Its latest rise followed new orders (Aramco ~₹2,000 cr on 20-Sep, a record ₹4,000 cr US order on 24-Sep) and profit up 199%. It is extended, which is why it has a stop (23% below)  and an equal-risk weight, not a bigger bet.</w:t>
       </w:r>
     </w:p>
     <w:p>
@@ -22827,7 +22837,7 @@
           <w:b/>
           <w:bCs/>
         </w:rPr>
-        <w:t xml:space="preserve">Why 3 × ATR and not a fixed 10% stop?</w:t>
+        <w:t xml:space="preserve">Why 5 × ATR and not a fixed 10% stop?</w:t>
       </w:r>
     </w:p>
     <w:p>
@@ -22844,7 +22854,7 @@
         <w:t xml:space="preserve">A. </w:t>
       </w:r>
       <w:r>
-        <w:t xml:space="preserve">A fixed percentage ignores volatility: our holdings range from 38% (ACMESOLAR) to 60% (AEROFLEX) annualised, so 10% would be loose for one and inside normal noise for the other. ATR scales each stop to the stock's own daily range; 3 ATR puts today's stops 13-17% below price. The multiple is a judgement (wide enough to survive ordinary weeks, tight enough to cap a loss at roughly a month of volatility), not an optimised number; we did not backtest alternatives.</w:t>
+        <w:t xml:space="preserve">A fixed percentage ignores volatility: our holdings range from 38% (ACMESOLAR) to 60% (AEROFLEX) annualised, so 10% would be loose for one and inside normal noise for the other. ATR scales each stop to the stock's own range; 5 ATR puts today's stops 22-29% below price. We tested widths (research/stop_rule_study.py): 3 ATR trailing fired on ~8 stocks a quarter and cost 3.3 pp per quarter vs holding; 4, 5 and 6 ATR cost 1.6, 1.4 and 0.9 pp. We chose 5, not the cheapest, because it had the best worst quarter (−11.6 pp). Choosing among tested widths is itself a mild data-mining risk, which we state.</w:t>
       </w:r>
     </w:p>
     <w:p>
@@ -22865,7 +22875,7 @@
           <w:b/>
           <w:bCs/>
         </w:rPr>
-        <w:t xml:space="preserve">How did you set the stop-losses?</w:t>
+        <w:t xml:space="preserve">Aren't stops 22-29% below price too wide to be stops?</w:t>
       </w:r>
     </w:p>
     <w:p>
@@ -22882,7 +22892,7 @@
         <w:t xml:space="preserve">A. </w:t>
       </w:r>
       <w:r>
-        <w:t xml:space="preserve">3 × ATR(14) below the price, moved just under a nearby support; trailed upward only. Currently 13.4-17.2% below price.</w:t>
+        <w:t xml:space="preserve">They are wide by design: tighter stops on stocks this volatile sold good positions on ordinary dips and cost 3 pp a quarter in our backtest. The stop is there to cap a collapse (a stock that falls a quarter of its value has broken its trend), and a market-wide crash is covered by the puts. The most the stops let us lose if every stock hit its stop at once is about ₹23 L; a diversified portfolio would not see all eight fall that far together.</w:t>
       </w:r>
     </w:p>
     <w:p>
@@ -22903,7 +22913,7 @@
           <w:b/>
           <w:bCs/>
         </w:rPr>
-        <w:t xml:space="preserve">What happens when a stop is hit?</w:t>
+        <w:t xml:space="preserve">How did you set the stop-losses?</w:t>
       </w:r>
     </w:p>
     <w:p>
@@ -22920,7 +22930,7 @@
         <w:t xml:space="preserve">A. </w:t>
       </w:r>
       <w:r>
-        <w:t xml:space="preserve">Sell; the proceeds buy the next reserve stock that still passes every rule that day; if none does, they top up the other holdings that are still in an uptrend, none above the 15% cap; if none can take it, they wait in the liquid ETF until a stock qualifies. We never add stop-loss money to falling stocks.</w:t>
+        <w:t xml:space="preserve">5 × ATR(14) below the price (3 × until our stop backtest), moved just under a nearby support; trailed upward only. Currently 22.2-28.6% below price.</w:t>
       </w:r>
     </w:p>
     <w:p>
@@ -22941,7 +22951,7 @@
           <w:b/>
           <w:bCs/>
         </w:rPr>
-        <w:t xml:space="preserve">Daily betas understate mid-caps that react a day late. Did you check?</w:t>
+        <w:t xml:space="preserve">What happens when a stop is hit?</w:t>
       </w:r>
     </w:p>
     <w:p>
@@ -22958,7 +22968,7 @@
         <w:t xml:space="preserve">A. </w:t>
       </w:r>
       <w:r>
-        <w:t xml:space="preserve">Yes. A Dimson regression (adding yesterday's and tomorrow's market return) gives a portfolio beta of 1.45 against 1.27 from same-day returns; the lag term is borderline significant (t = 2.2). Weekly returns give 1.25, the same as daily. So the evidence is mixed; if the true beta is 1.45, the hedge would need 9 lots instead of 8 (about ₹9,500 more). We kept 8 and state it as a known limitation.</w:t>
+        <w:t xml:space="preserve">Sell; the proceeds buy the next reserve stock that still passes every rule that day; if none does, they top up the other holdings that are still in an uptrend, none above the 15% cap; if none can take it, they wait in the liquid ETF until a stock qualifies. We never add stop-loss money to falling stocks.</w:t>
       </w:r>
     </w:p>
     <w:p>
@@ -22979,7 +22989,7 @@
           <w:b/>
           <w:bCs/>
         </w:rPr>
-        <w:t xml:space="preserve">Why the overnight rate as risk-free, not the 91-day T-bill?</w:t>
+        <w:t xml:space="preserve">Daily betas understate mid-caps that react a day late. Did you check?</w:t>
       </w:r>
     </w:p>
     <w:p>
@@ -22996,7 +23006,7 @@
         <w:t xml:space="preserve">A. </w:t>
       </w:r>
       <w:r>
-        <w:t xml:space="preserve">Because it is what our cash actually earns: the undeployed money sits in a liquid ETF that tracks the overnight rate (4.95% annualised over the last quarter; 5.33% over the year). A T-bill rate would be a few tenths of a percent higher; it would move a Sharpe ratio in the second decimal and no decision.</w:t>
+        <w:t xml:space="preserve">Yes. A Dimson regression (adding yesterday's and tomorrow's market return) gives a portfolio beta of 1.45 against 1.27 from same-day returns; the lag term is borderline significant (t = 2.2). Weekly returns give 1.25, the same as daily. So the evidence is mixed; if the true beta is 1.45, the hedge would need 9 lots instead of 8 (about ₹9,500 more). We kept 8 and state it as a known limitation.</w:t>
       </w:r>
     </w:p>
     <w:p>
@@ -23017,7 +23027,7 @@
           <w:b/>
           <w:bCs/>
         </w:rPr>
-        <w:t xml:space="preserve">What is your portfolio beta and what does it mean?</w:t>
+        <w:t xml:space="preserve">Why the overnight rate as risk-free, not the 91-day T-bill?</w:t>
       </w:r>
     </w:p>
     <w:p>
@@ -23034,7 +23044,7 @@
         <w:t xml:space="preserve">A. </w:t>
       </w:r>
       <w:r>
-        <w:t xml:space="preserve">1.27 against the Nifty 500: a 1% market move tends to move us ~1.27%. 44.5% of our variance is market risk, 55.5% stock-specific.</w:t>
+        <w:t xml:space="preserve">Because it is what our cash actually earns: the undeployed money sits in a liquid ETF that tracks the overnight rate (4.95% annualised over the last quarter; 5.33% over the year). A T-bill rate would be a few tenths of a percent higher; it would move a Sharpe ratio in the second decimal and no decision.</w:t>
       </w:r>
     </w:p>
     <w:p>
@@ -23055,7 +23065,7 @@
           <w:b/>
           <w:bCs/>
         </w:rPr>
-        <w:t xml:space="preserve">How much of the risk does the hedge remove?</w:t>
+        <w:t xml:space="preserve">What is your portfolio beta and what does it mean?</w:t>
       </w:r>
     </w:p>
     <w:p>
@@ -23072,7 +23082,7 @@
         <w:t xml:space="preserve">A. </w:t>
       </w:r>
       <w:r>
-        <w:t xml:space="preserve">The index hedge addresses market risk only (hedge effectiveness R² ≈ 0.31 vs Nifty 50); stock-specific risk is diversified across 8 names and capped by stops.</w:t>
+        <w:t xml:space="preserve">1.27 against the Nifty 500: a 1% market move tends to move us ~1.27%. 44.5% of our variance is market risk, 55.5% stock-specific.</w:t>
       </w:r>
     </w:p>
     <w:p>
@@ -23093,7 +23103,7 @@
           <w:b/>
           <w:bCs/>
         </w:rPr>
-        <w:t xml:space="preserve">Nifty 50 explains only 31% of your variance. Why not a midcap index?</w:t>
+        <w:t xml:space="preserve">How much of the risk does the hedge remove?</w:t>
       </w:r>
     </w:p>
     <w:p>
@@ -23110,7 +23120,7 @@
         <w:t xml:space="preserve">A. </w:t>
       </w:r>
       <w:r>
-        <w:t xml:space="preserve">No index can hedge the other ~55-70%: even the Nifty 500, which contains every one of our stocks, explains only 44.5% of our variance; the rest is stock-specific and is handled by 8-way diversification, the 15% cap and stops. For the market part we chose the contract that is deepest and runs past 28-Dec: our 22,000 Dec put alone has open interest of ~3.1 million units. We did not backtest a midcap-index hedge.</w:t>
+        <w:t xml:space="preserve">The index hedge addresses market risk only (hedge effectiveness R² ≈ 0.31 vs Nifty 50); stock-specific risk is diversified across 8 names and capped by stops.</w:t>
       </w:r>
     </w:p>
     <w:p>
@@ -23131,7 +23141,7 @@
           <w:b/>
           <w:bCs/>
         </w:rPr>
-        <w:t xml:space="preserve">What if metal prices swing?</w:t>
+        <w:t xml:space="preserve">Nifty 50 explains only 31% of your variance. Why not a midcap index?</w:t>
       </w:r>
     </w:p>
     <w:p>
@@ -23148,7 +23158,7 @@
         <w:t xml:space="preserve">A. </w:t>
       </w:r>
       <w:r>
-        <w:t xml:space="preserve">RAMRAT and APARINDS pass copper and aluminium costs through to customers, so metal prices move their revenue more than their margin (part of RAMRAT's revenue jump is exactly that). WELCORP's pipe orders are priced per project. Measured at portfolio level, adding Brent crude and the 10-year G-sec to the market regression raises R² by only ~0.5 pp; stock-specific shocks are capped by diversification, the 15% limit and stops.</w:t>
+        <w:t xml:space="preserve">No index can hedge the other ~55-70%: even the Nifty 500, which contains every one of our stocks, explains only 44.5% of our variance; the rest is stock-specific and is handled by 8-way diversification, the 15% cap and stops. For the market part we chose the contract that is deepest and runs past 28-Dec: our 22,000 Dec put alone has open interest of ~3.1 million units. We did not backtest a midcap-index hedge.</w:t>
       </w:r>
     </w:p>
     <w:p>
@@ -23169,7 +23179,7 @@
           <w:b/>
           <w:bCs/>
         </w:rPr>
-        <w:t xml:space="preserve">Why puts and not futures?</w:t>
+        <w:t xml:space="preserve">What if metal prices swing?</w:t>
       </w:r>
     </w:p>
     <w:p>
@@ -23186,7 +23196,7 @@
         <w:t xml:space="preserve">A. </w:t>
       </w:r>
       <w:r>
-        <w:t xml:space="preserve">Futures would cancel our upside and need ~₹12.8 L margin. Puts ~5% out of the money insure a crash for ~0.8% of the portfolio and keep the upside.</w:t>
+        <w:t xml:space="preserve">RAMRAT and APARINDS pass copper and aluminium costs through to customers, so metal prices move their revenue more than their margin (part of RAMRAT's revenue jump is exactly that). WELCORP's pipe orders are priced per project. Measured at portfolio level, adding Brent crude and the 10-year G-sec to the market regression raises R² by only ~0.5 pp; stock-specific shocks are capped by diversification, the 15% limit and stops.</w:t>
       </w:r>
     </w:p>
     <w:p>
@@ -23207,7 +23217,7 @@
           <w:b/>
           <w:bCs/>
         </w:rPr>
-        <w:t xml:space="preserve">How many lots and why?</w:t>
+        <w:t xml:space="preserve">Why puts and not futures?</w:t>
       </w:r>
     </w:p>
     <w:p>
@@ -23224,7 +23234,7 @@
         <w:t xml:space="preserve">A. </w:t>
       </w:r>
       <w:r>
-        <w:t xml:space="preserve">8 lots of the 22,000 Dec put: ₹97 L of stocks × downside beta 1.21 ÷ (spot × lot size 65), rounded.</w:t>
+        <w:t xml:space="preserve">Futures would cancel our upside and need ~₹12.8 L margin. Puts ~5% out of the money insure a crash for ~0.8% of the portfolio and keep the upside.</w:t>
       </w:r>
     </w:p>
     <w:p>
@@ -23245,7 +23255,7 @@
           <w:b/>
           <w:bCs/>
         </w:rPr>
-        <w:t xml:space="preserve">When do you change the hedge?</w:t>
+        <w:t xml:space="preserve">How many lots and why?</w:t>
       </w:r>
     </w:p>
     <w:p>
@@ -23262,7 +23272,7 @@
         <w:t xml:space="preserve">A. </w:t>
       </w:r>
       <w:r>
-        <w:t xml:space="preserve">Once, at +10% P&amp;L: roll the puts up to ~5% below the then-current Nifty so a crash cannot take the gain back.</w:t>
+        <w:t xml:space="preserve">8 lots of the 22,000 Dec put: ₹97 L of stocks × downside beta 1.21 ÷ (spot × lot size 65), rounded.</w:t>
       </w:r>
     </w:p>
     <w:p>
@@ -23283,7 +23293,7 @@
           <w:b/>
           <w:bCs/>
         </w:rPr>
-        <w:t xml:space="preserve">Did you test for autocorrelation / predictability?</w:t>
+        <w:t xml:space="preserve">When do you change the hedge?</w:t>
       </w:r>
     </w:p>
     <w:p>
@@ -23300,15 +23310,7 @@
         <w:t xml:space="preserve">A. </w:t>
       </w:r>
       <w:r>
-        <w:t xml:space="preserve">Yes: AR(1) and Ljung-Box on each stock's DAILY returns; no stock is predictable at 5%, so there is nothing to exploit day to day, which is why we do not trade daily. That does not contradict momentum: momentum is persistence over 3-12 MONTHS (slow reaction to news and earnings), which a 1-day autocorrelation test cannot see and does not reject.</w:t>
-      </w:r>
-    </w:p>
-    <w:p>
-      <w:pPr>
-        <w:pStyle w:val="Heading2"/>
-      </w:pPr>
-      <w:r>
-        <w:t xml:space="preserve">Performance and theory</w:t>
+        <w:t xml:space="preserve">Once, at +10% P&amp;L: roll the puts up to ~5% below the then-current Nifty so a crash cannot take the gain back.</w:t>
       </w:r>
     </w:p>
     <w:p>
@@ -23329,7 +23331,7 @@
           <w:b/>
           <w:bCs/>
         </w:rPr>
-        <w:t xml:space="preserve">What are your Sharpe and Treynor?</w:t>
+        <w:t xml:space="preserve">Did you test for autocorrelation / predictability?</w:t>
       </w:r>
     </w:p>
     <w:p>
@@ -23346,7 +23348,15 @@
         <w:t xml:space="preserve">A. </w:t>
       </w:r>
       <w:r>
-        <w:t xml:space="preserve">Past year (ex-post, hindsight): Sharpe 5.6, Treynor 119%. Last quarter annualised: Sharpe 9.6, but that is inflated by annualising a 39% quarter; un-annualised (quarter excess return ÷ quarter volatility) it is 2.3. We report them as the brief asks but stress they measure how the stocks were picked, not what to expect. The live measures start from the 28-Sep snapshot.</w:t>
+        <w:t xml:space="preserve">Yes: AR(1) and Ljung-Box on each stock's DAILY returns; no stock is predictable at 5%, so there is nothing to exploit day to day, which is why we do not trade daily. That does not contradict momentum: momentum is persistence over 3-12 MONTHS (slow reaction to news and earnings), which a 1-day autocorrelation test cannot see and does not reject.</w:t>
+      </w:r>
+    </w:p>
+    <w:p>
+      <w:pPr>
+        <w:pStyle w:val="Heading2"/>
+      </w:pPr>
+      <w:r>
+        <w:t xml:space="preserve">Performance and theory</w:t>
       </w:r>
     </w:p>
     <w:p>
@@ -23367,7 +23377,7 @@
           <w:b/>
           <w:bCs/>
         </w:rPr>
-        <w:t xml:space="preserve">What is the compounding effect?</w:t>
+        <w:t xml:space="preserve">What are your Sharpe and Treynor?</w:t>
       </w:r>
     </w:p>
     <w:p>
@@ -23384,7 +23394,7 @@
         <w:t xml:space="preserve">A. </w:t>
       </w:r>
       <w:r>
-        <w:t xml:space="preserve">As the dashboard defines it, annualised compound return minus annualised simple return: ≈2 pp over the year; the ≈119 pp over the last quarter is an artefact of annualising a 39% quarter, so we do not lean on it. The related 'volatility drag' (arithmetic minus geometric mean ≈ σ²/2) is ≈3.7 pp a year at our 27% volatility.</w:t>
+        <w:t xml:space="preserve">Past year (ex-post, hindsight): Sharpe 5.6, Treynor 119%. Last quarter annualised: Sharpe 9.6, but that is inflated by annualising a 39% quarter; un-annualised (quarter excess return ÷ quarter volatility) it is 2.3. We report them as the brief asks but stress they measure how the stocks were picked, not what to expect. The live measures start from the 28-Sep snapshot.</w:t>
       </w:r>
     </w:p>
     <w:p>
@@ -23405,7 +23415,7 @@
           <w:b/>
           <w:bCs/>
         </w:rPr>
-        <w:t xml:space="preserve">Why not tighten stops to 2 ATR before results?</w:t>
+        <w:t xml:space="preserve">What is the compounding effect?</w:t>
       </w:r>
     </w:p>
     <w:p>
@@ -23422,7 +23432,45 @@
         <w:t xml:space="preserve">A. </w:t>
       </w:r>
       <w:r>
-        <w:t xml:space="preserve">A stop is triggered on a close, so a results gap goes straight through a 2 ATR stop just as through a 3 ATR one; tightening only adds whipsaw exits in the days before results (and our momentum names run hot into results). Gap damage is capped by sizing instead: a 20% gap on the largest (15%) position costs 3% of the portfolio.</w:t>
+        <w:t xml:space="preserve">As the dashboard defines it, annualised compound return minus annualised simple return: ≈2 pp over the year; the ≈119 pp over the last quarter is an artefact of annualising a 39% quarter, so we do not lean on it. The related 'volatility drag' (arithmetic minus geometric mean ≈ σ²/2) is ≈3.7 pp a year at our 27% volatility.</w:t>
+      </w:r>
+    </w:p>
+    <w:p>
+      <w:pPr>
+        <w:keepNext/>
+        <w:spacing w:after="60" w:before="120"/>
+      </w:pPr>
+      <w:r>
+        <w:rPr>
+          <w:b/>
+          <w:bCs/>
+          <w:color w:val="1F3864"/>
+        </w:rPr>
+        <w:t xml:space="preserve">Q. </w:t>
+      </w:r>
+      <w:r>
+        <w:rPr>
+          <w:b/>
+          <w:bCs/>
+        </w:rPr>
+        <w:t xml:space="preserve">Why not tighten stops to 2 ATR before results?</w:t>
+      </w:r>
+    </w:p>
+    <w:p>
+      <w:pPr>
+        <w:spacing w:after="60" w:line="264"/>
+        <w:ind w:left="360"/>
+      </w:pPr>
+      <w:r>
+        <w:rPr>
+          <w:b/>
+          <w:bCs/>
+          <w:color w:val="2E7D32"/>
+        </w:rPr>
+        <w:t xml:space="preserve">A. </w:t>
+      </w:r>
+      <w:r>
+        <w:t xml:space="preserve">A stop is triggered on a close, so a results gap goes straight through a 2 ATR stop just as through a 5 ATR one; tightening only adds whipsaw exits in the days before results (and our momentum names run hot into results). Gap damage is capped by sizing instead: a 20% gap on the largest (15%) position costs 3% of the portfolio.</w:t>
       </w:r>
     </w:p>
     <w:p>
@@ -24054,7 +24102,7 @@
                 <w:sz w:val="18"/>
                 <w:szCs w:val="18"/>
               </w:rPr>
-              <w:t xml:space="preserve">Average true range: the typical daily price range; the stop-loss is 3 ATR below the price.</w:t>
+              <w:t xml:space="preserve">Average true range: the typical daily price range; the stop-loss is 5 ATR below the price.</w:t>
             </w:r>
           </w:p>
         </w:tc>

</xml_diff>

<commit_message>
Capex-cycle exposure: the professor's test, measured nightly
The professor confirmed (29-Sep) that no sector, commodity or ETF is
required; what counts is capturing the capex cycle. capex_exposure.py (a
refresh step) regresses the portfolio on our equal-weight capex universe
and NSE sector/style indices, plus a market + capex + size + momentum
model. Best fit: the capex universe (R^2 0.68 vs 0.45 for the Nifty 500);
capex loading 1.25 (t 6.1), size -0.04, momentum 0.36. Shown on the Risk
tab; README, config notes and the brief (new Section 3.5, Q&A) updated.

Co-Authored-By: Claude Opus 5.5 <noreply@anthropic.com>
Claude-Session: https://claude.ai/code/session_018SrKZ3YP1T4SHJR1stpujJ
</commit_message>
<xml_diff>
--- a/docs/Defence_Brief_Capex_Portfolio.docx
+++ b/docs/Defence_Brief_Capex_Portfolio.docx
@@ -2846,6 +2846,575 @@
       </w:pPr>
       <w:r>
         <w:t xml:space="preserve">Screener's industry labels are not enough, so every excluded or borderline company has a written reason (config.THEME_EXCLUSIONS, BUSINESS_FOCUS_NOTES). Examples: MAZDOCK, COCHINSHIP (defence shipbuilding), KAYNES, SYRMA (electronics manufacturing), PTCIL (titanium castings for aerospace/defence, filed as 'Castings &amp; Forgings'), DYNAMATECH (aerospace structures + auto castings), KSL (special-bar steel for auto forgings). A stock is excluded when its MAIN business is outside the theme; a minority outside the theme is disclosed, not excluded (BEML's ~30% defence; GOODLUCK's ~25% auto tubes).</w:t>
+      </w:r>
+    </w:p>
+    <w:p>
+      <w:pPr>
+        <w:pStyle w:val="Heading2"/>
+      </w:pPr>
+      <w:r>
+        <w:t xml:space="preserve">3.5 Are we capturing the capex cycle? (the professor's test)</w:t>
+      </w:r>
+    </w:p>
+    <w:p>
+      <w:pPr>
+        <w:spacing w:after="120" w:line="276"/>
+      </w:pPr>
+      <w:r>
+        <w:t xml:space="preserve">The professor told us (29-Sep) that he does not mind which sectors, commodities or ETFs we hold; what he cares about is whether the portfolio captures the capex cycle. We answer it two ways: where the money our companies earn comes from, and how the portfolio actually moves.</w:t>
+      </w:r>
+    </w:p>
+    <w:tbl>
+      <w:tblPr>
+        <w:tblW w:type="dxa" w:w="9638"/>
+        <w:tblBorders>
+          <w:top w:val="single" w:color="auto" w:sz="4"/>
+          <w:left w:val="single" w:color="auto" w:sz="4"/>
+          <w:bottom w:val="single" w:color="auto" w:sz="4"/>
+          <w:right w:val="single" w:color="auto" w:sz="4"/>
+          <w:insideH w:val="single" w:color="auto" w:sz="4"/>
+          <w:insideV w:val="single" w:color="auto" w:sz="4"/>
+        </w:tblBorders>
+      </w:tblPr>
+      <w:tblGrid>
+        <w:gridCol w:w="1928"/>
+        <w:gridCol w:w="7710"/>
+      </w:tblGrid>
+      <w:tr>
+        <w:trPr>
+          <w:tblHeader/>
+        </w:trPr>
+        <w:tc>
+          <w:tcPr>
+            <w:tcW w:type="dxa" w:w="1928"/>
+            <w:shd w:fill="1F3864" w:color="auto" w:val="clear"/>
+            <w:tcMar>
+              <w:top w:type="dxa" w:w="60"/>
+              <w:left w:type="dxa" w:w="90"/>
+              <w:bottom w:type="dxa" w:w="60"/>
+              <w:right w:type="dxa" w:w="90"/>
+            </w:tcMar>
+          </w:tcPr>
+          <w:p>
+            <w:pPr>
+              <w:spacing w:after="0"/>
+              <w:jc w:val="left"/>
+            </w:pPr>
+            <w:r>
+              <w:rPr>
+                <w:b/>
+                <w:bCs/>
+                <w:color w:val="FFFFFF"/>
+                <w:sz w:val="18"/>
+                <w:szCs w:val="18"/>
+              </w:rPr>
+              <w:t xml:space="preserve">Holding</w:t>
+            </w:r>
+          </w:p>
+        </w:tc>
+        <w:tc>
+          <w:tcPr>
+            <w:tcW w:type="dxa" w:w="7710"/>
+            <w:shd w:fill="1F3864" w:color="auto" w:val="clear"/>
+            <w:tcMar>
+              <w:top w:type="dxa" w:w="60"/>
+              <w:left w:type="dxa" w:w="90"/>
+              <w:bottom w:type="dxa" w:w="60"/>
+              <w:right w:type="dxa" w:w="90"/>
+            </w:tcMar>
+          </w:tcPr>
+          <w:p>
+            <w:pPr>
+              <w:spacing w:after="0"/>
+              <w:jc w:val="left"/>
+            </w:pPr>
+            <w:r>
+              <w:rPr>
+                <w:b/>
+                <w:bCs/>
+                <w:color w:val="FFFFFF"/>
+                <w:sz w:val="18"/>
+                <w:szCs w:val="18"/>
+              </w:rPr>
+              <w:t xml:space="preserve">Where the capex money reaches it</w:t>
+            </w:r>
+          </w:p>
+        </w:tc>
+      </w:tr>
+      <w:tr>
+        <w:tc>
+          <w:tcPr>
+            <w:tcW w:type="dxa" w:w="1928"/>
+            <w:tcMar>
+              <w:top w:type="dxa" w:w="60"/>
+              <w:left w:type="dxa" w:w="90"/>
+              <w:bottom w:type="dxa" w:w="60"/>
+              <w:right w:type="dxa" w:w="90"/>
+            </w:tcMar>
+          </w:tcPr>
+          <w:p>
+            <w:pPr>
+              <w:spacing w:after="0"/>
+              <w:jc w:val="left"/>
+            </w:pPr>
+            <w:r>
+              <w:rPr>
+                <w:b w:val="false"/>
+                <w:bCs w:val="false"/>
+                <w:sz w:val="18"/>
+                <w:szCs w:val="18"/>
+              </w:rPr>
+              <w:t xml:space="preserve">WELCORP</w:t>
+            </w:r>
+          </w:p>
+        </w:tc>
+        <w:tc>
+          <w:tcPr>
+            <w:tcW w:type="dxa" w:w="7710"/>
+            <w:tcMar>
+              <w:top w:type="dxa" w:w="60"/>
+              <w:left w:type="dxa" w:w="90"/>
+              <w:bottom w:type="dxa" w:w="60"/>
+              <w:right w:type="dxa" w:w="90"/>
+            </w:tcMar>
+          </w:tcPr>
+          <w:p>
+            <w:pPr>
+              <w:spacing w:after="0"/>
+              <w:jc w:val="left"/>
+            </w:pPr>
+            <w:r>
+              <w:rPr>
+                <w:b w:val="false"/>
+                <w:bCs w:val="false"/>
+                <w:sz w:val="18"/>
+                <w:szCs w:val="18"/>
+              </w:rPr>
+              <w:t xml:space="preserve">Oil &amp; gas and water pipelines (line pipe): energy and water infrastructure</w:t>
+            </w:r>
+          </w:p>
+        </w:tc>
+      </w:tr>
+      <w:tr>
+        <w:tc>
+          <w:tcPr>
+            <w:tcW w:type="dxa" w:w="1928"/>
+            <w:shd w:fill="F2F2F2" w:color="auto" w:val="clear"/>
+            <w:tcMar>
+              <w:top w:type="dxa" w:w="60"/>
+              <w:left w:type="dxa" w:w="90"/>
+              <w:bottom w:type="dxa" w:w="60"/>
+              <w:right w:type="dxa" w:w="90"/>
+            </w:tcMar>
+          </w:tcPr>
+          <w:p>
+            <w:pPr>
+              <w:spacing w:after="0"/>
+              <w:jc w:val="left"/>
+            </w:pPr>
+            <w:r>
+              <w:rPr>
+                <w:b w:val="false"/>
+                <w:bCs w:val="false"/>
+                <w:sz w:val="18"/>
+                <w:szCs w:val="18"/>
+              </w:rPr>
+              <w:t xml:space="preserve">RPEL</w:t>
+            </w:r>
+          </w:p>
+        </w:tc>
+        <w:tc>
+          <w:tcPr>
+            <w:tcW w:type="dxa" w:w="7710"/>
+            <w:shd w:fill="F2F2F2" w:color="auto" w:val="clear"/>
+            <w:tcMar>
+              <w:top w:type="dxa" w:w="60"/>
+              <w:left w:type="dxa" w:w="90"/>
+              <w:bottom w:type="dxa" w:w="60"/>
+              <w:right w:type="dxa" w:w="90"/>
+            </w:tcMar>
+          </w:tcPr>
+          <w:p>
+            <w:pPr>
+              <w:spacing w:after="0"/>
+              <w:jc w:val="left"/>
+            </w:pPr>
+            <w:r>
+              <w:rPr>
+                <w:b w:val="false"/>
+                <w:bCs w:val="false"/>
+                <w:sz w:val="18"/>
+                <w:szCs w:val="18"/>
+              </w:rPr>
+              <w:t xml:space="preserve">Steel-plant refractories: new steel capacity, TMT for construction</w:t>
+            </w:r>
+          </w:p>
+        </w:tc>
+      </w:tr>
+      <w:tr>
+        <w:tc>
+          <w:tcPr>
+            <w:tcW w:type="dxa" w:w="1928"/>
+            <w:tcMar>
+              <w:top w:type="dxa" w:w="60"/>
+              <w:left w:type="dxa" w:w="90"/>
+              <w:bottom w:type="dxa" w:w="60"/>
+              <w:right w:type="dxa" w:w="90"/>
+            </w:tcMar>
+          </w:tcPr>
+          <w:p>
+            <w:pPr>
+              <w:spacing w:after="0"/>
+              <w:jc w:val="left"/>
+            </w:pPr>
+            <w:r>
+              <w:rPr>
+                <w:b w:val="false"/>
+                <w:bCs w:val="false"/>
+                <w:sz w:val="18"/>
+                <w:szCs w:val="18"/>
+              </w:rPr>
+              <w:t xml:space="preserve">SBCL</w:t>
+            </w:r>
+          </w:p>
+        </w:tc>
+        <w:tc>
+          <w:tcPr>
+            <w:tcW w:type="dxa" w:w="7710"/>
+            <w:tcMar>
+              <w:top w:type="dxa" w:w="60"/>
+              <w:left w:type="dxa" w:w="90"/>
+              <w:bottom w:type="dxa" w:w="60"/>
+              <w:right w:type="dxa" w:w="90"/>
+            </w:tcMar>
+          </w:tcPr>
+          <w:p>
+            <w:pPr>
+              <w:spacing w:after="0"/>
+              <w:jc w:val="left"/>
+            </w:pPr>
+            <w:r>
+              <w:rPr>
+                <w:b w:val="false"/>
+                <w:bCs w:val="false"/>
+                <w:sz w:val="18"/>
+                <w:szCs w:val="18"/>
+              </w:rPr>
+              <w:t xml:space="preserve">Switchgear and smart-meter components: power distribution upgrade</w:t>
+            </w:r>
+          </w:p>
+        </w:tc>
+      </w:tr>
+      <w:tr>
+        <w:tc>
+          <w:tcPr>
+            <w:tcW w:type="dxa" w:w="1928"/>
+            <w:shd w:fill="F2F2F2" w:color="auto" w:val="clear"/>
+            <w:tcMar>
+              <w:top w:type="dxa" w:w="60"/>
+              <w:left w:type="dxa" w:w="90"/>
+              <w:bottom w:type="dxa" w:w="60"/>
+              <w:right w:type="dxa" w:w="90"/>
+            </w:tcMar>
+          </w:tcPr>
+          <w:p>
+            <w:pPr>
+              <w:spacing w:after="0"/>
+              <w:jc w:val="left"/>
+            </w:pPr>
+            <w:r>
+              <w:rPr>
+                <w:b w:val="false"/>
+                <w:bCs w:val="false"/>
+                <w:sz w:val="18"/>
+                <w:szCs w:val="18"/>
+              </w:rPr>
+              <w:t xml:space="preserve">AEROFLEX</w:t>
+            </w:r>
+          </w:p>
+        </w:tc>
+        <w:tc>
+          <w:tcPr>
+            <w:tcW w:type="dxa" w:w="7710"/>
+            <w:shd w:fill="F2F2F2" w:color="auto" w:val="clear"/>
+            <w:tcMar>
+              <w:top w:type="dxa" w:w="60"/>
+              <w:left w:type="dxa" w:w="90"/>
+              <w:bottom w:type="dxa" w:w="60"/>
+              <w:right w:type="dxa" w:w="90"/>
+            </w:tcMar>
+          </w:tcPr>
+          <w:p>
+            <w:pPr>
+              <w:spacing w:after="0"/>
+              <w:jc w:val="left"/>
+            </w:pPr>
+            <w:r>
+              <w:rPr>
+                <w:b w:val="false"/>
+                <w:bCs w:val="false"/>
+                <w:sz w:val="18"/>
+                <w:szCs w:val="18"/>
+              </w:rPr>
+              <w:t xml:space="preserve">Flow hoses for process plants: industrial and oil &amp; gas capex</w:t>
+            </w:r>
+          </w:p>
+        </w:tc>
+      </w:tr>
+      <w:tr>
+        <w:tc>
+          <w:tcPr>
+            <w:tcW w:type="dxa" w:w="1928"/>
+            <w:tcMar>
+              <w:top w:type="dxa" w:w="60"/>
+              <w:left w:type="dxa" w:w="90"/>
+              <w:bottom w:type="dxa" w:w="60"/>
+              <w:right w:type="dxa" w:w="90"/>
+            </w:tcMar>
+          </w:tcPr>
+          <w:p>
+            <w:pPr>
+              <w:spacing w:after="0"/>
+              <w:jc w:val="left"/>
+            </w:pPr>
+            <w:r>
+              <w:rPr>
+                <w:b w:val="false"/>
+                <w:bCs w:val="false"/>
+                <w:sz w:val="18"/>
+                <w:szCs w:val="18"/>
+              </w:rPr>
+              <w:t xml:space="preserve">TDPOWERSYS</w:t>
+            </w:r>
+          </w:p>
+        </w:tc>
+        <w:tc>
+          <w:tcPr>
+            <w:tcW w:type="dxa" w:w="7710"/>
+            <w:tcMar>
+              <w:top w:type="dxa" w:w="60"/>
+              <w:left w:type="dxa" w:w="90"/>
+              <w:bottom w:type="dxa" w:w="60"/>
+              <w:right w:type="dxa" w:w="90"/>
+            </w:tcMar>
+          </w:tcPr>
+          <w:p>
+            <w:pPr>
+              <w:spacing w:after="0"/>
+              <w:jc w:val="left"/>
+            </w:pPr>
+            <w:r>
+              <w:rPr>
+                <w:b w:val="false"/>
+                <w:bCs w:val="false"/>
+                <w:sz w:val="18"/>
+                <w:szCs w:val="18"/>
+              </w:rPr>
+              <w:t xml:space="preserve">Generators and motors for power plants: generation capex</w:t>
+            </w:r>
+          </w:p>
+        </w:tc>
+      </w:tr>
+      <w:tr>
+        <w:tc>
+          <w:tcPr>
+            <w:tcW w:type="dxa" w:w="1928"/>
+            <w:shd w:fill="F2F2F2" w:color="auto" w:val="clear"/>
+            <w:tcMar>
+              <w:top w:type="dxa" w:w="60"/>
+              <w:left w:type="dxa" w:w="90"/>
+              <w:bottom w:type="dxa" w:w="60"/>
+              <w:right w:type="dxa" w:w="90"/>
+            </w:tcMar>
+          </w:tcPr>
+          <w:p>
+            <w:pPr>
+              <w:spacing w:after="0"/>
+              <w:jc w:val="left"/>
+            </w:pPr>
+            <w:r>
+              <w:rPr>
+                <w:b w:val="false"/>
+                <w:bCs w:val="false"/>
+                <w:sz w:val="18"/>
+                <w:szCs w:val="18"/>
+              </w:rPr>
+              <w:t xml:space="preserve">RAMRAT</w:t>
+            </w:r>
+          </w:p>
+        </w:tc>
+        <w:tc>
+          <w:tcPr>
+            <w:tcW w:type="dxa" w:w="7710"/>
+            <w:shd w:fill="F2F2F2" w:color="auto" w:val="clear"/>
+            <w:tcMar>
+              <w:top w:type="dxa" w:w="60"/>
+              <w:left w:type="dxa" w:w="90"/>
+              <w:bottom w:type="dxa" w:w="60"/>
+              <w:right w:type="dxa" w:w="90"/>
+            </w:tcMar>
+          </w:tcPr>
+          <w:p>
+            <w:pPr>
+              <w:spacing w:after="0"/>
+              <w:jc w:val="left"/>
+            </w:pPr>
+            <w:r>
+              <w:rPr>
+                <w:b w:val="false"/>
+                <w:bCs w:val="false"/>
+                <w:sz w:val="18"/>
+                <w:szCs w:val="18"/>
+              </w:rPr>
+              <w:t xml:space="preserve">Winding wires for motors and transformers: electrical equipment, grid</w:t>
+            </w:r>
+          </w:p>
+        </w:tc>
+      </w:tr>
+      <w:tr>
+        <w:tc>
+          <w:tcPr>
+            <w:tcW w:type="dxa" w:w="1928"/>
+            <w:tcMar>
+              <w:top w:type="dxa" w:w="60"/>
+              <w:left w:type="dxa" w:w="90"/>
+              <w:bottom w:type="dxa" w:w="60"/>
+              <w:right w:type="dxa" w:w="90"/>
+            </w:tcMar>
+          </w:tcPr>
+          <w:p>
+            <w:pPr>
+              <w:spacing w:after="0"/>
+              <w:jc w:val="left"/>
+            </w:pPr>
+            <w:r>
+              <w:rPr>
+                <w:b w:val="false"/>
+                <w:bCs w:val="false"/>
+                <w:sz w:val="18"/>
+                <w:szCs w:val="18"/>
+              </w:rPr>
+              <w:t xml:space="preserve">APARINDS</w:t>
+            </w:r>
+          </w:p>
+        </w:tc>
+        <w:tc>
+          <w:tcPr>
+            <w:tcW w:type="dxa" w:w="7710"/>
+            <w:tcMar>
+              <w:top w:type="dxa" w:w="60"/>
+              <w:left w:type="dxa" w:w="90"/>
+              <w:bottom w:type="dxa" w:w="60"/>
+              <w:right w:type="dxa" w:w="90"/>
+            </w:tcMar>
+          </w:tcPr>
+          <w:p>
+            <w:pPr>
+              <w:spacing w:after="0"/>
+              <w:jc w:val="left"/>
+            </w:pPr>
+            <w:r>
+              <w:rPr>
+                <w:b w:val="false"/>
+                <w:bCs w:val="false"/>
+                <w:sz w:val="18"/>
+                <w:szCs w:val="18"/>
+              </w:rPr>
+              <w:t xml:space="preserve">Conductors, cables, transformer oils: transmission and distribution</w:t>
+            </w:r>
+          </w:p>
+        </w:tc>
+      </w:tr>
+      <w:tr>
+        <w:tc>
+          <w:tcPr>
+            <w:tcW w:type="dxa" w:w="1928"/>
+            <w:shd w:fill="F2F2F2" w:color="auto" w:val="clear"/>
+            <w:tcMar>
+              <w:top w:type="dxa" w:w="60"/>
+              <w:left w:type="dxa" w:w="90"/>
+              <w:bottom w:type="dxa" w:w="60"/>
+              <w:right w:type="dxa" w:w="90"/>
+            </w:tcMar>
+          </w:tcPr>
+          <w:p>
+            <w:pPr>
+              <w:spacing w:after="0"/>
+              <w:jc w:val="left"/>
+            </w:pPr>
+            <w:r>
+              <w:rPr>
+                <w:b w:val="false"/>
+                <w:bCs w:val="false"/>
+                <w:sz w:val="18"/>
+                <w:szCs w:val="18"/>
+              </w:rPr>
+              <w:t xml:space="preserve">ACMESOLAR</w:t>
+            </w:r>
+          </w:p>
+        </w:tc>
+        <w:tc>
+          <w:tcPr>
+            <w:tcW w:type="dxa" w:w="7710"/>
+            <w:shd w:fill="F2F2F2" w:color="auto" w:val="clear"/>
+            <w:tcMar>
+              <w:top w:type="dxa" w:w="60"/>
+              <w:left w:type="dxa" w:w="90"/>
+              <w:bottom w:type="dxa" w:w="60"/>
+              <w:right w:type="dxa" w:w="90"/>
+            </w:tcMar>
+          </w:tcPr>
+          <w:p>
+            <w:pPr>
+              <w:spacing w:after="0"/>
+              <w:jc w:val="left"/>
+            </w:pPr>
+            <w:r>
+              <w:rPr>
+                <w:b w:val="false"/>
+                <w:bCs w:val="false"/>
+                <w:sz w:val="18"/>
+                <w:szCs w:val="18"/>
+              </w:rPr>
+              <w:t xml:space="preserve">Renewable power producer: generation build-out (energy transition)</w:t>
+            </w:r>
+          </w:p>
+        </w:tc>
+      </w:tr>
+    </w:tbl>
+    <w:p>
+      <w:pPr>
+        <w:spacing w:after="120"/>
+      </w:pPr>
+    </w:p>
+    <w:p>
+      <w:pPr>
+        <w:spacing w:after="120" w:line="276"/>
+      </w:pPr>
+      <w:r>
+        <w:rPr>
+          <w:b/>
+          <w:bCs/>
+        </w:rPr>
+        <w:t xml:space="preserve">How the portfolio moves (capex_exposure.py, past year, daily).</w:t>
+      </w:r>
+      <w:r>
+        <w:t xml:space="preserve"> Regressed on each benchmark in turn, it behaves most like our capex universe (all 157 universe stocks, equal weight: R² 0.68, beta 1.12), more than like the Nifty 500 (0.45), Momentum 50 (0.49), Smallcap 500 (0.61), Nifty Infrastructure (0.39), Cement (0.34) or Power (0.05). Holding the market, size and momentum constant, the capex loading is 1.25 (t = 6.1), size −0.04 (t = −0.1), momentum 0.36 (t = 2.4). So it carries the capex cycle itself, not a disguised small-cap bet (capex and size are correlated, 0.81, so we read that split with care). The cycle has been rewarding: the capex universe returned about +16% over the year against −2% for the Nifty 500.</w:t>
+      </w:r>
+    </w:p>
+    <w:p>
+      <w:pPr>
+        <w:spacing w:after="120" w:line="276"/>
+      </w:pPr>
+      <w:r>
+        <w:rPr>
+          <w:b/>
+          <w:bCs/>
+        </w:rPr>
+        <w:t xml:space="preserve">What we capture and what we do not.</w:t>
+      </w:r>
+      <w:r>
+        <w:t xml:space="preserve"> We hold the companies that receive capex spending (equipment, components, EPC), not the utilities that own the finished assets (Power R² 0.05) or the building materials (Cement 0.34). That is deliberate: order books and margins move with the spending cycle; utility returns move with tariffs and rates.</w:t>
       </w:r>
     </w:p>
     <w:p>
@@ -19043,7 +19612,7 @@
         <w:spacing w:after="120" w:line="276"/>
       </w:pPr>
       <w:r>
-        <w:t xml:space="preserve">The rule is sector-neutral: no quotas. Cement stocks have not outperformed (NUVOCO, the best, has a 6-month RS of ~+1%), so none makes the 15. Forcing a cement leg would mean buying a weaker stock to look balanced. If the professor requires a cement leg, NUVOCO is the rule-consistent choice (it passes every screen).</w:t>
+        <w:t xml:space="preserve">The rule is sector-neutral: no quotas. Cement stocks have not outperformed (NUVOCO, the best, has a 6-month RS of ~+1%), so none makes the 15. Forcing a cement leg would mean buying a weaker stock to look balanced. The professor confirmed (29-Sep) that no sector, commodity or ETF is required: what he looks for is whether the portfolio captures the capex cycle (Section 3.5).</w:t>
       </w:r>
     </w:p>
     <w:p>
@@ -21193,7 +21762,7 @@
                 <w:sz w:val="18"/>
                 <w:szCs w:val="18"/>
               </w:rPr>
-              <w:t xml:space="preserve">The rule has no sector quotas. We tested quotas (research/sector_quota_study.py): one Cement + one Power in the top 8 trailed the pure ranking by 2.1 and 1.3 pp per quarter (2021-23, 2024-26), balanced 3/3/2 pillars by 2.6 and 1.1 pp, and neither lowered risk out of sample. The holdings are also less alike than the label suggests (average correlation 0.25). Cement leg available if required (NUVOCO).</w:t>
+              <w:t xml:space="preserve">The rule has no sector quotas. We tested quotas (research/sector_quota_study.py): one Cement + one Power in the top 8 trailed the pure ranking by 2.1 and 1.3 pp per quarter (2021-23, 2024-26), balanced 3/3/2 pillars by 2.6 and 1.1 pp, and neither lowered risk out of sample. The holdings are also less alike than the label suggests (average correlation 0.25). The professor confirmed no sector is required; the test is whether we capture the capex cycle, and we do (Section 3.5).</w:t>
             </w:r>
           </w:p>
         </w:tc>
@@ -22459,6 +23028,44 @@
       </w:r>
       <w:r>
         <w:t xml:space="preserve">Weights differ from 12.5% by at most 3.3 pp, and ERC's volatility is 27.0% vs 28.0% for equal weight: a modest, free gain, because the eight stocks' volatilities are similar. The method matters more when a stock is much riskier than the rest.</w:t>
+      </w:r>
+    </w:p>
+    <w:p>
+      <w:pPr>
+        <w:keepNext/>
+        <w:spacing w:after="60" w:before="120"/>
+      </w:pPr>
+      <w:r>
+        <w:rPr>
+          <w:b/>
+          <w:bCs/>
+          <w:color w:val="1F3864"/>
+        </w:rPr>
+        <w:t xml:space="preserve">Q. </w:t>
+      </w:r>
+      <w:r>
+        <w:rPr>
+          <w:b/>
+          <w:bCs/>
+        </w:rPr>
+        <w:t xml:space="preserve">How do you know you are capturing the capex cycle?</w:t>
+      </w:r>
+    </w:p>
+    <w:p>
+      <w:pPr>
+        <w:spacing w:after="60" w:line="264"/>
+        <w:ind w:left="360"/>
+      </w:pPr>
+      <w:r>
+        <w:rPr>
+          <w:b/>
+          <w:bCs/>
+          <w:color w:val="2E7D32"/>
+        </w:rPr>
+        <w:t xml:space="preserve">A. </w:t>
+      </w:r>
+      <w:r>
+        <w:t xml:space="preserve">Two ways. Business: every holding sells into a capex stream (pipelines, steel capacity, grid and distribution, power generation, process plants). Behaviour: the portfolio tracks our capex universe (R² 0.68) better than the Nifty 500 (0.45) or any style index, and its capex loading stays large and significant (1.25, t = 6.1) after controlling for market, size and momentum. Live on the dashboard's Risk tab, refreshed nightly.</w:t>
       </w:r>
     </w:p>
     <w:p>

</xml_diff>

<commit_message>
Brief: autocorrelation answer matches current data (SBCL flagged, chance level)
Co-Authored-By: Claude Opus 5.5 <noreply@anthropic.com>
Claude-Session: https://claude.ai/code/session_018SrKZ3YP1T4SHJR1stpujJ
</commit_message>
<xml_diff>
--- a/docs/Defence_Brief_Capex_Portfolio.docx
+++ b/docs/Defence_Brief_Capex_Portfolio.docx
@@ -369,7 +369,7 @@
                 <w:sz w:val="18"/>
                 <w:szCs w:val="18"/>
               </w:rPr>
-              <w:t xml:space="preserve">WELCORP 13.8%, RPEL 11.2%, SBCL 12.7%, AEROFLEX 9.2%, TDPOWERSYS 11.3%, RAMRAT 14.3%, APARINDS 12.4%, ACMESOLAR 15.0%</w:t>
+              <w:t xml:space="preserve">WELCORP 13.8%, RPEL 11.3%, SBCL 12.7%, AEROFLEX 9.2%, TDPOWERSYS 11.2%, RAMRAT 14.4%, APARINDS 12.4%, ACMESOLAR 15.0%</w:t>
             </w:r>
           </w:p>
         </w:tc>
@@ -5834,7 +5834,7 @@
                 <w:sz w:val="18"/>
                 <w:szCs w:val="18"/>
               </w:rPr>
-              <w:t xml:space="preserve">+89%</w:t>
+              <w:t xml:space="preserve">+97%</w:t>
             </w:r>
           </w:p>
         </w:tc>
@@ -5886,7 +5886,7 @@
                 <w:sz w:val="18"/>
                 <w:szCs w:val="18"/>
               </w:rPr>
-              <w:t xml:space="preserve">219</w:t>
+              <w:t xml:space="preserve">239</w:t>
             </w:r>
           </w:p>
         </w:tc>
@@ -5964,7 +5964,7 @@
                 <w:sz w:val="18"/>
                 <w:szCs w:val="18"/>
               </w:rPr>
-              <w:t xml:space="preserve">23.1%</w:t>
+              <w:t xml:space="preserve">24.4%</w:t>
             </w:r>
           </w:p>
         </w:tc>
@@ -6126,7 +6126,7 @@
                 <w:sz w:val="18"/>
                 <w:szCs w:val="18"/>
               </w:rPr>
-              <w:t xml:space="preserve">+48%</w:t>
+              <w:t xml:space="preserve">+42%</w:t>
             </w:r>
           </w:p>
         </w:tc>
@@ -6180,7 +6180,7 @@
                 <w:sz w:val="18"/>
                 <w:szCs w:val="18"/>
               </w:rPr>
-              <w:t xml:space="preserve">11</w:t>
+              <w:t xml:space="preserve">10</w:t>
             </w:r>
           </w:p>
         </w:tc>
@@ -6234,7 +6234,7 @@
                 <w:sz w:val="18"/>
                 <w:szCs w:val="18"/>
               </w:rPr>
-              <w:t xml:space="preserve">11.2%</w:t>
+              <w:t xml:space="preserve">11.3%</w:t>
             </w:r>
           </w:p>
         </w:tc>
@@ -6261,7 +6261,7 @@
                 <w:sz w:val="18"/>
                 <w:szCs w:val="18"/>
               </w:rPr>
-              <w:t xml:space="preserve">28.6%</w:t>
+              <w:t xml:space="preserve">26.9%</w:t>
             </w:r>
           </w:p>
         </w:tc>
@@ -6315,7 +6315,7 @@
                 <w:sz w:val="18"/>
                 <w:szCs w:val="18"/>
               </w:rPr>
-              <w:t xml:space="preserve">1.68</w:t>
+              <w:t xml:space="preserve">1.66</w:t>
             </w:r>
           </w:p>
         </w:tc>
@@ -6421,7 +6421,7 @@
                 <w:sz w:val="18"/>
                 <w:szCs w:val="18"/>
               </w:rPr>
-              <w:t xml:space="preserve">+56%</w:t>
+              <w:t xml:space="preserve">+52%</w:t>
             </w:r>
           </w:p>
         </w:tc>
@@ -6473,7 +6473,7 @@
                 <w:sz w:val="18"/>
                 <w:szCs w:val="18"/>
               </w:rPr>
-              <w:t xml:space="preserve">28</w:t>
+              <w:t xml:space="preserve">25</w:t>
             </w:r>
           </w:p>
         </w:tc>
@@ -6551,7 +6551,7 @@
                 <w:sz w:val="18"/>
                 <w:szCs w:val="18"/>
               </w:rPr>
-              <w:t xml:space="preserve">25.7%</w:t>
+              <w:t xml:space="preserve">26.1%</w:t>
             </w:r>
           </w:p>
         </w:tc>
@@ -6603,7 +6603,7 @@
                 <w:sz w:val="18"/>
                 <w:szCs w:val="18"/>
               </w:rPr>
-              <w:t xml:space="preserve">1.43</w:t>
+              <w:t xml:space="preserve">1.44</w:t>
             </w:r>
           </w:p>
         </w:tc>
@@ -6713,7 +6713,7 @@
                 <w:sz w:val="18"/>
                 <w:szCs w:val="18"/>
               </w:rPr>
-              <w:t xml:space="preserve">+14%</w:t>
+              <w:t xml:space="preserve">+15%</w:t>
             </w:r>
           </w:p>
         </w:tc>
@@ -6848,7 +6848,7 @@
                 <w:sz w:val="18"/>
                 <w:szCs w:val="18"/>
               </w:rPr>
-              <w:t xml:space="preserve">25.7%</w:t>
+              <w:t xml:space="preserve">25.0%</w:t>
             </w:r>
           </w:p>
         </w:tc>
@@ -6902,7 +6902,7 @@
                 <w:sz w:val="18"/>
                 <w:szCs w:val="18"/>
               </w:rPr>
-              <w:t xml:space="preserve">1.91</w:t>
+              <w:t xml:space="preserve">1.89</w:t>
             </w:r>
           </w:p>
         </w:tc>
@@ -7008,7 +7008,7 @@
                 <w:sz w:val="18"/>
                 <w:szCs w:val="18"/>
               </w:rPr>
-              <w:t xml:space="preserve">+24%</w:t>
+              <w:t xml:space="preserve">+35%</w:t>
             </w:r>
           </w:p>
         </w:tc>
@@ -7060,7 +7060,7 @@
                 <w:sz w:val="18"/>
                 <w:szCs w:val="18"/>
               </w:rPr>
-              <w:t xml:space="preserve">124</w:t>
+              <w:t xml:space="preserve">129</w:t>
             </w:r>
           </w:p>
         </w:tc>
@@ -7112,7 +7112,7 @@
                 <w:sz w:val="18"/>
                 <w:szCs w:val="18"/>
               </w:rPr>
-              <w:t xml:space="preserve">11.3%</w:t>
+              <w:t xml:space="preserve">11.2%</w:t>
             </w:r>
           </w:p>
         </w:tc>
@@ -7138,7 +7138,7 @@
                 <w:sz w:val="18"/>
                 <w:szCs w:val="18"/>
               </w:rPr>
-              <w:t xml:space="preserve">24.4%</w:t>
+              <w:t xml:space="preserve">26.0%</w:t>
             </w:r>
           </w:p>
         </w:tc>
@@ -7300,7 +7300,7 @@
                 <w:sz w:val="18"/>
                 <w:szCs w:val="18"/>
               </w:rPr>
-              <w:t xml:space="preserve">+43%</w:t>
+              <w:t xml:space="preserve">+48%</w:t>
             </w:r>
           </w:p>
         </w:tc>
@@ -7354,7 +7354,7 @@
                 <w:sz w:val="18"/>
                 <w:szCs w:val="18"/>
               </w:rPr>
-              <w:t xml:space="preserve">8</w:t>
+              <w:t xml:space="preserve">9</w:t>
             </w:r>
           </w:p>
         </w:tc>
@@ -7408,7 +7408,7 @@
                 <w:sz w:val="18"/>
                 <w:szCs w:val="18"/>
               </w:rPr>
-              <w:t xml:space="preserve">14.3%</w:t>
+              <w:t xml:space="preserve">14.4%</w:t>
             </w:r>
           </w:p>
         </w:tc>
@@ -7435,7 +7435,7 @@
                 <w:sz w:val="18"/>
                 <w:szCs w:val="18"/>
               </w:rPr>
-              <w:t xml:space="preserve">22.3%</w:t>
+              <w:t xml:space="preserve">21.7%</w:t>
             </w:r>
           </w:p>
         </w:tc>
@@ -7489,7 +7489,7 @@
                 <w:sz w:val="18"/>
                 <w:szCs w:val="18"/>
               </w:rPr>
-              <w:t xml:space="preserve">1.30</w:t>
+              <w:t xml:space="preserve">1.28</w:t>
             </w:r>
           </w:p>
         </w:tc>
@@ -7595,7 +7595,7 @@
                 <w:sz w:val="18"/>
                 <w:szCs w:val="18"/>
               </w:rPr>
-              <w:t xml:space="preserve">+13%</w:t>
+              <w:t xml:space="preserve">+26%</w:t>
             </w:r>
           </w:p>
         </w:tc>
@@ -7647,7 +7647,7 @@
                 <w:sz w:val="18"/>
                 <w:szCs w:val="18"/>
               </w:rPr>
-              <w:t xml:space="preserve">214</w:t>
+              <w:t xml:space="preserve">217</w:t>
             </w:r>
           </w:p>
         </w:tc>
@@ -7725,7 +7725,7 @@
                 <w:sz w:val="18"/>
                 <w:szCs w:val="18"/>
               </w:rPr>
-              <w:t xml:space="preserve">22.5%</w:t>
+              <w:t xml:space="preserve">22.3%</w:t>
             </w:r>
           </w:p>
         </w:tc>
@@ -7887,7 +7887,7 @@
                 <w:sz w:val="18"/>
                 <w:szCs w:val="18"/>
               </w:rPr>
-              <w:t xml:space="preserve">+19%</w:t>
+              <w:t xml:space="preserve">+16%</w:t>
             </w:r>
           </w:p>
         </w:tc>
@@ -7941,7 +7941,7 @@
                 <w:sz w:val="18"/>
                 <w:szCs w:val="18"/>
               </w:rPr>
-              <w:t xml:space="preserve">58</w:t>
+              <w:t xml:space="preserve">57</w:t>
             </w:r>
           </w:p>
         </w:tc>
@@ -8022,7 +8022,7 @@
                 <w:sz w:val="18"/>
                 <w:szCs w:val="18"/>
               </w:rPr>
-              <w:t xml:space="preserve">22.2%</w:t>
+              <w:t xml:space="preserve">21.8%</w:t>
             </w:r>
           </w:p>
         </w:tc>
@@ -8076,7 +8076,7 @@
                 <w:sz w:val="18"/>
                 <w:szCs w:val="18"/>
               </w:rPr>
-              <w:t xml:space="preserve">0.40</w:t>
+              <w:t xml:space="preserve">0.41</w:t>
             </w:r>
           </w:p>
         </w:tc>
@@ -10138,7 +10138,7 @@
                 <w:sz w:val="18"/>
                 <w:szCs w:val="18"/>
               </w:rPr>
-              <w:t xml:space="preserve">+27%</w:t>
+              <w:t xml:space="preserve">+40%</w:t>
             </w:r>
           </w:p>
         </w:tc>
@@ -10190,7 +10190,7 @@
                 <w:sz w:val="18"/>
                 <w:szCs w:val="18"/>
               </w:rPr>
-              <w:t xml:space="preserve">24</w:t>
+              <w:t xml:space="preserve">25</w:t>
             </w:r>
           </w:p>
         </w:tc>
@@ -10326,7 +10326,7 @@
                 <w:sz w:val="18"/>
                 <w:szCs w:val="18"/>
               </w:rPr>
-              <w:t xml:space="preserve">+26%</w:t>
+              <w:t xml:space="preserve">+30%</w:t>
             </w:r>
           </w:p>
         </w:tc>
@@ -10380,7 +10380,7 @@
                 <w:sz w:val="18"/>
                 <w:szCs w:val="18"/>
               </w:rPr>
-              <w:t xml:space="preserve">56</w:t>
+              <w:t xml:space="preserve">61</w:t>
             </w:r>
           </w:p>
         </w:tc>
@@ -10513,7 +10513,7 @@
                 <w:sz w:val="18"/>
                 <w:szCs w:val="18"/>
               </w:rPr>
-              <w:t xml:space="preserve">-6%</w:t>
+              <w:t xml:space="preserve">-7%</w:t>
             </w:r>
           </w:p>
         </w:tc>
@@ -10701,7 +10701,7 @@
                 <w:sz w:val="18"/>
                 <w:szCs w:val="18"/>
               </w:rPr>
-              <w:t xml:space="preserve">+26%</w:t>
+              <w:t xml:space="preserve">+25%</w:t>
             </w:r>
           </w:p>
         </w:tc>
@@ -10888,7 +10888,7 @@
                 <w:sz w:val="18"/>
                 <w:szCs w:val="18"/>
               </w:rPr>
-              <w:t xml:space="preserve">+9%</w:t>
+              <w:t xml:space="preserve">+8%</w:t>
             </w:r>
           </w:p>
         </w:tc>
@@ -10940,7 +10940,7 @@
                 <w:sz w:val="18"/>
                 <w:szCs w:val="18"/>
               </w:rPr>
-              <w:t xml:space="preserve">19</w:t>
+              <w:t xml:space="preserve">20</w:t>
             </w:r>
           </w:p>
         </w:tc>
@@ -11076,7 +11076,7 @@
                 <w:sz w:val="18"/>
                 <w:szCs w:val="18"/>
               </w:rPr>
-              <w:t xml:space="preserve">+9%</w:t>
+              <w:t xml:space="preserve">+12%</w:t>
             </w:r>
           </w:p>
         </w:tc>
@@ -11130,7 +11130,7 @@
                 <w:sz w:val="18"/>
                 <w:szCs w:val="18"/>
               </w:rPr>
-              <w:t xml:space="preserve">27</w:t>
+              <w:t xml:space="preserve">24</w:t>
             </w:r>
           </w:p>
         </w:tc>
@@ -11263,7 +11263,7 @@
                 <w:sz w:val="18"/>
                 <w:szCs w:val="18"/>
               </w:rPr>
-              <w:t xml:space="preserve">+31%</w:t>
+              <w:t xml:space="preserve">+35%</w:t>
             </w:r>
           </w:p>
         </w:tc>
@@ -11315,7 +11315,7 @@
                 <w:sz w:val="18"/>
                 <w:szCs w:val="18"/>
               </w:rPr>
-              <w:t xml:space="preserve">49</w:t>
+              <w:t xml:space="preserve">54</w:t>
             </w:r>
           </w:p>
         </w:tc>
@@ -11365,7 +11365,7 @@
         <w:pStyle w:val="Heading3"/>
       </w:pPr>
       <w:r>
-        <w:t xml:space="preserve">WELCORP: Welspun Corp (rank 1, weight 13.85%)</w:t>
+        <w:t xml:space="preserve">WELCORP: Welspun Corp (rank 1, weight 13.77%)</w:t>
       </w:r>
     </w:p>
     <w:p>
@@ -11582,7 +11582,7 @@
                 <w:sz w:val="18"/>
                 <w:szCs w:val="18"/>
               </w:rPr>
-              <w:t xml:space="preserve">₹2,832</w:t>
+              <w:t xml:space="preserve">₹2,842</w:t>
             </w:r>
           </w:p>
         </w:tc>
@@ -11634,7 +11634,7 @@
                 <w:sz w:val="18"/>
                 <w:szCs w:val="18"/>
               </w:rPr>
-              <w:t xml:space="preserve">474 / ₹13,42,558</w:t>
+              <w:t xml:space="preserve">488 / ₹13,86,896</w:t>
             </w:r>
           </w:p>
         </w:tc>
@@ -11690,7 +11690,7 @@
                 <w:sz w:val="18"/>
                 <w:szCs w:val="18"/>
               </w:rPr>
-              <w:t xml:space="preserve">₹2,178 (23.1% below, 5x ATR)</w:t>
+              <w:t xml:space="preserve">₹2,148 (24.4% below, 5x ATR)</w:t>
             </w:r>
           </w:p>
         </w:tc>
@@ -11744,7 +11744,7 @@
                 <w:sz w:val="18"/>
                 <w:szCs w:val="18"/>
               </w:rPr>
-              <w:t xml:space="preserve">₹2,240 / ₹2,836</w:t>
+              <w:t xml:space="preserve">₹2,240 / ₹2,900</w:t>
             </w:r>
           </w:p>
         </w:tc>
@@ -11798,7 +11798,7 @@
                 <w:sz w:val="18"/>
                 <w:szCs w:val="18"/>
               </w:rPr>
-              <w:t xml:space="preserve">42.5 / 13.9 / 66.3</w:t>
+              <w:t xml:space="preserve">39.5 / 11.2 / 64.4</w:t>
             </w:r>
           </w:p>
         </w:tc>
@@ -11850,7 +11850,7 @@
                 <w:sz w:val="18"/>
                 <w:szCs w:val="18"/>
               </w:rPr>
-              <w:t xml:space="preserve">42.6% / 1.25</w:t>
+              <w:t xml:space="preserve">42.8% / 1.25</w:t>
             </w:r>
           </w:p>
         </w:tc>
@@ -11906,7 +11906,7 @@
                 <w:sz w:val="18"/>
                 <w:szCs w:val="18"/>
               </w:rPr>
-              <w:t xml:space="preserve">13.8% a year (3.3% over 3 months)</w:t>
+              <w:t xml:space="preserve">13.9% a year (3.3% over 3 months)</w:t>
             </w:r>
           </w:p>
         </w:tc>
@@ -12014,7 +12014,7 @@
                 <w:sz w:val="18"/>
                 <w:szCs w:val="18"/>
               </w:rPr>
-              <w:t xml:space="preserve">0.92</w:t>
+              <w:t xml:space="preserve">0.88</w:t>
             </w:r>
           </w:p>
         </w:tc>
@@ -12112,7 +12112,7 @@
         <w:pStyle w:val="Heading3"/>
       </w:pPr>
       <w:r>
-        <w:t xml:space="preserve">RPEL: Raghav Productivity Enhancers (rank 2, weight 11.21%)</w:t>
+        <w:t xml:space="preserve">RPEL: Raghav Productivity Enhancers (rank 2, weight 11.35%)</w:t>
       </w:r>
     </w:p>
     <w:p>
@@ -12329,7 +12329,7 @@
                 <w:sz w:val="18"/>
                 <w:szCs w:val="18"/>
               </w:rPr>
-              <w:t xml:space="preserve">₹1,700</w:t>
+              <w:t xml:space="preserve">₹1,718</w:t>
             </w:r>
           </w:p>
         </w:tc>
@@ -12381,7 +12381,7 @@
                 <w:sz w:val="18"/>
                 <w:szCs w:val="18"/>
               </w:rPr>
-              <w:t xml:space="preserve">639 / ₹10,85,981</w:t>
+              <w:t xml:space="preserve">642 / ₹11,03,020</w:t>
             </w:r>
           </w:p>
         </w:tc>
@@ -12437,7 +12437,7 @@
                 <w:sz w:val="18"/>
                 <w:szCs w:val="18"/>
               </w:rPr>
-              <w:t xml:space="preserve">₹1,213 (28.6% below, 5x ATR)</w:t>
+              <w:t xml:space="preserve">₹1,255 (26.9% below, 5x ATR)</w:t>
             </w:r>
           </w:p>
         </w:tc>
@@ -12491,7 +12491,7 @@
                 <w:sz w:val="18"/>
                 <w:szCs w:val="18"/>
               </w:rPr>
-              <w:t xml:space="preserve">₹1,507 / ₹1,700</w:t>
+              <w:t xml:space="preserve">₹1,507 / ₹1,749</w:t>
             </w:r>
           </w:p>
         </w:tc>
@@ -12545,7 +12545,7 @@
                 <w:sz w:val="18"/>
                 <w:szCs w:val="18"/>
               </w:rPr>
-              <w:t xml:space="preserve">29.5 / 6.5 / 53.6</w:t>
+              <w:t xml:space="preserve">27.2 / 5.1 / 54.9</w:t>
             </w:r>
           </w:p>
         </w:tc>
@@ -12597,7 +12597,7 @@
                 <w:sz w:val="18"/>
                 <w:szCs w:val="18"/>
               </w:rPr>
-              <w:t xml:space="preserve">53.0% / 1.68</w:t>
+              <w:t xml:space="preserve">52.7% / 1.66</w:t>
             </w:r>
           </w:p>
         </w:tc>
@@ -12653,7 +12653,7 @@
                 <w:sz w:val="18"/>
                 <w:szCs w:val="18"/>
               </w:rPr>
-              <w:t xml:space="preserve">16.9% a year (4.0% over 3 months)</w:t>
+              <w:t xml:space="preserve">16.8% a year (4.0% over 3 months)</w:t>
             </w:r>
           </w:p>
         </w:tc>
@@ -12761,7 +12761,7 @@
                 <w:sz w:val="18"/>
                 <w:szCs w:val="18"/>
               </w:rPr>
-              <w:t xml:space="preserve">0.93</w:t>
+              <w:t xml:space="preserve">0.98</w:t>
             </w:r>
           </w:p>
         </w:tc>
@@ -12859,7 +12859,7 @@
         <w:pStyle w:val="Heading3"/>
       </w:pPr>
       <w:r>
-        <w:t xml:space="preserve">SBCL: Shivalik Bimetal Controls (rank 3, weight 12.70%)</w:t>
+        <w:t xml:space="preserve">SBCL: Shivalik Bimetal Controls (rank 3, weight 12.73%)</w:t>
       </w:r>
     </w:p>
     <w:p>
@@ -13076,7 +13076,7 @@
                 <w:sz w:val="18"/>
                 <w:szCs w:val="18"/>
               </w:rPr>
-              <w:t xml:space="preserve">₹1,155</w:t>
+              <w:t xml:space="preserve">₹1,111</w:t>
             </w:r>
           </w:p>
         </w:tc>
@@ -13128,7 +13128,7 @@
                 <w:sz w:val="18"/>
                 <w:szCs w:val="18"/>
               </w:rPr>
-              <w:t xml:space="preserve">1067 / ₹12,31,852</w:t>
+              <w:t xml:space="preserve">1105 / ₹12,27,987</w:t>
             </w:r>
           </w:p>
         </w:tc>
@@ -13184,7 +13184,7 @@
                 <w:sz w:val="18"/>
                 <w:szCs w:val="18"/>
               </w:rPr>
-              <w:t xml:space="preserve">₹858 (25.7% below, 5x ATR)</w:t>
+              <w:t xml:space="preserve">₹821 (26.1% below, 5x ATR)</w:t>
             </w:r>
           </w:p>
         </w:tc>
@@ -13292,7 +13292,7 @@
                 <w:sz w:val="18"/>
                 <w:szCs w:val="18"/>
               </w:rPr>
-              <w:t xml:space="preserve">34.3 / 10.9 / 62.2</w:t>
+              <w:t xml:space="preserve">31.4 / 5.1 / 55.3</w:t>
             </w:r>
           </w:p>
         </w:tc>
@@ -13344,7 +13344,7 @@
                 <w:sz w:val="18"/>
                 <w:szCs w:val="18"/>
               </w:rPr>
-              <w:t xml:space="preserve">55.8% / 1.43</w:t>
+              <w:t xml:space="preserve">55.8% / 1.44</w:t>
             </w:r>
           </w:p>
         </w:tc>
@@ -13400,7 +13400,7 @@
                 <w:sz w:val="18"/>
                 <w:szCs w:val="18"/>
               </w:rPr>
-              <w:t xml:space="preserve">15.1% a year (3.6% over 3 months)</w:t>
+              <w:t xml:space="preserve">15.3% a year (3.6% over 3 months)</w:t>
             </w:r>
           </w:p>
         </w:tc>
@@ -13454,7 +13454,7 @@
                 <w:sz w:val="18"/>
                 <w:szCs w:val="18"/>
               </w:rPr>
-              <w:t xml:space="preserve">87%</w:t>
+              <w:t xml:space="preserve">86%</w:t>
             </w:r>
           </w:p>
         </w:tc>
@@ -13508,7 +13508,7 @@
                 <w:sz w:val="18"/>
                 <w:szCs w:val="18"/>
               </w:rPr>
-              <w:t xml:space="preserve">1.09</w:t>
+              <w:t xml:space="preserve">1.07</w:t>
             </w:r>
           </w:p>
         </w:tc>
@@ -13823,7 +13823,7 @@
                 <w:sz w:val="18"/>
                 <w:szCs w:val="18"/>
               </w:rPr>
-              <w:t xml:space="preserve">₹526</w:t>
+              <w:t xml:space="preserve">₹540</w:t>
             </w:r>
           </w:p>
         </w:tc>
@@ -13875,7 +13875,7 @@
                 <w:sz w:val="18"/>
                 <w:szCs w:val="18"/>
               </w:rPr>
-              <w:t xml:space="preserve">1699 / ₹8,93,164</w:t>
+              <w:t xml:space="preserve">1743 / ₹9,40,523</w:t>
             </w:r>
           </w:p>
         </w:tc>
@@ -13931,7 +13931,7 @@
                 <w:sz w:val="18"/>
                 <w:szCs w:val="18"/>
               </w:rPr>
-              <w:t xml:space="preserve">₹391 (25.7% below, 5x ATR)</w:t>
+              <w:t xml:space="preserve">₹405 (25.0% below, 5x ATR)</w:t>
             </w:r>
           </w:p>
         </w:tc>
@@ -14039,7 +14039,7 @@
                 <w:sz w:val="18"/>
                 <w:szCs w:val="18"/>
               </w:rPr>
-              <w:t xml:space="preserve">27.0 / 5.2 / 53.6</w:t>
+              <w:t xml:space="preserve">24.8 / 7.0 / 56.9</w:t>
             </w:r>
           </w:p>
         </w:tc>
@@ -14091,7 +14091,7 @@
                 <w:sz w:val="18"/>
                 <w:szCs w:val="18"/>
               </w:rPr>
-              <w:t xml:space="preserve">60.3% / 1.91</w:t>
+              <w:t xml:space="preserve">60.3% / 1.89</w:t>
             </w:r>
           </w:p>
         </w:tc>
@@ -14255,7 +14255,7 @@
                 <w:sz w:val="18"/>
                 <w:szCs w:val="18"/>
               </w:rPr>
-              <w:t xml:space="preserve">1.17</w:t>
+              <w:t xml:space="preserve">1.21</w:t>
             </w:r>
           </w:p>
         </w:tc>
@@ -14353,7 +14353,7 @@
         <w:pStyle w:val="Heading3"/>
       </w:pPr>
       <w:r>
-        <w:t xml:space="preserve">TDPOWERSYS: TD Power Systems (rank 5, weight 11.33%)</w:t>
+        <w:t xml:space="preserve">TDPOWERSYS: TD Power Systems (rank 5, weight 11.19%)</w:t>
       </w:r>
     </w:p>
     <w:p>
@@ -14570,7 +14570,7 @@
                 <w:sz w:val="18"/>
                 <w:szCs w:val="18"/>
               </w:rPr>
-              <w:t xml:space="preserve">₹752</w:t>
+              <w:t xml:space="preserve">₹777</w:t>
             </w:r>
           </w:p>
         </w:tc>
@@ -14622,7 +14622,7 @@
                 <w:sz w:val="18"/>
                 <w:szCs w:val="18"/>
               </w:rPr>
-              <w:t xml:space="preserve">1462 / ₹10,98,766</w:t>
+              <w:t xml:space="preserve">1516 / ₹11,78,463</w:t>
             </w:r>
           </w:p>
         </w:tc>
@@ -14678,7 +14678,7 @@
                 <w:sz w:val="18"/>
                 <w:szCs w:val="18"/>
               </w:rPr>
-              <w:t xml:space="preserve">₹568 (24.4% below, 5x ATR)</w:t>
+              <w:t xml:space="preserve">₹575 (26.0% below, 5x ATR)</w:t>
             </w:r>
           </w:p>
         </w:tc>
@@ -14732,7 +14732,7 @@
                 <w:sz w:val="18"/>
                 <w:szCs w:val="18"/>
               </w:rPr>
-              <w:t xml:space="preserve">₹717 / ₹765</w:t>
+              <w:t xml:space="preserve">₹717 / ₹785</w:t>
             </w:r>
           </w:p>
         </w:tc>
@@ -14786,7 +14786,7 @@
                 <w:sz w:val="18"/>
                 <w:szCs w:val="18"/>
               </w:rPr>
-              <w:t xml:space="preserve">28.5 / 10.6 / 53.0</w:t>
+              <w:t xml:space="preserve">27.5 / 14.8 / 56.3</w:t>
             </w:r>
           </w:p>
         </w:tc>
@@ -14838,7 +14838,7 @@
                 <w:sz w:val="18"/>
                 <w:szCs w:val="18"/>
               </w:rPr>
-              <w:t xml:space="preserve">54.8% / 1.19</w:t>
+              <w:t xml:space="preserve">55.3% / 1.19</w:t>
             </w:r>
           </w:p>
         </w:tc>
@@ -14894,7 +14894,7 @@
                 <w:sz w:val="18"/>
                 <w:szCs w:val="18"/>
               </w:rPr>
-              <w:t xml:space="preserve">13.4% a year (3.2% over 3 months)</w:t>
+              <w:t xml:space="preserve">13.5% a year (3.2% over 3 months)</w:t>
             </w:r>
           </w:p>
         </w:tc>
@@ -15002,7 +15002,7 @@
                 <w:sz w:val="18"/>
                 <w:szCs w:val="18"/>
               </w:rPr>
-              <w:t xml:space="preserve">1.12</w:t>
+              <w:t xml:space="preserve">1.06</w:t>
             </w:r>
           </w:p>
         </w:tc>
@@ -15100,7 +15100,7 @@
         <w:pStyle w:val="Heading3"/>
       </w:pPr>
       <w:r>
-        <w:t xml:space="preserve">RAMRAT: Ram Ratna Wires (rank 6, weight 14.32%)</w:t>
+        <w:t xml:space="preserve">RAMRAT: Ram Ratna Wires (rank 6, weight 14.39%)</w:t>
       </w:r>
     </w:p>
     <w:p>
@@ -15317,7 +15317,7 @@
                 <w:sz w:val="18"/>
                 <w:szCs w:val="18"/>
               </w:rPr>
-              <w:t xml:space="preserve">₹570</w:t>
+              <w:t xml:space="preserve">₹584</w:t>
             </w:r>
           </w:p>
         </w:tc>
@@ -15369,7 +15369,7 @@
                 <w:sz w:val="18"/>
                 <w:szCs w:val="18"/>
               </w:rPr>
-              <w:t xml:space="preserve">2436 / ₹13,88,520</w:t>
+              <w:t xml:space="preserve">2456 / ₹14,33,813</w:t>
             </w:r>
           </w:p>
         </w:tc>
@@ -15425,7 +15425,7 @@
                 <w:sz w:val="18"/>
                 <w:szCs w:val="18"/>
               </w:rPr>
-              <w:t xml:space="preserve">₹443 (22.3% below, 5x ATR)</w:t>
+              <w:t xml:space="preserve">₹457 (21.7% below, 5x ATR)</w:t>
             </w:r>
           </w:p>
         </w:tc>
@@ -15479,7 +15479,7 @@
                 <w:sz w:val="18"/>
                 <w:szCs w:val="18"/>
               </w:rPr>
-              <w:t xml:space="preserve">₹500 / ₹581</w:t>
+              <w:t xml:space="preserve">₹500 / ₹590</w:t>
             </w:r>
           </w:p>
         </w:tc>
@@ -15533,7 +15533,7 @@
                 <w:sz w:val="18"/>
                 <w:szCs w:val="18"/>
               </w:rPr>
-              <w:t xml:space="preserve">25.2 / 13.1 / 61.4</w:t>
+              <w:t xml:space="preserve">26.3 / 15.1 / 64.3</w:t>
             </w:r>
           </w:p>
         </w:tc>
@@ -15585,7 +15585,7 @@
                 <w:sz w:val="18"/>
                 <w:szCs w:val="18"/>
               </w:rPr>
-              <w:t xml:space="preserve">43.0% / 1.30</w:t>
+              <w:t xml:space="preserve">42.9% / 1.28</w:t>
             </w:r>
           </w:p>
         </w:tc>
@@ -15641,7 +15641,7 @@
                 <w:sz w:val="18"/>
                 <w:szCs w:val="18"/>
               </w:rPr>
-              <w:t xml:space="preserve">14.2% a year (3.4% over 3 months)</w:t>
+              <w:t xml:space="preserve">14.1% a year (3.4% over 3 months)</w:t>
             </w:r>
           </w:p>
         </w:tc>
@@ -15749,7 +15749,7 @@
                 <w:sz w:val="18"/>
                 <w:szCs w:val="18"/>
               </w:rPr>
-              <w:t xml:space="preserve">0.96</w:t>
+              <w:t xml:space="preserve">0.99</w:t>
             </w:r>
           </w:p>
         </w:tc>
@@ -15847,7 +15847,7 @@
         <w:pStyle w:val="Heading3"/>
       </w:pPr>
       <w:r>
-        <w:t xml:space="preserve">APARINDS: Apar Industries (rank 7, weight 12.37%)</w:t>
+        <w:t xml:space="preserve">APARINDS: Apar Industries (rank 7, weight 12.36%)</w:t>
       </w:r>
     </w:p>
     <w:p>
@@ -16064,7 +16064,7 @@
                 <w:sz w:val="18"/>
                 <w:szCs w:val="18"/>
               </w:rPr>
-              <w:t xml:space="preserve">₹17,776</w:t>
+              <w:t xml:space="preserve">₹17,803</w:t>
             </w:r>
           </w:p>
         </w:tc>
@@ -16116,7 +16116,7 @@
                 <w:sz w:val="18"/>
                 <w:szCs w:val="18"/>
               </w:rPr>
-              <w:t xml:space="preserve">67 / ₹11,90,992</w:t>
+              <w:t xml:space="preserve">69 / ₹12,28,407</w:t>
             </w:r>
           </w:p>
         </w:tc>
@@ -16172,7 +16172,7 @@
                 <w:sz w:val="18"/>
                 <w:szCs w:val="18"/>
               </w:rPr>
-              <w:t xml:space="preserve">₹13,784 (22.5% below, 5x ATR)</w:t>
+              <w:t xml:space="preserve">₹13,827 (22.3% below, 5x ATR)</w:t>
             </w:r>
           </w:p>
         </w:tc>
@@ -16280,7 +16280,7 @@
                 <w:sz w:val="18"/>
                 <w:szCs w:val="18"/>
               </w:rPr>
-              <w:t xml:space="preserve">28.7 / 5.7 / 53.7</w:t>
+              <w:t xml:space="preserve">25.3 / 3.0 / 53.6</w:t>
             </w:r>
           </w:p>
         </w:tc>
@@ -16388,7 +16388,7 @@
                 <w:sz w:val="18"/>
                 <w:szCs w:val="18"/>
               </w:rPr>
-              <w:t xml:space="preserve">14.6% a year (3.5% over 3 months)</w:t>
+              <w:t xml:space="preserve">14.7% a year (3.5% over 3 months)</w:t>
             </w:r>
           </w:p>
         </w:tc>
@@ -16496,7 +16496,7 @@
                 <w:sz w:val="18"/>
                 <w:szCs w:val="18"/>
               </w:rPr>
-              <w:t xml:space="preserve">1.04</w:t>
+              <w:t xml:space="preserve">1.05</w:t>
             </w:r>
           </w:p>
         </w:tc>
@@ -16811,7 +16811,7 @@
                 <w:sz w:val="18"/>
                 <w:szCs w:val="18"/>
               </w:rPr>
-              <w:t xml:space="preserve">₹443</w:t>
+              <w:t xml:space="preserve">₹438</w:t>
             </w:r>
           </w:p>
         </w:tc>
@@ -16863,7 +16863,7 @@
                 <w:sz w:val="18"/>
                 <w:szCs w:val="18"/>
               </w:rPr>
-              <w:t xml:space="preserve">3285 / ₹14,54,927</w:t>
+              <w:t xml:space="preserve">3322 / ₹14,54,870</w:t>
             </w:r>
           </w:p>
         </w:tc>
@@ -16919,7 +16919,7 @@
                 <w:sz w:val="18"/>
                 <w:szCs w:val="18"/>
               </w:rPr>
-              <w:t xml:space="preserve">₹345 (22.2% below, 5x ATR)</w:t>
+              <w:t xml:space="preserve">₹342 (21.8% below, 5x ATR)</w:t>
             </w:r>
           </w:p>
         </w:tc>
@@ -16973,7 +16973,7 @@
                 <w:sz w:val="18"/>
                 <w:szCs w:val="18"/>
               </w:rPr>
-              <w:t xml:space="preserve">₹383 / ₹464</w:t>
+              <w:t xml:space="preserve">₹390 / ₹441</w:t>
             </w:r>
           </w:p>
         </w:tc>
@@ -17027,7 +17027,7 @@
                 <w:sz w:val="18"/>
                 <w:szCs w:val="18"/>
               </w:rPr>
-              <w:t xml:space="preserve">33.1 / 15.4 / 63.0</w:t>
+              <w:t xml:space="preserve">33.3 / 12.5 / 60.1</w:t>
             </w:r>
           </w:p>
         </w:tc>
@@ -17079,7 +17079,7 @@
                 <w:sz w:val="18"/>
                 <w:szCs w:val="18"/>
               </w:rPr>
-              <w:t xml:space="preserve">37.9% / 0.40</w:t>
+              <w:t xml:space="preserve">37.8% / 0.41</w:t>
             </w:r>
           </w:p>
         </w:tc>
@@ -17135,7 +17135,7 @@
                 <w:sz w:val="18"/>
                 <w:szCs w:val="18"/>
               </w:rPr>
-              <w:t xml:space="preserve">7.8% a year (1.9% over 3 months)</w:t>
+              <w:t xml:space="preserve">7.9% a year (1.9% over 3 months)</w:t>
             </w:r>
           </w:p>
         </w:tc>
@@ -17243,7 +17243,7 @@
                 <w:sz w:val="18"/>
                 <w:szCs w:val="18"/>
               </w:rPr>
-              <w:t xml:space="preserve">0.85</w:t>
+              <w:t xml:space="preserve">0.86</w:t>
             </w:r>
           </w:p>
         </w:tc>
@@ -20682,7 +20682,7 @@
         <w:t xml:space="preserve">only ever rise</w:t>
       </w:r>
       <w:r>
-        <w:t xml:space="preserve"> (trailed at every refresh). Current stops are 22.2-28.6% below price. </w:t>
+        <w:t xml:space="preserve"> (trailed at every refresh). Current stops are 21.7-26.9% below price. </w:t>
       </w:r>
       <w:r>
         <w:rPr>
@@ -23537,7 +23537,7 @@
         <w:t xml:space="preserve">A. </w:t>
       </w:r>
       <w:r>
-        <w:t xml:space="preserve">5 × ATR(14) below the price (3 × until our stop backtest), moved just under a nearby support; trailed upward only. Currently 22.2-28.6% below price.</w:t>
+        <w:t xml:space="preserve">5 × ATR(14) below the price (3 × until our stop backtest), moved just under a nearby support; trailed upward only. Currently 21.7-26.9% below price.</w:t>
       </w:r>
     </w:p>
     <w:p>
@@ -23955,7 +23955,7 @@
         <w:t xml:space="preserve">A. </w:t>
       </w:r>
       <w:r>
-        <w:t xml:space="preserve">Yes: AR(1) and Ljung-Box on each stock's DAILY returns; no stock is predictable at 5%, so there is nothing to exploit day to day, which is why we do not trade daily. That does not contradict momentum: momentum is persistence over 3-12 MONTHS (slow reaction to news and earnings), which a 1-day autocorrelation test cannot see and does not reject.</w:t>
+        <w:t xml:space="preserve">Yes: AR(1) and Ljung-Box on each stock's DAILY returns; at most one of the eight shows significant autocorrelation at 5% on a given day (currently SBCL, at 2- and 4-day lags, not yesterday-to-today), which is what chance alone produces across eight tests, and the portfolio as a whole is not predictable. There is nothing to exploit day to day, which is why we do not trade daily. That does not contradict momentum: momentum is persistence over 3-12 MONTHS (slow reaction to news and earnings), which a 1-day autocorrelation test cannot see and does not reject.</w:t>
       </w:r>
     </w:p>
     <w:p>

</xml_diff>

<commit_message>
Risk-reward against the Nifty 500, and each stop's cost to the portfolio
From a brief discussion with the professor (stops tied to weights; risk-
reward vs the benchmark):
- risk_reward.csv: loss at stop as % of the Rs 1 crore (weight x distance
  to stop): 2.4-3.4% per stock, even because ERC weights and ATR stops
  both scale with volatility. The diversified row no longer divides a
  diversified move by the all-stops loss (mixed bases).
- performance: Sortino, max drawdown, up/down-capture, tracking error and
  information ratio for portfolio and Nifty 500, same method for both.
- Dashboard captions and the brief (two Q&As) updated.

Co-Authored-By: Claude Opus 5.5 <noreply@anthropic.com>
Claude-Session: https://claude.ai/code/session_018SrKZ3YP1T4SHJR1stpujJ
</commit_message>
<xml_diff>
--- a/docs/Defence_Brief_Capex_Portfolio.docx
+++ b/docs/Defence_Brief_Capex_Portfolio.docx
@@ -23424,6 +23424,82 @@
       </w:r>
       <w:r>
         <w:t xml:space="preserve">Then the stop cannot execute that day, true. Our stop is on the close, so we sell at the next session with buyers. The damage is bounded by sizing, not by the stop: a 20% fall on our largest position (15%) costs about 3% of the portfolio, and a narrower price band only spreads the fall over more days (we sell at the first session with buyers). The results calendar warns 7 days ahead so this is never a surprise.</w:t>
+      </w:r>
+    </w:p>
+    <w:p>
+      <w:pPr>
+        <w:keepNext/>
+        <w:spacing w:after="60" w:before="120"/>
+      </w:pPr>
+      <w:r>
+        <w:rPr>
+          <w:b/>
+          <w:bCs/>
+          <w:color w:val="1F3864"/>
+        </w:rPr>
+        <w:t xml:space="preserve">Q. </w:t>
+      </w:r>
+      <w:r>
+        <w:rPr>
+          <w:b/>
+          <w:bCs/>
+        </w:rPr>
+        <w:t xml:space="preserve">Is the stop-loss linked to how much you put in each stock?</w:t>
+      </w:r>
+    </w:p>
+    <w:p>
+      <w:pPr>
+        <w:spacing w:after="60" w:line="264"/>
+        <w:ind w:left="360"/>
+      </w:pPr>
+      <w:r>
+        <w:rPr>
+          <w:b/>
+          <w:bCs/>
+          <w:color w:val="2E7D32"/>
+        </w:rPr>
+        <w:t xml:space="preserve">A. </w:t>
+      </w:r>
+      <w:r>
+        <w:t xml:space="preserve">Yes, by design. What a stop can cost the portfolio is weight × distance to the stop. Equal-risk weights give volatile stocks less money, and ATR stops give them more room, so the two offset: each stop can cost between 2.4% (AEROFLEX) and 3.4% (WELCORP) of the ₹1 crore. No single stop can hurt much more than any other; all eight at once would cost about 24%, a market crash on top of that is what the puts cover.</w:t>
+      </w:r>
+    </w:p>
+    <w:p>
+      <w:pPr>
+        <w:keepNext/>
+        <w:spacing w:after="60" w:before="120"/>
+      </w:pPr>
+      <w:r>
+        <w:rPr>
+          <w:b/>
+          <w:bCs/>
+          <w:color w:val="1F3864"/>
+        </w:rPr>
+        <w:t xml:space="preserve">Q. </w:t>
+      </w:r>
+      <w:r>
+        <w:rPr>
+          <w:b/>
+          <w:bCs/>
+        </w:rPr>
+        <w:t xml:space="preserve">How does your risk-reward compare with the Nifty 500?</w:t>
+      </w:r>
+    </w:p>
+    <w:p>
+      <w:pPr>
+        <w:spacing w:after="60" w:line="264"/>
+        <w:ind w:left="360"/>
+      </w:pPr>
+      <w:r>
+        <w:rPr>
+          <w:b/>
+          <w:bCs/>
+          <w:color w:val="2E7D32"/>
+        </w:rPr>
+        <w:t xml:space="preserve">A. </w:t>
+      </w:r>
+      <w:r>
+        <w:t xml:space="preserve">Measured the same way for both over the past year (backtest of today's portfolio, hindsight): Sharpe 5.6 vs −0.5, Sortino 9.6 vs −0.7, up-capture 1.80 (we rose 1.8× as much on the Nifty's up days) and down-capture 0.57 (fell about half as much on its down days), information ratio 4.8. The cost: more volatility (27% vs 14%), 21% tracking error and a deeper worst drawdown (−19% vs −15%). The live figures replace these after 20 sessions.</w:t>
       </w:r>
     </w:p>
     <w:p>

</xml_diff>